<commit_message>
Update dokumentace + odstraneni spatneho souboru
</commit_message>
<xml_diff>
--- a/Dokumentace_Strachon.docx
+++ b/Dokumentace_Strachon.docx
@@ -582,7 +582,27 @@
         <w:rPr>
           <w:shd w:val="clear" w:color="auto" w:fill="FFFFFF"/>
         </w:rPr>
-        <w:t>.</w:t>
+        <w:t xml:space="preserve">, </w:t>
+      </w:r>
+      <w:r>
+        <w:rPr>
+          <w:shd w:val="clear" w:color="auto" w:fill="FFFFFF"/>
+        </w:rPr>
+        <w:t xml:space="preserve">a Tomáši Martinu Holubovi za pomoc při návrhu desky plošných spojů v programu </w:t>
+      </w:r>
+      <w:proofErr w:type="spellStart"/>
+      <w:r>
+        <w:rPr>
+          <w:shd w:val="clear" w:color="auto" w:fill="FFFFFF"/>
+        </w:rPr>
+        <w:t>KiCAD</w:t>
+      </w:r>
+      <w:proofErr w:type="spellEnd"/>
+      <w:r>
+        <w:rPr>
+          <w:shd w:val="clear" w:color="auto" w:fill="FFFFFF"/>
+        </w:rPr>
+        <w:t xml:space="preserve"> a za technické konzultace během vývoje projektu.</w:t>
       </w:r>
     </w:p>
     <w:p/>
@@ -642,8 +662,27 @@
     </w:p>
     <w:p>
       <w:r>
-        <w:t xml:space="preserve">ESP32, UWB, akcelerometr, gyroskop, magnetometr, napájecí článek, laser game, </w:t>
-      </w:r>
+        <w:t>ESP32, UWB, akcelerometr, gyroskop, magnetometr, napájecí článek, laser game,</w:t>
+      </w:r>
+      <w:r>
+        <w:t xml:space="preserve"> </w:t>
+      </w:r>
+      <w:proofErr w:type="spellStart"/>
+      <w:r>
+        <w:t>KiCAD</w:t>
+      </w:r>
+      <w:proofErr w:type="spellEnd"/>
+      <w:r>
+        <w:t>,</w:t>
+      </w:r>
+      <w:r>
+        <w:t xml:space="preserve"> </w:t>
+      </w:r>
+      <w:proofErr w:type="spellStart"/>
+      <w:r>
+        <w:t>playground</w:t>
+      </w:r>
+      <w:proofErr w:type="spellEnd"/>
       <w:r>
         <w:br w:type="page"/>
       </w:r>
@@ -712,7 +751,7 @@
           <w:r>
             <w:fldChar w:fldCharType="separate"/>
           </w:r>
-          <w:hyperlink w:anchor="_Toc231405560" w:history="1">
+          <w:hyperlink w:anchor="_Toc231411318" w:history="1">
             <w:r>
               <w:rPr>
                 <w:rStyle w:val="Hypertextovodkaz"/>
@@ -739,7 +778,7 @@
                 <w:noProof/>
                 <w:webHidden/>
               </w:rPr>
-              <w:instrText xml:space="preserve"> PAGEREF _Toc231405560 \h </w:instrText>
+              <w:instrText xml:space="preserve"> PAGEREF _Toc231411318 \h </w:instrText>
             </w:r>
             <w:r>
               <w:rPr>
@@ -786,7 +825,7 @@
               <w14:ligatures w14:val="standardContextual"/>
             </w:rPr>
           </w:pPr>
-          <w:hyperlink w:anchor="_Toc231405561" w:history="1">
+          <w:hyperlink w:anchor="_Toc231411319" w:history="1">
             <w:r>
               <w:rPr>
                 <w:rStyle w:val="Hypertextovodkaz"/>
@@ -831,7 +870,7 @@
                 <w:noProof/>
                 <w:webHidden/>
               </w:rPr>
-              <w:instrText xml:space="preserve"> PAGEREF _Toc231405561 \h </w:instrText>
+              <w:instrText xml:space="preserve"> PAGEREF _Toc231411319 \h </w:instrText>
             </w:r>
             <w:r>
               <w:rPr>
@@ -878,7 +917,7 @@
               <w14:ligatures w14:val="standardContextual"/>
             </w:rPr>
           </w:pPr>
-          <w:hyperlink w:anchor="_Toc231405562" w:history="1">
+          <w:hyperlink w:anchor="_Toc231411320" w:history="1">
             <w:r>
               <w:rPr>
                 <w:rStyle w:val="Hypertextovodkaz"/>
@@ -923,7 +962,7 @@
                 <w:noProof/>
                 <w:webHidden/>
               </w:rPr>
-              <w:instrText xml:space="preserve"> PAGEREF _Toc231405562 \h </w:instrText>
+              <w:instrText xml:space="preserve"> PAGEREF _Toc231411320 \h </w:instrText>
             </w:r>
             <w:r>
               <w:rPr>
@@ -970,7 +1009,7 @@
               <w14:ligatures w14:val="standardContextual"/>
             </w:rPr>
           </w:pPr>
-          <w:hyperlink w:anchor="_Toc231405563" w:history="1">
+          <w:hyperlink w:anchor="_Toc231411321" w:history="1">
             <w:r>
               <w:rPr>
                 <w:rStyle w:val="Hypertextovodkaz"/>
@@ -1015,7 +1054,7 @@
                 <w:noProof/>
                 <w:webHidden/>
               </w:rPr>
-              <w:instrText xml:space="preserve"> PAGEREF _Toc231405563 \h </w:instrText>
+              <w:instrText xml:space="preserve"> PAGEREF _Toc231411321 \h </w:instrText>
             </w:r>
             <w:r>
               <w:rPr>
@@ -1062,7 +1101,7 @@
               <w14:ligatures w14:val="standardContextual"/>
             </w:rPr>
           </w:pPr>
-          <w:hyperlink w:anchor="_Toc231405564" w:history="1">
+          <w:hyperlink w:anchor="_Toc231411322" w:history="1">
             <w:r>
               <w:rPr>
                 <w:rStyle w:val="Hypertextovodkaz"/>
@@ -1107,7 +1146,7 @@
                 <w:noProof/>
                 <w:webHidden/>
               </w:rPr>
-              <w:instrText xml:space="preserve"> PAGEREF _Toc231405564 \h </w:instrText>
+              <w:instrText xml:space="preserve"> PAGEREF _Toc231411322 \h </w:instrText>
             </w:r>
             <w:r>
               <w:rPr>
@@ -1154,7 +1193,7 @@
               <w14:ligatures w14:val="standardContextual"/>
             </w:rPr>
           </w:pPr>
-          <w:hyperlink w:anchor="_Toc231405565" w:history="1">
+          <w:hyperlink w:anchor="_Toc231411323" w:history="1">
             <w:r>
               <w:rPr>
                 <w:rStyle w:val="Hypertextovodkaz"/>
@@ -1199,7 +1238,7 @@
                 <w:noProof/>
                 <w:webHidden/>
               </w:rPr>
-              <w:instrText xml:space="preserve"> PAGEREF _Toc231405565 \h </w:instrText>
+              <w:instrText xml:space="preserve"> PAGEREF _Toc231411323 \h </w:instrText>
             </w:r>
             <w:r>
               <w:rPr>
@@ -1246,7 +1285,7 @@
               <w14:ligatures w14:val="standardContextual"/>
             </w:rPr>
           </w:pPr>
-          <w:hyperlink w:anchor="_Toc231405566" w:history="1">
+          <w:hyperlink w:anchor="_Toc231411324" w:history="1">
             <w:r>
               <w:rPr>
                 <w:rStyle w:val="Hypertextovodkaz"/>
@@ -1291,7 +1330,7 @@
                 <w:noProof/>
                 <w:webHidden/>
               </w:rPr>
-              <w:instrText xml:space="preserve"> PAGEREF _Toc231405566 \h </w:instrText>
+              <w:instrText xml:space="preserve"> PAGEREF _Toc231411324 \h </w:instrText>
             </w:r>
             <w:r>
               <w:rPr>
@@ -1338,7 +1377,7 @@
               <w14:ligatures w14:val="standardContextual"/>
             </w:rPr>
           </w:pPr>
-          <w:hyperlink w:anchor="_Toc231405567" w:history="1">
+          <w:hyperlink w:anchor="_Toc231411325" w:history="1">
             <w:r>
               <w:rPr>
                 <w:rStyle w:val="Hypertextovodkaz"/>
@@ -1383,7 +1422,7 @@
                 <w:noProof/>
                 <w:webHidden/>
               </w:rPr>
-              <w:instrText xml:space="preserve"> PAGEREF _Toc231405567 \h </w:instrText>
+              <w:instrText xml:space="preserve"> PAGEREF _Toc231411325 \h </w:instrText>
             </w:r>
             <w:r>
               <w:rPr>
@@ -1430,7 +1469,7 @@
               <w14:ligatures w14:val="standardContextual"/>
             </w:rPr>
           </w:pPr>
-          <w:hyperlink w:anchor="_Toc231405568" w:history="1">
+          <w:hyperlink w:anchor="_Toc231411326" w:history="1">
             <w:r>
               <w:rPr>
                 <w:rStyle w:val="Hypertextovodkaz"/>
@@ -1454,6 +1493,98 @@
                 <w:rStyle w:val="Hypertextovodkaz"/>
                 <w:noProof/>
               </w:rPr>
+              <w:t>Technologie UWB</w:t>
+            </w:r>
+            <w:r>
+              <w:rPr>
+                <w:noProof/>
+                <w:webHidden/>
+              </w:rPr>
+              <w:tab/>
+            </w:r>
+            <w:r>
+              <w:rPr>
+                <w:noProof/>
+                <w:webHidden/>
+              </w:rPr>
+              <w:fldChar w:fldCharType="begin"/>
+            </w:r>
+            <w:r>
+              <w:rPr>
+                <w:noProof/>
+                <w:webHidden/>
+              </w:rPr>
+              <w:instrText xml:space="preserve"> PAGEREF _Toc231411326 \h </w:instrText>
+            </w:r>
+            <w:r>
+              <w:rPr>
+                <w:noProof/>
+                <w:webHidden/>
+              </w:rPr>
+            </w:r>
+            <w:r>
+              <w:rPr>
+                <w:noProof/>
+                <w:webHidden/>
+              </w:rPr>
+              <w:fldChar w:fldCharType="separate"/>
+            </w:r>
+            <w:r>
+              <w:rPr>
+                <w:noProof/>
+                <w:webHidden/>
+              </w:rPr>
+              <w:t>10</w:t>
+            </w:r>
+            <w:r>
+              <w:rPr>
+                <w:noProof/>
+                <w:webHidden/>
+              </w:rPr>
+              <w:fldChar w:fldCharType="end"/>
+            </w:r>
+          </w:hyperlink>
+        </w:p>
+        <w:p>
+          <w:pPr>
+            <w:pStyle w:val="Obsah3"/>
+            <w:tabs>
+              <w:tab w:val="left" w:pos="1200"/>
+              <w:tab w:val="right" w:leader="dot" w:pos="9062"/>
+            </w:tabs>
+            <w:rPr>
+              <w:noProof/>
+              <w:kern w:val="2"/>
+              <w:sz w:val="24"/>
+              <w:szCs w:val="24"/>
+              <w:lang w:eastAsia="cs-CZ"/>
+              <w14:ligatures w14:val="standardContextual"/>
+            </w:rPr>
+          </w:pPr>
+          <w:hyperlink w:anchor="_Toc231411327" w:history="1">
+            <w:r>
+              <w:rPr>
+                <w:rStyle w:val="Hypertextovodkaz"/>
+                <w:noProof/>
+              </w:rPr>
+              <w:t>1.2.3</w:t>
+            </w:r>
+            <w:r>
+              <w:rPr>
+                <w:noProof/>
+                <w:kern w:val="2"/>
+                <w:sz w:val="24"/>
+                <w:szCs w:val="24"/>
+                <w:lang w:eastAsia="cs-CZ"/>
+                <w14:ligatures w14:val="standardContextual"/>
+              </w:rPr>
+              <w:tab/>
+            </w:r>
+            <w:r>
+              <w:rPr>
+                <w:rStyle w:val="Hypertextovodkaz"/>
+                <w:noProof/>
+              </w:rPr>
               <w:t>Hardware a elektronické komponenty</w:t>
             </w:r>
             <w:r>
@@ -1475,7 +1606,7 @@
                 <w:noProof/>
                 <w:webHidden/>
               </w:rPr>
-              <w:instrText xml:space="preserve"> PAGEREF _Toc231405568 \h </w:instrText>
+              <w:instrText xml:space="preserve"> PAGEREF _Toc231411327 \h </w:instrText>
             </w:r>
             <w:r>
               <w:rPr>
@@ -1522,7 +1653,7 @@
               <w14:ligatures w14:val="standardContextual"/>
             </w:rPr>
           </w:pPr>
-          <w:hyperlink w:anchor="_Toc231405569" w:history="1">
+          <w:hyperlink w:anchor="_Toc231411328" w:history="1">
             <w:r>
               <w:rPr>
                 <w:rStyle w:val="Hypertextovodkaz"/>
@@ -1567,7 +1698,7 @@
                 <w:noProof/>
                 <w:webHidden/>
               </w:rPr>
-              <w:instrText xml:space="preserve"> PAGEREF _Toc231405569 \h </w:instrText>
+              <w:instrText xml:space="preserve"> PAGEREF _Toc231411328 \h </w:instrText>
             </w:r>
             <w:r>
               <w:rPr>
@@ -1614,7 +1745,7 @@
               <w14:ligatures w14:val="standardContextual"/>
             </w:rPr>
           </w:pPr>
-          <w:hyperlink w:anchor="_Toc231405570" w:history="1">
+          <w:hyperlink w:anchor="_Toc231411329" w:history="1">
             <w:r>
               <w:rPr>
                 <w:rStyle w:val="Hypertextovodkaz"/>
@@ -1659,7 +1790,7 @@
                 <w:noProof/>
                 <w:webHidden/>
               </w:rPr>
-              <w:instrText xml:space="preserve"> PAGEREF _Toc231405570 \h </w:instrText>
+              <w:instrText xml:space="preserve"> PAGEREF _Toc231411329 \h </w:instrText>
             </w:r>
             <w:r>
               <w:rPr>
@@ -1706,7 +1837,7 @@
               <w14:ligatures w14:val="standardContextual"/>
             </w:rPr>
           </w:pPr>
-          <w:hyperlink w:anchor="_Toc231405571" w:history="1">
+          <w:hyperlink w:anchor="_Toc231411330" w:history="1">
             <w:r>
               <w:rPr>
                 <w:rStyle w:val="Hypertextovodkaz"/>
@@ -1751,7 +1882,7 @@
                 <w:noProof/>
                 <w:webHidden/>
               </w:rPr>
-              <w:instrText xml:space="preserve"> PAGEREF _Toc231405571 \h </w:instrText>
+              <w:instrText xml:space="preserve"> PAGEREF _Toc231411330 \h </w:instrText>
             </w:r>
             <w:r>
               <w:rPr>
@@ -1798,7 +1929,7 @@
               <w14:ligatures w14:val="standardContextual"/>
             </w:rPr>
           </w:pPr>
-          <w:hyperlink w:anchor="_Toc231405572" w:history="1">
+          <w:hyperlink w:anchor="_Toc231411331" w:history="1">
             <w:r>
               <w:rPr>
                 <w:rStyle w:val="Hypertextovodkaz"/>
@@ -1843,7 +1974,7 @@
                 <w:noProof/>
                 <w:webHidden/>
               </w:rPr>
-              <w:instrText xml:space="preserve"> PAGEREF _Toc231405572 \h </w:instrText>
+              <w:instrText xml:space="preserve"> PAGEREF _Toc231411331 \h </w:instrText>
             </w:r>
             <w:r>
               <w:rPr>
@@ -1890,7 +2021,7 @@
               <w14:ligatures w14:val="standardContextual"/>
             </w:rPr>
           </w:pPr>
-          <w:hyperlink w:anchor="_Toc231405573" w:history="1">
+          <w:hyperlink w:anchor="_Toc231411332" w:history="1">
             <w:r>
               <w:rPr>
                 <w:rStyle w:val="Hypertextovodkaz"/>
@@ -1935,7 +2066,7 @@
                 <w:noProof/>
                 <w:webHidden/>
               </w:rPr>
-              <w:instrText xml:space="preserve"> PAGEREF _Toc231405573 \h </w:instrText>
+              <w:instrText xml:space="preserve"> PAGEREF _Toc231411332 \h </w:instrText>
             </w:r>
             <w:r>
               <w:rPr>
@@ -1982,7 +2113,7 @@
               <w14:ligatures w14:val="standardContextual"/>
             </w:rPr>
           </w:pPr>
-          <w:hyperlink w:anchor="_Toc231405574" w:history="1">
+          <w:hyperlink w:anchor="_Toc231411333" w:history="1">
             <w:r>
               <w:rPr>
                 <w:rStyle w:val="Hypertextovodkaz"/>
@@ -2027,7 +2158,7 @@
                 <w:noProof/>
                 <w:webHidden/>
               </w:rPr>
-              <w:instrText xml:space="preserve"> PAGEREF _Toc231405574 \h </w:instrText>
+              <w:instrText xml:space="preserve"> PAGEREF _Toc231411333 \h </w:instrText>
             </w:r>
             <w:r>
               <w:rPr>
@@ -2074,7 +2205,7 @@
               <w14:ligatures w14:val="standardContextual"/>
             </w:rPr>
           </w:pPr>
-          <w:hyperlink w:anchor="_Toc231405575" w:history="1">
+          <w:hyperlink w:anchor="_Toc231411334" w:history="1">
             <w:r>
               <w:rPr>
                 <w:rStyle w:val="Hypertextovodkaz"/>
@@ -2119,7 +2250,7 @@
                 <w:noProof/>
                 <w:webHidden/>
               </w:rPr>
-              <w:instrText xml:space="preserve"> PAGEREF _Toc231405575 \h </w:instrText>
+              <w:instrText xml:space="preserve"> PAGEREF _Toc231411334 \h </w:instrText>
             </w:r>
             <w:r>
               <w:rPr>
@@ -2166,7 +2297,7 @@
               <w14:ligatures w14:val="standardContextual"/>
             </w:rPr>
           </w:pPr>
-          <w:hyperlink w:anchor="_Toc231405576" w:history="1">
+          <w:hyperlink w:anchor="_Toc231411335" w:history="1">
             <w:r>
               <w:rPr>
                 <w:rStyle w:val="Hypertextovodkaz"/>
@@ -2211,7 +2342,7 @@
                 <w:noProof/>
                 <w:webHidden/>
               </w:rPr>
-              <w:instrText xml:space="preserve"> PAGEREF _Toc231405576 \h </w:instrText>
+              <w:instrText xml:space="preserve"> PAGEREF _Toc231411335 \h </w:instrText>
             </w:r>
             <w:r>
               <w:rPr>
@@ -2258,7 +2389,7 @@
               <w14:ligatures w14:val="standardContextual"/>
             </w:rPr>
           </w:pPr>
-          <w:hyperlink w:anchor="_Toc231405577" w:history="1">
+          <w:hyperlink w:anchor="_Toc231411336" w:history="1">
             <w:r>
               <w:rPr>
                 <w:rStyle w:val="Hypertextovodkaz"/>
@@ -2303,7 +2434,7 @@
                 <w:noProof/>
                 <w:webHidden/>
               </w:rPr>
-              <w:instrText xml:space="preserve"> PAGEREF _Toc231405577 \h </w:instrText>
+              <w:instrText xml:space="preserve"> PAGEREF _Toc231411336 \h </w:instrText>
             </w:r>
             <w:r>
               <w:rPr>
@@ -2324,6 +2455,466 @@
                 <w:webHidden/>
               </w:rPr>
               <w:t>14</w:t>
+            </w:r>
+            <w:r>
+              <w:rPr>
+                <w:noProof/>
+                <w:webHidden/>
+              </w:rPr>
+              <w:fldChar w:fldCharType="end"/>
+            </w:r>
+          </w:hyperlink>
+        </w:p>
+        <w:p>
+          <w:pPr>
+            <w:pStyle w:val="Obsah3"/>
+            <w:tabs>
+              <w:tab w:val="left" w:pos="1200"/>
+              <w:tab w:val="right" w:leader="dot" w:pos="9062"/>
+            </w:tabs>
+            <w:rPr>
+              <w:noProof/>
+              <w:kern w:val="2"/>
+              <w:sz w:val="24"/>
+              <w:szCs w:val="24"/>
+              <w:lang w:eastAsia="cs-CZ"/>
+              <w14:ligatures w14:val="standardContextual"/>
+            </w:rPr>
+          </w:pPr>
+          <w:hyperlink w:anchor="_Toc231411337" w:history="1">
+            <w:r>
+              <w:rPr>
+                <w:rStyle w:val="Hypertextovodkaz"/>
+                <w:noProof/>
+              </w:rPr>
+              <w:t>2.2.7</w:t>
+            </w:r>
+            <w:r>
+              <w:rPr>
+                <w:noProof/>
+                <w:kern w:val="2"/>
+                <w:sz w:val="24"/>
+                <w:szCs w:val="24"/>
+                <w:lang w:eastAsia="cs-CZ"/>
+                <w14:ligatures w14:val="standardContextual"/>
+              </w:rPr>
+              <w:tab/>
+            </w:r>
+            <w:r>
+              <w:rPr>
+                <w:rStyle w:val="Hypertextovodkaz"/>
+                <w:noProof/>
+              </w:rPr>
+              <w:t>Vývoj lokalizačních kotev UWB</w:t>
+            </w:r>
+            <w:r>
+              <w:rPr>
+                <w:noProof/>
+                <w:webHidden/>
+              </w:rPr>
+              <w:tab/>
+            </w:r>
+            <w:r>
+              <w:rPr>
+                <w:noProof/>
+                <w:webHidden/>
+              </w:rPr>
+              <w:fldChar w:fldCharType="begin"/>
+            </w:r>
+            <w:r>
+              <w:rPr>
+                <w:noProof/>
+                <w:webHidden/>
+              </w:rPr>
+              <w:instrText xml:space="preserve"> PAGEREF _Toc231411337 \h </w:instrText>
+            </w:r>
+            <w:r>
+              <w:rPr>
+                <w:noProof/>
+                <w:webHidden/>
+              </w:rPr>
+            </w:r>
+            <w:r>
+              <w:rPr>
+                <w:noProof/>
+                <w:webHidden/>
+              </w:rPr>
+              <w:fldChar w:fldCharType="separate"/>
+            </w:r>
+            <w:r>
+              <w:rPr>
+                <w:noProof/>
+                <w:webHidden/>
+              </w:rPr>
+              <w:t>15</w:t>
+            </w:r>
+            <w:r>
+              <w:rPr>
+                <w:noProof/>
+                <w:webHidden/>
+              </w:rPr>
+              <w:fldChar w:fldCharType="end"/>
+            </w:r>
+          </w:hyperlink>
+        </w:p>
+        <w:p>
+          <w:pPr>
+            <w:pStyle w:val="Obsah3"/>
+            <w:tabs>
+              <w:tab w:val="left" w:pos="1200"/>
+              <w:tab w:val="right" w:leader="dot" w:pos="9062"/>
+            </w:tabs>
+            <w:rPr>
+              <w:noProof/>
+              <w:kern w:val="2"/>
+              <w:sz w:val="24"/>
+              <w:szCs w:val="24"/>
+              <w:lang w:eastAsia="cs-CZ"/>
+              <w14:ligatures w14:val="standardContextual"/>
+            </w:rPr>
+          </w:pPr>
+          <w:hyperlink w:anchor="_Toc231411338" w:history="1">
+            <w:r>
+              <w:rPr>
+                <w:rStyle w:val="Hypertextovodkaz"/>
+                <w:noProof/>
+              </w:rPr>
+              <w:t>2.2.8</w:t>
+            </w:r>
+            <w:r>
+              <w:rPr>
+                <w:noProof/>
+                <w:kern w:val="2"/>
+                <w:sz w:val="24"/>
+                <w:szCs w:val="24"/>
+                <w:lang w:eastAsia="cs-CZ"/>
+                <w14:ligatures w14:val="standardContextual"/>
+              </w:rPr>
+              <w:tab/>
+            </w:r>
+            <w:r>
+              <w:rPr>
+                <w:rStyle w:val="Hypertextovodkaz"/>
+                <w:noProof/>
+              </w:rPr>
+              <w:t>Návrh vlastní desky plošných spojů</w:t>
+            </w:r>
+            <w:r>
+              <w:rPr>
+                <w:noProof/>
+                <w:webHidden/>
+              </w:rPr>
+              <w:tab/>
+            </w:r>
+            <w:r>
+              <w:rPr>
+                <w:noProof/>
+                <w:webHidden/>
+              </w:rPr>
+              <w:fldChar w:fldCharType="begin"/>
+            </w:r>
+            <w:r>
+              <w:rPr>
+                <w:noProof/>
+                <w:webHidden/>
+              </w:rPr>
+              <w:instrText xml:space="preserve"> PAGEREF _Toc231411338 \h </w:instrText>
+            </w:r>
+            <w:r>
+              <w:rPr>
+                <w:noProof/>
+                <w:webHidden/>
+              </w:rPr>
+            </w:r>
+            <w:r>
+              <w:rPr>
+                <w:noProof/>
+                <w:webHidden/>
+              </w:rPr>
+              <w:fldChar w:fldCharType="separate"/>
+            </w:r>
+            <w:r>
+              <w:rPr>
+                <w:noProof/>
+                <w:webHidden/>
+              </w:rPr>
+              <w:t>16</w:t>
+            </w:r>
+            <w:r>
+              <w:rPr>
+                <w:noProof/>
+                <w:webHidden/>
+              </w:rPr>
+              <w:fldChar w:fldCharType="end"/>
+            </w:r>
+          </w:hyperlink>
+        </w:p>
+        <w:p>
+          <w:pPr>
+            <w:pStyle w:val="Obsah3"/>
+            <w:tabs>
+              <w:tab w:val="left" w:pos="1200"/>
+              <w:tab w:val="right" w:leader="dot" w:pos="9062"/>
+            </w:tabs>
+            <w:rPr>
+              <w:noProof/>
+              <w:kern w:val="2"/>
+              <w:sz w:val="24"/>
+              <w:szCs w:val="24"/>
+              <w:lang w:eastAsia="cs-CZ"/>
+              <w14:ligatures w14:val="standardContextual"/>
+            </w:rPr>
+          </w:pPr>
+          <w:hyperlink w:anchor="_Toc231411339" w:history="1">
+            <w:r>
+              <w:rPr>
+                <w:rStyle w:val="Hypertextovodkaz"/>
+                <w:noProof/>
+              </w:rPr>
+              <w:t>2.2.9</w:t>
+            </w:r>
+            <w:r>
+              <w:rPr>
+                <w:noProof/>
+                <w:kern w:val="2"/>
+                <w:sz w:val="24"/>
+                <w:szCs w:val="24"/>
+                <w:lang w:eastAsia="cs-CZ"/>
+                <w14:ligatures w14:val="standardContextual"/>
+              </w:rPr>
+              <w:tab/>
+            </w:r>
+            <w:r>
+              <w:rPr>
+                <w:rStyle w:val="Hypertextovodkaz"/>
+                <w:noProof/>
+              </w:rPr>
+              <w:t>Vývoj gateway serveru a administračního rozhraní</w:t>
+            </w:r>
+            <w:r>
+              <w:rPr>
+                <w:noProof/>
+                <w:webHidden/>
+              </w:rPr>
+              <w:tab/>
+            </w:r>
+            <w:r>
+              <w:rPr>
+                <w:noProof/>
+                <w:webHidden/>
+              </w:rPr>
+              <w:fldChar w:fldCharType="begin"/>
+            </w:r>
+            <w:r>
+              <w:rPr>
+                <w:noProof/>
+                <w:webHidden/>
+              </w:rPr>
+              <w:instrText xml:space="preserve"> PAGEREF _Toc231411339 \h </w:instrText>
+            </w:r>
+            <w:r>
+              <w:rPr>
+                <w:noProof/>
+                <w:webHidden/>
+              </w:rPr>
+            </w:r>
+            <w:r>
+              <w:rPr>
+                <w:noProof/>
+                <w:webHidden/>
+              </w:rPr>
+              <w:fldChar w:fldCharType="separate"/>
+            </w:r>
+            <w:r>
+              <w:rPr>
+                <w:noProof/>
+                <w:webHidden/>
+              </w:rPr>
+              <w:t>17</w:t>
+            </w:r>
+            <w:r>
+              <w:rPr>
+                <w:noProof/>
+                <w:webHidden/>
+              </w:rPr>
+              <w:fldChar w:fldCharType="end"/>
+            </w:r>
+          </w:hyperlink>
+        </w:p>
+        <w:p>
+          <w:pPr>
+            <w:pStyle w:val="Obsah3"/>
+            <w:tabs>
+              <w:tab w:val="left" w:pos="1440"/>
+              <w:tab w:val="right" w:leader="dot" w:pos="9062"/>
+            </w:tabs>
+            <w:rPr>
+              <w:noProof/>
+              <w:kern w:val="2"/>
+              <w:sz w:val="24"/>
+              <w:szCs w:val="24"/>
+              <w:lang w:eastAsia="cs-CZ"/>
+              <w14:ligatures w14:val="standardContextual"/>
+            </w:rPr>
+          </w:pPr>
+          <w:hyperlink w:anchor="_Toc231411340" w:history="1">
+            <w:r>
+              <w:rPr>
+                <w:rStyle w:val="Hypertextovodkaz"/>
+                <w:noProof/>
+              </w:rPr>
+              <w:t>2.2.10</w:t>
+            </w:r>
+            <w:r>
+              <w:rPr>
+                <w:noProof/>
+                <w:kern w:val="2"/>
+                <w:sz w:val="24"/>
+                <w:szCs w:val="24"/>
+                <w:lang w:eastAsia="cs-CZ"/>
+                <w14:ligatures w14:val="standardContextual"/>
+              </w:rPr>
+              <w:tab/>
+            </w:r>
+            <w:r>
+              <w:rPr>
+                <w:rStyle w:val="Hypertextovodkaz"/>
+                <w:noProof/>
+              </w:rPr>
+              <w:t>Vývoj testovacího prostředí Playground</w:t>
+            </w:r>
+            <w:r>
+              <w:rPr>
+                <w:noProof/>
+                <w:webHidden/>
+              </w:rPr>
+              <w:tab/>
+            </w:r>
+            <w:r>
+              <w:rPr>
+                <w:noProof/>
+                <w:webHidden/>
+              </w:rPr>
+              <w:fldChar w:fldCharType="begin"/>
+            </w:r>
+            <w:r>
+              <w:rPr>
+                <w:noProof/>
+                <w:webHidden/>
+              </w:rPr>
+              <w:instrText xml:space="preserve"> PAGEREF _Toc231411340 \h </w:instrText>
+            </w:r>
+            <w:r>
+              <w:rPr>
+                <w:noProof/>
+                <w:webHidden/>
+              </w:rPr>
+            </w:r>
+            <w:r>
+              <w:rPr>
+                <w:noProof/>
+                <w:webHidden/>
+              </w:rPr>
+              <w:fldChar w:fldCharType="separate"/>
+            </w:r>
+            <w:r>
+              <w:rPr>
+                <w:noProof/>
+                <w:webHidden/>
+              </w:rPr>
+              <w:t>18</w:t>
+            </w:r>
+            <w:r>
+              <w:rPr>
+                <w:noProof/>
+                <w:webHidden/>
+              </w:rPr>
+              <w:fldChar w:fldCharType="end"/>
+            </w:r>
+          </w:hyperlink>
+        </w:p>
+        <w:p>
+          <w:pPr>
+            <w:pStyle w:val="Obsah3"/>
+            <w:tabs>
+              <w:tab w:val="left" w:pos="1440"/>
+              <w:tab w:val="right" w:leader="dot" w:pos="9062"/>
+            </w:tabs>
+            <w:rPr>
+              <w:noProof/>
+              <w:kern w:val="2"/>
+              <w:sz w:val="24"/>
+              <w:szCs w:val="24"/>
+              <w:lang w:eastAsia="cs-CZ"/>
+              <w14:ligatures w14:val="standardContextual"/>
+            </w:rPr>
+          </w:pPr>
+          <w:hyperlink w:anchor="_Toc231411341" w:history="1">
+            <w:r>
+              <w:rPr>
+                <w:rStyle w:val="Hypertextovodkaz"/>
+                <w:noProof/>
+              </w:rPr>
+              <w:t>2.2.11</w:t>
+            </w:r>
+            <w:r>
+              <w:rPr>
+                <w:noProof/>
+                <w:kern w:val="2"/>
+                <w:sz w:val="24"/>
+                <w:szCs w:val="24"/>
+                <w:lang w:eastAsia="cs-CZ"/>
+                <w14:ligatures w14:val="standardContextual"/>
+              </w:rPr>
+              <w:tab/>
+            </w:r>
+            <w:r>
+              <w:rPr>
+                <w:rStyle w:val="Hypertextovodkaz"/>
+                <w:noProof/>
+              </w:rPr>
+              <w:t>Integrace systému a identifikované problémy</w:t>
+            </w:r>
+            <w:r>
+              <w:rPr>
+                <w:noProof/>
+                <w:webHidden/>
+              </w:rPr>
+              <w:tab/>
+            </w:r>
+            <w:r>
+              <w:rPr>
+                <w:noProof/>
+                <w:webHidden/>
+              </w:rPr>
+              <w:fldChar w:fldCharType="begin"/>
+            </w:r>
+            <w:r>
+              <w:rPr>
+                <w:noProof/>
+                <w:webHidden/>
+              </w:rPr>
+              <w:instrText xml:space="preserve"> PAGEREF _Toc231411341 \h </w:instrText>
+            </w:r>
+            <w:r>
+              <w:rPr>
+                <w:noProof/>
+                <w:webHidden/>
+              </w:rPr>
+            </w:r>
+            <w:r>
+              <w:rPr>
+                <w:noProof/>
+                <w:webHidden/>
+              </w:rPr>
+              <w:fldChar w:fldCharType="separate"/>
+            </w:r>
+            <w:r>
+              <w:rPr>
+                <w:noProof/>
+                <w:webHidden/>
+              </w:rPr>
+              <w:t>19</w:t>
             </w:r>
             <w:r>
               <w:rPr>
@@ -2350,7 +2941,7 @@
               <w14:ligatures w14:val="standardContextual"/>
             </w:rPr>
           </w:pPr>
-          <w:hyperlink w:anchor="_Toc231405578" w:history="1">
+          <w:hyperlink w:anchor="_Toc231411342" w:history="1">
             <w:r>
               <w:rPr>
                 <w:rStyle w:val="Hypertextovodkaz"/>
@@ -2395,7 +2986,7 @@
                 <w:noProof/>
                 <w:webHidden/>
               </w:rPr>
-              <w:instrText xml:space="preserve"> PAGEREF _Toc231405578 \h </w:instrText>
+              <w:instrText xml:space="preserve"> PAGEREF _Toc231411342 \h </w:instrText>
             </w:r>
             <w:r>
               <w:rPr>
@@ -2415,7 +3006,7 @@
                 <w:noProof/>
                 <w:webHidden/>
               </w:rPr>
-              <w:t>16</w:t>
+              <w:t>20</w:t>
             </w:r>
             <w:r>
               <w:rPr>
@@ -2442,7 +3033,7 @@
               <w14:ligatures w14:val="standardContextual"/>
             </w:rPr>
           </w:pPr>
-          <w:hyperlink w:anchor="_Toc231405579" w:history="1">
+          <w:hyperlink w:anchor="_Toc231411343" w:history="1">
             <w:r>
               <w:rPr>
                 <w:rStyle w:val="Hypertextovodkaz"/>
@@ -2487,7 +3078,7 @@
                 <w:noProof/>
                 <w:webHidden/>
               </w:rPr>
-              <w:instrText xml:space="preserve"> PAGEREF _Toc231405579 \h </w:instrText>
+              <w:instrText xml:space="preserve"> PAGEREF _Toc231411343 \h </w:instrText>
             </w:r>
             <w:r>
               <w:rPr>
@@ -2507,14 +3098,14 @@
                 <w:noProof/>
                 <w:webHidden/>
               </w:rPr>
-              <w:t>1</w:t>
-            </w:r>
-            <w:r>
-              <w:rPr>
-                <w:noProof/>
-                <w:webHidden/>
-              </w:rPr>
-              <w:t>6</w:t>
+              <w:t>2</w:t>
+            </w:r>
+            <w:r>
+              <w:rPr>
+                <w:noProof/>
+                <w:webHidden/>
+              </w:rPr>
+              <w:t>0</w:t>
             </w:r>
             <w:r>
               <w:rPr>
@@ -2541,7 +3132,7 @@
               <w14:ligatures w14:val="standardContextual"/>
             </w:rPr>
           </w:pPr>
-          <w:hyperlink w:anchor="_Toc231405580" w:history="1">
+          <w:hyperlink w:anchor="_Toc231411344" w:history="1">
             <w:r>
               <w:rPr>
                 <w:rStyle w:val="Hypertextovodkaz"/>
@@ -2586,7 +3177,7 @@
                 <w:noProof/>
                 <w:webHidden/>
               </w:rPr>
-              <w:instrText xml:space="preserve"> PAGEREF _Toc231405580 \h </w:instrText>
+              <w:instrText xml:space="preserve"> PAGEREF _Toc231411344 \h </w:instrText>
             </w:r>
             <w:r>
               <w:rPr>
@@ -2606,7 +3197,7 @@
                 <w:noProof/>
                 <w:webHidden/>
               </w:rPr>
-              <w:t>16</w:t>
+              <w:t>20</w:t>
             </w:r>
             <w:r>
               <w:rPr>
@@ -2633,7 +3224,7 @@
               <w14:ligatures w14:val="standardContextual"/>
             </w:rPr>
           </w:pPr>
-          <w:hyperlink w:anchor="_Toc231405581" w:history="1">
+          <w:hyperlink w:anchor="_Toc231411345" w:history="1">
             <w:r>
               <w:rPr>
                 <w:rStyle w:val="Hypertextovodkaz"/>
@@ -2678,7 +3269,7 @@
                 <w:noProof/>
                 <w:webHidden/>
               </w:rPr>
-              <w:instrText xml:space="preserve"> PAGEREF _Toc231405581 \h </w:instrText>
+              <w:instrText xml:space="preserve"> PAGEREF _Toc231411345 \h </w:instrText>
             </w:r>
             <w:r>
               <w:rPr>
@@ -2698,7 +3289,7 @@
                 <w:noProof/>
                 <w:webHidden/>
               </w:rPr>
-              <w:t>17</w:t>
+              <w:t>21</w:t>
             </w:r>
             <w:r>
               <w:rPr>
@@ -2724,7 +3315,7 @@
               <w14:ligatures w14:val="standardContextual"/>
             </w:rPr>
           </w:pPr>
-          <w:hyperlink w:anchor="_Toc231405582" w:history="1">
+          <w:hyperlink w:anchor="_Toc231411346" w:history="1">
             <w:r>
               <w:rPr>
                 <w:rStyle w:val="Hypertextovodkaz"/>
@@ -2751,7 +3342,7 @@
                 <w:noProof/>
                 <w:webHidden/>
               </w:rPr>
-              <w:instrText xml:space="preserve"> PAGEREF _Toc231405582 \h </w:instrText>
+              <w:instrText xml:space="preserve"> PAGEREF _Toc231411346 \h </w:instrText>
             </w:r>
             <w:r>
               <w:rPr>
@@ -2771,7 +3362,7 @@
                 <w:noProof/>
                 <w:webHidden/>
               </w:rPr>
-              <w:t>19</w:t>
+              <w:t>23</w:t>
             </w:r>
             <w:r>
               <w:rPr>
@@ -2797,7 +3388,7 @@
               <w14:ligatures w14:val="standardContextual"/>
             </w:rPr>
           </w:pPr>
-          <w:hyperlink w:anchor="_Toc231405583" w:history="1">
+          <w:hyperlink w:anchor="_Toc231411347" w:history="1">
             <w:r>
               <w:rPr>
                 <w:rStyle w:val="Hypertextovodkaz"/>
@@ -2824,7 +3415,7 @@
                 <w:noProof/>
                 <w:webHidden/>
               </w:rPr>
-              <w:instrText xml:space="preserve"> PAGEREF _Toc231405583 \h </w:instrText>
+              <w:instrText xml:space="preserve"> PAGEREF _Toc231411347 \h </w:instrText>
             </w:r>
             <w:r>
               <w:rPr>
@@ -2844,7 +3435,7 @@
                 <w:noProof/>
                 <w:webHidden/>
               </w:rPr>
-              <w:t>20</w:t>
+              <w:t>24</w:t>
             </w:r>
             <w:r>
               <w:rPr>
@@ -2870,7 +3461,7 @@
               <w14:ligatures w14:val="standardContextual"/>
             </w:rPr>
           </w:pPr>
-          <w:hyperlink w:anchor="_Toc231405584" w:history="1">
+          <w:hyperlink w:anchor="_Toc231411348" w:history="1">
             <w:r>
               <w:rPr>
                 <w:rStyle w:val="Hypertextovodkaz"/>
@@ -2897,7 +3488,7 @@
                 <w:noProof/>
                 <w:webHidden/>
               </w:rPr>
-              <w:instrText xml:space="preserve"> PAGEREF _Toc231405584 \h </w:instrText>
+              <w:instrText xml:space="preserve"> PAGEREF _Toc231411348 \h </w:instrText>
             </w:r>
             <w:r>
               <w:rPr>
@@ -2917,7 +3508,7 @@
                 <w:noProof/>
                 <w:webHidden/>
               </w:rPr>
-              <w:t>21</w:t>
+              <w:t>25</w:t>
             </w:r>
             <w:r>
               <w:rPr>
@@ -2943,7 +3534,7 @@
               <w14:ligatures w14:val="standardContextual"/>
             </w:rPr>
           </w:pPr>
-          <w:hyperlink w:anchor="_Toc231405585" w:history="1">
+          <w:hyperlink w:anchor="_Toc231411349" w:history="1">
             <w:r>
               <w:rPr>
                 <w:rStyle w:val="Hypertextovodkaz"/>
@@ -2970,7 +3561,7 @@
                 <w:noProof/>
                 <w:webHidden/>
               </w:rPr>
-              <w:instrText xml:space="preserve"> PAGEREF _Toc231405585 \h </w:instrText>
+              <w:instrText xml:space="preserve"> PAGEREF _Toc231411349 \h </w:instrText>
             </w:r>
             <w:r>
               <w:rPr>
@@ -2990,7 +3581,7 @@
                 <w:noProof/>
                 <w:webHidden/>
               </w:rPr>
-              <w:t>21</w:t>
+              <w:t>25</w:t>
             </w:r>
             <w:r>
               <w:rPr>
@@ -3016,7 +3607,7 @@
               <w14:ligatures w14:val="standardContextual"/>
             </w:rPr>
           </w:pPr>
-          <w:hyperlink w:anchor="_Toc231405586" w:history="1">
+          <w:hyperlink w:anchor="_Toc231411350" w:history="1">
             <w:r>
               <w:rPr>
                 <w:rStyle w:val="Hypertextovodkaz"/>
@@ -3043,7 +3634,7 @@
                 <w:noProof/>
                 <w:webHidden/>
               </w:rPr>
-              <w:instrText xml:space="preserve"> PAGEREF _Toc231405586 \h </w:instrText>
+              <w:instrText xml:space="preserve"> PAGEREF _Toc231411350 \h </w:instrText>
             </w:r>
             <w:r>
               <w:rPr>
@@ -3063,7 +3654,7 @@
                 <w:noProof/>
                 <w:webHidden/>
               </w:rPr>
-              <w:t>21</w:t>
+              <w:t>25</w:t>
             </w:r>
             <w:r>
               <w:rPr>
@@ -3103,7 +3694,7 @@
         </w:pBdr>
         <w:ind w:left="0"/>
       </w:pPr>
-      <w:bookmarkStart w:id="0" w:name="_Toc231405560"/>
+      <w:bookmarkStart w:id="0" w:name="_Toc231411318"/>
       <w:r>
         <w:lastRenderedPageBreak/>
         <w:t>Ú</w:t>
@@ -3161,7 +3752,7 @@
         </w:pBdr>
         <w:ind w:left="431"/>
       </w:pPr>
-      <w:bookmarkStart w:id="1" w:name="_Toc231405561"/>
+      <w:bookmarkStart w:id="1" w:name="_Toc231411319"/>
       <w:r>
         <w:lastRenderedPageBreak/>
         <w:t>Teoretická část</w:t>
@@ -3172,7 +3763,7 @@
       <w:pPr>
         <w:pStyle w:val="Nadpis2"/>
       </w:pPr>
-      <w:bookmarkStart w:id="2" w:name="_Toc231405562"/>
+      <w:bookmarkStart w:id="2" w:name="_Toc231411320"/>
       <w:r>
         <w:t>Rešerše</w:t>
       </w:r>
@@ -3182,7 +3773,7 @@
       <w:pPr>
         <w:pStyle w:val="Nadpis3"/>
       </w:pPr>
-      <w:bookmarkStart w:id="3" w:name="_Toc231405563"/>
+      <w:bookmarkStart w:id="3" w:name="_Toc231411321"/>
       <w:r>
         <w:t>Wizard Tag</w:t>
       </w:r>
@@ -3317,7 +3908,7 @@
         <w:jc w:val="center"/>
       </w:pPr>
       <w:bookmarkStart w:id="4" w:name="_Toc219099614"/>
-      <w:bookmarkStart w:id="5" w:name="_Toc219385192"/>
+      <w:bookmarkStart w:id="5" w:name="_Toc231411259"/>
       <w:r>
         <w:t xml:space="preserve">Obrázek </w:t>
       </w:r>
@@ -3405,7 +3996,7 @@
       <w:pPr>
         <w:pStyle w:val="Nadpis3"/>
       </w:pPr>
-      <w:bookmarkStart w:id="6" w:name="_Toc231405564"/>
+      <w:bookmarkStart w:id="6" w:name="_Toc231411322"/>
       <w:r>
         <w:lastRenderedPageBreak/>
         <w:t>Klasická laser game</w:t>
@@ -3471,7 +4062,7 @@
       <w:pPr>
         <w:pStyle w:val="Nadpis3"/>
       </w:pPr>
-      <w:bookmarkStart w:id="7" w:name="_Toc231405565"/>
+      <w:bookmarkStart w:id="7" w:name="_Toc231411323"/>
       <w:r>
         <w:t>Pohybové senzory v herních systémech</w:t>
       </w:r>
@@ -3552,37 +4143,6 @@
       <w:r>
         <w:t>Použití pohybových senzorů mě zaujalo hlavně tím, že propojuje skutečný pohyb hráče s hrou. V této ročníkové práci jsou tyto senzory důležité pro snímání pohybu herní hůlky a jeho další využití v herním systému. Díky tomu může hra reagovat na pohyb hráče a působit přirozeněji.</w:t>
       </w:r>
-      <w:sdt>
-        <w:sdtPr>
-          <w:id w:val="1685861907"/>
-          <w:citation/>
-        </w:sdtPr>
-        <w:sdtContent>
-          <w:r>
-            <w:fldChar w:fldCharType="begin"/>
-          </w:r>
-          <w:r>
-            <w:instrText xml:space="preserve">CITATION htt26 \l 1029 </w:instrText>
-          </w:r>
-          <w:r>
-            <w:fldChar w:fldCharType="separate"/>
-          </w:r>
-          <w:r>
-            <w:rPr>
-              <w:noProof/>
-            </w:rPr>
-            <w:t xml:space="preserve"> (5)</w:t>
-          </w:r>
-          <w:r>
-            <w:fldChar w:fldCharType="end"/>
-          </w:r>
-        </w:sdtContent>
-      </w:sdt>
-    </w:p>
-    <w:p>
-      <w:pPr>
-        <w:jc w:val="left"/>
-      </w:pPr>
       <w:r>
         <w:br w:type="page"/>
       </w:r>
@@ -3591,7 +4151,7 @@
       <w:pPr>
         <w:pStyle w:val="Nadpis2"/>
       </w:pPr>
-      <w:bookmarkStart w:id="8" w:name="_Toc231405566"/>
+      <w:bookmarkStart w:id="8" w:name="_Toc231411324"/>
       <w:r>
         <w:lastRenderedPageBreak/>
         <w:t>Technologie</w:t>
@@ -3613,7 +4173,7 @@
       <w:pPr>
         <w:pStyle w:val="Nadpis3"/>
       </w:pPr>
-      <w:bookmarkStart w:id="9" w:name="_Toc231405567"/>
+      <w:bookmarkStart w:id="9" w:name="_Toc231411325"/>
       <w:r>
         <w:t>Mikrokontrolér a vývojové prostředí</w:t>
       </w:r>
@@ -3805,7 +4365,7 @@
       <w:tr>
         <w:tc>
           <w:tcPr>
-            <w:tcW w:w="3020" w:type="dxa"/>
+            <w:tcW w:w="3013" w:type="dxa"/>
             <w:tcBorders>
               <w:top w:val="single" w:sz="12" w:space="0" w:color="auto"/>
               <w:bottom w:val="single" w:sz="18" w:space="0" w:color="auto"/>
@@ -3826,7 +4386,7 @@
         </w:tc>
         <w:tc>
           <w:tcPr>
-            <w:tcW w:w="3021" w:type="dxa"/>
+            <w:tcW w:w="3014" w:type="dxa"/>
             <w:tcBorders>
               <w:top w:val="single" w:sz="12" w:space="0" w:color="auto"/>
               <w:left w:val="single" w:sz="12" w:space="0" w:color="auto"/>
@@ -3852,7 +4412,7 @@
         </w:tc>
         <w:tc>
           <w:tcPr>
-            <w:tcW w:w="3021" w:type="dxa"/>
+            <w:tcW w:w="3015" w:type="dxa"/>
             <w:tcBorders>
               <w:top w:val="single" w:sz="12" w:space="0" w:color="auto"/>
               <w:bottom w:val="single" w:sz="18" w:space="0" w:color="auto"/>
@@ -3877,7 +4437,7 @@
         </w:trPr>
         <w:tc>
           <w:tcPr>
-            <w:tcW w:w="3020" w:type="dxa"/>
+            <w:tcW w:w="3013" w:type="dxa"/>
             <w:tcBorders>
               <w:top w:val="single" w:sz="18" w:space="0" w:color="auto"/>
               <w:bottom w:val="single" w:sz="4" w:space="0" w:color="auto"/>
@@ -3906,7 +4466,7 @@
         </w:tc>
         <w:tc>
           <w:tcPr>
-            <w:tcW w:w="3021" w:type="dxa"/>
+            <w:tcW w:w="3014" w:type="dxa"/>
             <w:tcBorders>
               <w:top w:val="single" w:sz="18" w:space="0" w:color="auto"/>
               <w:left w:val="single" w:sz="12" w:space="0" w:color="auto"/>
@@ -3926,7 +4486,7 @@
         </w:tc>
         <w:tc>
           <w:tcPr>
-            <w:tcW w:w="3021" w:type="dxa"/>
+            <w:tcW w:w="3015" w:type="dxa"/>
             <w:tcBorders>
               <w:top w:val="single" w:sz="18" w:space="0" w:color="auto"/>
             </w:tcBorders>
@@ -3947,7 +4507,7 @@
       <w:tr>
         <w:tc>
           <w:tcPr>
-            <w:tcW w:w="3020" w:type="dxa"/>
+            <w:tcW w:w="3013" w:type="dxa"/>
             <w:tcBorders>
               <w:top w:val="single" w:sz="4" w:space="0" w:color="auto"/>
               <w:bottom w:val="single" w:sz="4" w:space="0" w:color="auto"/>
@@ -3976,7 +4536,7 @@
         </w:tc>
         <w:tc>
           <w:tcPr>
-            <w:tcW w:w="3021" w:type="dxa"/>
+            <w:tcW w:w="3014" w:type="dxa"/>
             <w:tcBorders>
               <w:left w:val="single" w:sz="12" w:space="0" w:color="auto"/>
             </w:tcBorders>
@@ -3995,7 +4555,7 @@
         </w:tc>
         <w:tc>
           <w:tcPr>
-            <w:tcW w:w="3021" w:type="dxa"/>
+            <w:tcW w:w="3015" w:type="dxa"/>
             <w:vAlign w:val="center"/>
           </w:tcPr>
           <w:p>
@@ -4013,7 +4573,7 @@
       <w:tr>
         <w:tc>
           <w:tcPr>
-            <w:tcW w:w="3020" w:type="dxa"/>
+            <w:tcW w:w="3013" w:type="dxa"/>
             <w:tcBorders>
               <w:top w:val="single" w:sz="4" w:space="0" w:color="auto"/>
               <w:bottom w:val="single" w:sz="4" w:space="0" w:color="auto"/>
@@ -4042,7 +4602,7 @@
         </w:tc>
         <w:tc>
           <w:tcPr>
-            <w:tcW w:w="3021" w:type="dxa"/>
+            <w:tcW w:w="3014" w:type="dxa"/>
             <w:tcBorders>
               <w:left w:val="single" w:sz="12" w:space="0" w:color="auto"/>
             </w:tcBorders>
@@ -4061,7 +4621,7 @@
         </w:tc>
         <w:tc>
           <w:tcPr>
-            <w:tcW w:w="3021" w:type="dxa"/>
+            <w:tcW w:w="3015" w:type="dxa"/>
             <w:vAlign w:val="center"/>
           </w:tcPr>
           <w:p>
@@ -4079,7 +4639,7 @@
       <w:tr>
         <w:tc>
           <w:tcPr>
-            <w:tcW w:w="3020" w:type="dxa"/>
+            <w:tcW w:w="3013" w:type="dxa"/>
             <w:tcBorders>
               <w:top w:val="single" w:sz="4" w:space="0" w:color="auto"/>
               <w:bottom w:val="single" w:sz="4" w:space="0" w:color="auto"/>
@@ -4108,7 +4668,7 @@
         </w:tc>
         <w:tc>
           <w:tcPr>
-            <w:tcW w:w="3021" w:type="dxa"/>
+            <w:tcW w:w="3014" w:type="dxa"/>
             <w:tcBorders>
               <w:left w:val="single" w:sz="12" w:space="0" w:color="auto"/>
             </w:tcBorders>
@@ -4127,7 +4687,7 @@
         </w:tc>
         <w:tc>
           <w:tcPr>
-            <w:tcW w:w="3021" w:type="dxa"/>
+            <w:tcW w:w="3015" w:type="dxa"/>
             <w:vAlign w:val="center"/>
           </w:tcPr>
           <w:p>
@@ -4145,7 +4705,7 @@
       <w:tr>
         <w:tc>
           <w:tcPr>
-            <w:tcW w:w="3020" w:type="dxa"/>
+            <w:tcW w:w="3013" w:type="dxa"/>
             <w:tcBorders>
               <w:top w:val="single" w:sz="4" w:space="0" w:color="auto"/>
               <w:bottom w:val="single" w:sz="12" w:space="0" w:color="auto"/>
@@ -4174,7 +4734,7 @@
         </w:tc>
         <w:tc>
           <w:tcPr>
-            <w:tcW w:w="3021" w:type="dxa"/>
+            <w:tcW w:w="3014" w:type="dxa"/>
             <w:tcBorders>
               <w:left w:val="single" w:sz="12" w:space="0" w:color="auto"/>
             </w:tcBorders>
@@ -4193,7 +4753,7 @@
         </w:tc>
         <w:tc>
           <w:tcPr>
-            <w:tcW w:w="3021" w:type="dxa"/>
+            <w:tcW w:w="3015" w:type="dxa"/>
             <w:vAlign w:val="center"/>
           </w:tcPr>
           <w:p>
@@ -4211,27 +4771,96 @@
     </w:tbl>
     <w:p>
       <w:pPr>
+        <w:pStyle w:val="Nadpis3"/>
+      </w:pPr>
+      <w:bookmarkStart w:id="11" w:name="_Toc231411326"/>
+      <w:r>
+        <w:t>Technologie UWB</w:t>
+      </w:r>
+      <w:bookmarkEnd w:id="11"/>
+    </w:p>
+    <w:p>
+      <w:pPr>
         <w:pStyle w:val="Normlntext"/>
       </w:pPr>
-    </w:p>
-    <w:p>
-      <w:pPr>
-        <w:jc w:val="left"/>
-      </w:pPr>
-      <w:r>
-        <w:br w:type="page"/>
-      </w:r>
+      <w:r>
+        <w:t xml:space="preserve">Ultra </w:t>
+      </w:r>
+      <w:proofErr w:type="spellStart"/>
+      <w:r>
+        <w:t>Wideband</w:t>
+      </w:r>
+      <w:proofErr w:type="spellEnd"/>
+      <w:r>
+        <w:t xml:space="preserve"> (</w:t>
+      </w:r>
+      <w:r>
+        <w:t xml:space="preserve">dále jen </w:t>
+      </w:r>
+      <w:r>
+        <w:t>UWB) je bezdrátová technologie určená pro přesné určování vzdálenosti a polohy zařízení v prostoru. Na rozdíl od běžných technologií, jako jsou Wi-Fi nebo Bluetooth, využívá velmi krátké rádiové impulsy rozprostřené přes široké frekvenční pásmo. Díky tomu je možné dosahovat vysoké přesnosti měření vzdálenosti mezi jednotlivými zařízeními.</w:t>
+      </w:r>
+    </w:p>
+    <w:p>
+      <w:pPr>
+        <w:pStyle w:val="Normlntext"/>
+      </w:pPr>
+      <w:r>
+        <w:t>Technologie UWB se v současnosti využívá například pro lokalizaci osob a předmětů v budovách, navigaci autonomních systémů nebo pro určování polohy mobilních zařízení. Výhodou této technologie je vysoká odolnost vůči rušení a schopnost pracovat s přesností v řádu desítek centimetrů.</w:t>
+      </w:r>
+    </w:p>
+    <w:p>
+      <w:pPr>
+        <w:pStyle w:val="Normlntext"/>
+      </w:pPr>
+      <w:r>
+        <w:lastRenderedPageBreak/>
+        <w:t>V projektu Laser Wand je technologie UWB využita pro návrh lokalizační infrastruktury herního prostoru. Jednotlivé kotvy rozmístěné v herní aréně umožňují určovat polohu hráčů a poskytovat data potřebná pro vyhodnocování herních událostí. Díky tomu není systém závislý pouze na pohybových senzorech umístěných v hůlce, ale může pracovat také s informacemi o poloze hráče v prostoru.</w:t>
+      </w:r>
+    </w:p>
+    <w:p>
+      <w:pPr>
+        <w:pStyle w:val="Normlntext"/>
+      </w:pPr>
+      <w:r>
+        <w:t>Pro realizaci projektu byl zvolen modul DWM3001C, který integruje UWB transceiver a potřebnou elektroniku pro komunikaci a lokalizaci. Tento modul byl vybrán především z důvodu dostupnosti, dokumentace a podpory pro vývoj vlastních aplikací.</w:t>
+      </w:r>
+      <w:sdt>
+        <w:sdtPr>
+          <w:id w:val="1467781380"/>
+          <w:citation/>
+        </w:sdtPr>
+        <w:sdtContent>
+          <w:r>
+            <w:fldChar w:fldCharType="begin"/>
+          </w:r>
+          <w:r>
+            <w:instrText xml:space="preserve">CITATION QOR26 \l 1029 </w:instrText>
+          </w:r>
+          <w:r>
+            <w:fldChar w:fldCharType="separate"/>
+          </w:r>
+          <w:r>
+            <w:rPr>
+              <w:noProof/>
+            </w:rPr>
+            <w:t xml:space="preserve"> (5)</w:t>
+          </w:r>
+          <w:r>
+            <w:fldChar w:fldCharType="end"/>
+          </w:r>
+        </w:sdtContent>
+      </w:sdt>
     </w:p>
     <w:p>
       <w:pPr>
         <w:pStyle w:val="Nadpis3"/>
       </w:pPr>
-      <w:bookmarkStart w:id="11" w:name="_Toc231405568"/>
-      <w:r>
-        <w:lastRenderedPageBreak/>
+      <w:bookmarkStart w:id="12" w:name="_Toc231411327"/>
+      <w:r>
         <w:t>Hardware a elektronické komponenty</w:t>
       </w:r>
-      <w:bookmarkEnd w:id="11"/>
+      <w:bookmarkEnd w:id="12"/>
     </w:p>
     <w:p>
       <w:pPr>
@@ -4355,7 +4984,7 @@
       <w:pPr>
         <w:pStyle w:val="Titulek"/>
       </w:pPr>
-      <w:bookmarkStart w:id="12" w:name="_Toc219385197"/>
+      <w:bookmarkStart w:id="13" w:name="_Toc219385197"/>
       <w:r>
         <w:t xml:space="preserve">Tabulka </w:t>
       </w:r>
@@ -4383,7 +5012,7 @@
       <w:r>
         <w:t>: Komponenty.</w:t>
       </w:r>
-      <w:bookmarkEnd w:id="12"/>
+      <w:bookmarkEnd w:id="13"/>
     </w:p>
     <w:tbl>
       <w:tblPr>
@@ -4817,11 +5446,15 @@
               <w:ind w:firstLine="0"/>
               <w:jc w:val="center"/>
             </w:pPr>
-            <w:proofErr w:type="gramStart"/>
-            <w:r>
-              <w:t>3V</w:t>
-            </w:r>
-            <w:proofErr w:type="gramEnd"/>
+            <w:r>
+              <w:t>3</w:t>
+            </w:r>
+            <w:r>
+              <w:t>,3</w:t>
+            </w:r>
+            <w:r>
+              <w:t>V</w:t>
+            </w:r>
           </w:p>
         </w:tc>
         <w:tc>
@@ -5057,7 +5690,7 @@
             <w:tcW w:w="1134" w:type="dxa"/>
             <w:tcBorders>
               <w:top w:val="single" w:sz="4" w:space="0" w:color="auto"/>
-              <w:bottom w:val="single" w:sz="12" w:space="0" w:color="auto"/>
+              <w:bottom w:val="single" w:sz="4" w:space="0" w:color="auto"/>
               <w:tl2br w:val="nil"/>
               <w:tr2bl w:val="nil"/>
             </w:tcBorders>
@@ -5107,6 +5740,110 @@
           </w:p>
         </w:tc>
       </w:tr>
+      <w:tr>
+        <w:tc>
+          <w:tcPr>
+            <w:tcW w:w="1701" w:type="dxa"/>
+            <w:vAlign w:val="center"/>
+          </w:tcPr>
+          <w:p>
+            <w:pPr>
+              <w:pStyle w:val="Normlntext"/>
+              <w:ind w:firstLine="0"/>
+              <w:jc w:val="center"/>
+            </w:pPr>
+            <w:r>
+              <w:t>DWM3001C</w:t>
+            </w:r>
+          </w:p>
+        </w:tc>
+        <w:tc>
+          <w:tcPr>
+            <w:tcW w:w="1701" w:type="dxa"/>
+            <w:vAlign w:val="center"/>
+          </w:tcPr>
+          <w:p>
+            <w:pPr>
+              <w:pStyle w:val="Normlntext"/>
+              <w:ind w:firstLine="0"/>
+              <w:jc w:val="center"/>
+            </w:pPr>
+            <w:r>
+              <w:t>UWB lokalizace</w:t>
+            </w:r>
+          </w:p>
+        </w:tc>
+        <w:tc>
+          <w:tcPr>
+            <w:tcW w:w="993" w:type="dxa"/>
+            <w:vAlign w:val="center"/>
+          </w:tcPr>
+          <w:p>
+            <w:pPr>
+              <w:pStyle w:val="Normlntext"/>
+              <w:ind w:firstLine="0"/>
+              <w:jc w:val="center"/>
+            </w:pPr>
+            <w:r>
+              <w:t>3,3V</w:t>
+            </w:r>
+          </w:p>
+        </w:tc>
+        <w:tc>
+          <w:tcPr>
+            <w:tcW w:w="1134" w:type="dxa"/>
+            <w:tcBorders>
+              <w:top w:val="single" w:sz="4" w:space="0" w:color="auto"/>
+              <w:bottom w:val="single" w:sz="12" w:space="0" w:color="auto"/>
+              <w:tl2br w:val="nil"/>
+              <w:tr2bl w:val="nil"/>
+            </w:tcBorders>
+            <w:vAlign w:val="center"/>
+          </w:tcPr>
+          <w:p>
+            <w:pPr>
+              <w:pStyle w:val="Normlntext"/>
+              <w:ind w:firstLine="0"/>
+              <w:jc w:val="center"/>
+            </w:pPr>
+            <w:r>
+              <w:t>SPI</w:t>
+            </w:r>
+          </w:p>
+        </w:tc>
+        <w:tc>
+          <w:tcPr>
+            <w:tcW w:w="1417" w:type="dxa"/>
+            <w:vAlign w:val="center"/>
+          </w:tcPr>
+          <w:p>
+            <w:pPr>
+              <w:pStyle w:val="Normlntext"/>
+              <w:ind w:firstLine="0"/>
+              <w:jc w:val="center"/>
+            </w:pPr>
+            <w:r>
+              <w:t>1310 Kč</w:t>
+            </w:r>
+          </w:p>
+        </w:tc>
+        <w:tc>
+          <w:tcPr>
+            <w:tcW w:w="2126" w:type="dxa"/>
+            <w:vAlign w:val="center"/>
+          </w:tcPr>
+          <w:p>
+            <w:pPr>
+              <w:pStyle w:val="Normlntext"/>
+              <w:ind w:firstLine="0"/>
+              <w:jc w:val="center"/>
+            </w:pPr>
+            <w:r>
+              <w:t>Mouser.com</w:t>
+            </w:r>
+          </w:p>
+        </w:tc>
+      </w:tr>
     </w:tbl>
     <w:p>
       <w:pPr>
@@ -5124,7 +5861,7 @@
         </w:pBdr>
         <w:ind w:left="431"/>
       </w:pPr>
-      <w:bookmarkStart w:id="13" w:name="_Toc231405569"/>
+      <w:bookmarkStart w:id="14" w:name="_Toc231411328"/>
       <w:r>
         <w:lastRenderedPageBreak/>
         <w:t>Praktická</w:t>
@@ -5132,14 +5869,22 @@
       <w:r>
         <w:t xml:space="preserve"> část</w:t>
       </w:r>
-      <w:bookmarkEnd w:id="13"/>
+      <w:bookmarkEnd w:id="14"/>
     </w:p>
     <w:p>
       <w:pPr>
         <w:pStyle w:val="Normlntext"/>
       </w:pPr>
       <w:r>
-        <w:t>Praktická část práce popisuje postup realizace projektu od prvotního průzkumu až po sestavení a otestování prvního prototypu. Jednotlivé kroky jsou řazeny chronologicky podle průběhu práce v období od září do prosince. V této části je popsán návrh řešení, jeho realizace a základní funkčnost výsledného zařízení.</w:t>
+        <w:t xml:space="preserve">Praktická část práce popisuje postup realizace projektu od prvotního průzkumu až po vývoj a testování jednotlivých částí systému. Jednotlivé kroky jsou řazeny podle průběhu vývoje projektu během školního roku. V této části je popsán návrh řešení, realizace prvního prototypu, vývoj lokalizačních kotev využívajících technologii UWB, návrh vlastní desky plošných spojů, vývoj serverové části systému a testovacího prostředí </w:t>
+      </w:r>
+      <w:proofErr w:type="spellStart"/>
+      <w:r>
+        <w:t>Playground</w:t>
+      </w:r>
+      <w:proofErr w:type="spellEnd"/>
+      <w:r>
+        <w:t>. Součástí kapitoly je také popis identifikovaných problémů a jejich řešení v průběhu vývoje projektu.</w:t>
       </w:r>
     </w:p>
     <w:p>
@@ -5149,11 +5894,11 @@
           <w:bottom w:val="single" w:sz="4" w:space="1" w:color="FFE79B"/>
         </w:pBdr>
       </w:pPr>
-      <w:bookmarkStart w:id="14" w:name="_Toc231405570"/>
+      <w:bookmarkStart w:id="15" w:name="_Toc231411329"/>
       <w:r>
         <w:t>Návrhy</w:t>
       </w:r>
-      <w:bookmarkEnd w:id="14"/>
+      <w:bookmarkEnd w:id="15"/>
     </w:p>
     <w:p>
       <w:pPr>
@@ -5248,8 +5993,8 @@
       <w:pPr>
         <w:pStyle w:val="Titulek"/>
       </w:pPr>
-      <w:bookmarkStart w:id="15" w:name="_Toc219099615"/>
-      <w:bookmarkStart w:id="16" w:name="_Toc219385193"/>
+      <w:bookmarkStart w:id="16" w:name="_Toc219099615"/>
+      <w:bookmarkStart w:id="17" w:name="_Toc231411260"/>
       <w:r>
         <w:t xml:space="preserve">Obrázek </w:t>
       </w:r>
@@ -5277,8 +6022,8 @@
       <w:r>
         <w:t>: Blokové Schéma</w:t>
       </w:r>
-      <w:bookmarkEnd w:id="15"/>
       <w:bookmarkEnd w:id="16"/>
+      <w:bookmarkEnd w:id="17"/>
     </w:p>
     <w:p>
       <w:pPr>
@@ -5305,13 +6050,13 @@
           <w:bottom w:val="single" w:sz="4" w:space="1" w:color="FFE79B"/>
         </w:pBdr>
       </w:pPr>
-      <w:bookmarkStart w:id="17" w:name="_Toc231405571"/>
+      <w:bookmarkStart w:id="18" w:name="_Toc231411330"/>
       <w:proofErr w:type="spellStart"/>
       <w:r>
         <w:lastRenderedPageBreak/>
         <w:t>Produktizace</w:t>
       </w:r>
-      <w:bookmarkEnd w:id="17"/>
+      <w:bookmarkEnd w:id="18"/>
       <w:proofErr w:type="spellEnd"/>
     </w:p>
     <w:p>
@@ -5321,17 +6066,17 @@
       <w:r>
         <w:t>V této části projektu byla zahájena praktická realizace navrženého řešení. Po dokončení teoretické přípravy a výběru vhodných komponent došlo k jejich objednání a následně k postupnému sestavení a testování jednotlivých částí zařízení. Cílem této fáze bylo ověřit funkčnost zvolených komponent v praxi a sestavit první funkční prototyp zařízení.</w:t>
       </w:r>
-      <w:bookmarkStart w:id="18" w:name="_Toc219288817"/>
+      <w:bookmarkStart w:id="19" w:name="_Toc219288817"/>
     </w:p>
     <w:p>
       <w:pPr>
         <w:pStyle w:val="Nadpis3"/>
       </w:pPr>
-      <w:bookmarkStart w:id="19" w:name="_Toc231405572"/>
+      <w:bookmarkStart w:id="20" w:name="_Toc231411331"/>
       <w:r>
         <w:t>Objednání a příprava komponent</w:t>
       </w:r>
-      <w:bookmarkEnd w:id="19"/>
+      <w:bookmarkEnd w:id="20"/>
     </w:p>
     <w:p>
       <w:pPr>
@@ -5353,11 +6098,11 @@
       <w:pPr>
         <w:pStyle w:val="Nadpis3"/>
       </w:pPr>
-      <w:bookmarkStart w:id="20" w:name="_Toc231405573"/>
+      <w:bookmarkStart w:id="21" w:name="_Toc231411332"/>
       <w:r>
         <w:t>Sestavení a testování napájecí části</w:t>
       </w:r>
-      <w:bookmarkEnd w:id="20"/>
+      <w:bookmarkEnd w:id="21"/>
     </w:p>
     <w:p>
       <w:pPr>
@@ -5379,11 +6124,11 @@
       <w:pPr>
         <w:pStyle w:val="Nadpis3"/>
       </w:pPr>
-      <w:bookmarkStart w:id="21" w:name="_Toc231405574"/>
+      <w:bookmarkStart w:id="22" w:name="_Toc231411333"/>
       <w:r>
         <w:t>Oživení mikrokontroléru</w:t>
       </w:r>
-      <w:bookmarkEnd w:id="21"/>
+      <w:bookmarkEnd w:id="22"/>
     </w:p>
     <w:p>
       <w:pPr>
@@ -5413,12 +6158,12 @@
       <w:pPr>
         <w:pStyle w:val="Nadpis3"/>
       </w:pPr>
-      <w:bookmarkStart w:id="22" w:name="_Toc231405575"/>
+      <w:bookmarkStart w:id="23" w:name="_Toc231411334"/>
       <w:r>
         <w:lastRenderedPageBreak/>
         <w:t>Zapojení a testování senzorů</w:t>
       </w:r>
-      <w:bookmarkEnd w:id="22"/>
+      <w:bookmarkEnd w:id="23"/>
     </w:p>
     <w:p>
       <w:pPr>
@@ -5448,11 +6193,11 @@
       <w:pPr>
         <w:pStyle w:val="Nadpis3"/>
       </w:pPr>
-      <w:bookmarkStart w:id="23" w:name="_Toc231405576"/>
+      <w:bookmarkStart w:id="24" w:name="_Toc231411335"/>
       <w:r>
         <w:t>Sestavení prvního prototypu</w:t>
       </w:r>
-      <w:bookmarkEnd w:id="23"/>
+      <w:bookmarkEnd w:id="24"/>
     </w:p>
     <w:p>
       <w:pPr>
@@ -5474,11 +6219,11 @@
       <w:pPr>
         <w:pStyle w:val="Nadpis3"/>
       </w:pPr>
-      <w:bookmarkStart w:id="24" w:name="_Toc231405577"/>
+      <w:bookmarkStart w:id="25" w:name="_Toc231411336"/>
       <w:r>
         <w:t>Vyhodnocení funkčnosti prototypu</w:t>
       </w:r>
-      <w:bookmarkEnd w:id="24"/>
+      <w:bookmarkEnd w:id="25"/>
     </w:p>
     <w:p>
       <w:pPr>
@@ -5500,7 +6245,7 @@
           <w:docGrid w:linePitch="360"/>
         </w:sectPr>
       </w:pPr>
-      <w:bookmarkStart w:id="25" w:name="_Toc219099616"/>
+      <w:bookmarkStart w:id="26" w:name="_Toc219099616"/>
       <w:r>
         <w:rPr>
           <w:noProof/>
@@ -5635,7 +6380,7 @@
           </wp:anchor>
         </w:drawing>
       </w:r>
-      <w:bookmarkEnd w:id="25"/>
+      <w:bookmarkEnd w:id="26"/>
       <w:r>
         <w:t>Během testování se objevily drobné problémy související zejména se zapojením a laděním jednotlivých částí systému. Jejich řešení však přispělo k získání cenných praktických zkušeností a pomohlo lépe pochopit principy návrhu a realizace vestavěných zařízení.</w:t>
       </w:r>
@@ -5644,8 +6389,8 @@
       <w:pPr>
         <w:pStyle w:val="Titulek"/>
       </w:pPr>
-      <w:bookmarkStart w:id="26" w:name="_Toc219385194"/>
-      <w:bookmarkEnd w:id="18"/>
+      <w:bookmarkStart w:id="27" w:name="_Toc231411261"/>
+      <w:bookmarkEnd w:id="19"/>
       <w:r>
         <w:t xml:space="preserve">Obrázek </w:t>
       </w:r>
@@ -5673,13 +6418,13 @@
       <w:r>
         <w:t>: Reálné zapojení</w:t>
       </w:r>
-      <w:bookmarkEnd w:id="26"/>
+      <w:bookmarkEnd w:id="27"/>
     </w:p>
     <w:p>
       <w:pPr>
         <w:pStyle w:val="Titulek"/>
       </w:pPr>
-      <w:bookmarkStart w:id="27" w:name="_Toc219385195"/>
+      <w:bookmarkStart w:id="28" w:name="_Toc231411262"/>
       <w:r>
         <w:t xml:space="preserve">Obrázek </w:t>
       </w:r>
@@ -5707,7 +6452,7 @@
       <w:r>
         <w:t>: 1. zkouška zapojení</w:t>
       </w:r>
-      <w:bookmarkEnd w:id="27"/>
+      <w:bookmarkEnd w:id="28"/>
     </w:p>
     <w:p>
       <w:pPr>
@@ -5732,6 +6477,18 @@
     <w:p>
       <w:pPr>
         <w:pStyle w:val="Normlntext"/>
+        <w:sectPr>
+          <w:type w:val="continuous"/>
+          <w:pgSz w:w="11906" w:h="16838"/>
+          <w:pgMar w:top="1417" w:right="1417" w:bottom="1417" w:left="1417" w:header="850" w:footer="680" w:gutter="0"/>
+          <w:cols w:space="708"/>
+          <w:docGrid w:linePitch="360"/>
+        </w:sectPr>
+      </w:pPr>
+    </w:p>
+    <w:p>
+      <w:pPr>
+        <w:pStyle w:val="Normlntext"/>
       </w:pPr>
       <w:r>
         <w:lastRenderedPageBreak/>
@@ -5747,7 +6504,68 @@
           <w:noProof/>
         </w:rPr>
         <w:drawing>
-          <wp:anchor distT="0" distB="0" distL="114300" distR="114300" simplePos="0" relativeHeight="251667456" behindDoc="0" locked="0" layoutInCell="1" allowOverlap="1" wp14:anchorId="20688942" wp14:editId="63B69A84">
+          <wp:anchor distT="0" distB="0" distL="114300" distR="114300" simplePos="0" relativeHeight="251666432" behindDoc="0" locked="0" layoutInCell="1" allowOverlap="1" wp14:anchorId="78037A09" wp14:editId="4EB5B3A2">
+            <wp:simplePos x="0" y="0"/>
+            <wp:positionH relativeFrom="column">
+              <wp:posOffset>3140710</wp:posOffset>
+            </wp:positionH>
+            <wp:positionV relativeFrom="paragraph">
+              <wp:posOffset>638175</wp:posOffset>
+            </wp:positionV>
+            <wp:extent cx="2108200" cy="2811780"/>
+            <wp:effectExtent l="0" t="0" r="6350" b="7620"/>
+            <wp:wrapTopAndBottom/>
+            <wp:docPr id="1885194172" name="Picture 3"/>
+            <wp:cNvGraphicFramePr>
+              <a:graphicFrameLocks xmlns:a="http://schemas.openxmlformats.org/drawingml/2006/main" noChangeAspect="1"/>
+            </wp:cNvGraphicFramePr>
+            <a:graphic xmlns:a="http://schemas.openxmlformats.org/drawingml/2006/main">
+              <a:graphicData uri="http://schemas.openxmlformats.org/drawingml/2006/picture">
+                <pic:pic xmlns:pic="http://schemas.openxmlformats.org/drawingml/2006/picture">
+                  <pic:nvPicPr>
+                    <pic:cNvPr id="0" name="Picture 2"/>
+                    <pic:cNvPicPr>
+                      <a:picLocks noChangeAspect="1" noChangeArrowheads="1"/>
+                    </pic:cNvPicPr>
+                  </pic:nvPicPr>
+                  <pic:blipFill>
+                    <a:blip r:embed="rId19" cstate="print">
+                      <a:extLst>
+                        <a:ext uri="{28A0092B-C50C-407E-A947-70E740481C1C}">
+                          <a14:useLocalDpi xmlns:a14="http://schemas.microsoft.com/office/drawing/2010/main" val="0"/>
+                        </a:ext>
+                      </a:extLst>
+                    </a:blip>
+                    <a:srcRect/>
+                    <a:stretch>
+                      <a:fillRect/>
+                    </a:stretch>
+                  </pic:blipFill>
+                  <pic:spPr bwMode="auto">
+                    <a:xfrm>
+                      <a:off x="0" y="0"/>
+                      <a:ext cx="2108200" cy="2811780"/>
+                    </a:xfrm>
+                    <a:prstGeom prst="rect">
+                      <a:avLst/>
+                    </a:prstGeom>
+                    <a:noFill/>
+                    <a:ln>
+                      <a:noFill/>
+                    </a:ln>
+                  </pic:spPr>
+                </pic:pic>
+              </a:graphicData>
+            </a:graphic>
+          </wp:anchor>
+        </w:drawing>
+      </w:r>
+      <w:r>
+        <w:rPr>
+          <w:noProof/>
+        </w:rPr>
+        <w:drawing>
+          <wp:anchor distT="0" distB="0" distL="114300" distR="114300" simplePos="0" relativeHeight="251667456" behindDoc="0" locked="0" layoutInCell="1" allowOverlap="1" wp14:anchorId="20688942" wp14:editId="7466EBC3">
             <wp:simplePos x="0" y="0"/>
             <wp:positionH relativeFrom="column">
               <wp:posOffset>14605</wp:posOffset>
@@ -5772,7 +6590,7 @@
                     </pic:cNvPicPr>
                   </pic:nvPicPr>
                   <pic:blipFill>
-                    <a:blip r:embed="rId19" cstate="print">
+                    <a:blip r:embed="rId20" cstate="print">
                       <a:extLst>
                         <a:ext uri="{28A0092B-C50C-407E-A947-70E740481C1C}">
                           <a14:useLocalDpi xmlns:a14="http://schemas.microsoft.com/office/drawing/2010/main" val="0"/>
@@ -5810,22 +6628,268 @@
         </w:drawing>
       </w:r>
       <w:r>
-        <w:rPr>
-          <w:noProof/>
-        </w:rPr>
+        <w:t>Součástí této fáze bylo také řešení drobných problémů, které se objevily během testování, a úpravy zapojení a softwaru. Na základě těchto kroků byla postupně ověřena funkčnost celého zařízení jako prototypu splňujícího požadavky zadání ročníkové práce.</w:t>
+      </w:r>
+    </w:p>
+    <w:p>
+      <w:pPr>
+        <w:pStyle w:val="Titulek"/>
+        <w:sectPr>
+          <w:type w:val="continuous"/>
+          <w:pgSz w:w="11906" w:h="16838"/>
+          <w:pgMar w:top="1417" w:right="1417" w:bottom="1417" w:left="1417" w:header="850" w:footer="680" w:gutter="0"/>
+          <w:cols w:space="708"/>
+          <w:docGrid w:linePitch="360"/>
+        </w:sectPr>
+      </w:pPr>
+    </w:p>
+    <w:p>
+      <w:pPr>
+        <w:pStyle w:val="Titulek"/>
+      </w:pPr>
+      <w:bookmarkStart w:id="29" w:name="_Toc231411263"/>
+      <w:r>
+        <w:t xml:space="preserve">Obrázek </w:t>
+      </w:r>
+      <w:r>
+        <w:fldChar w:fldCharType="begin"/>
+      </w:r>
+      <w:r>
+        <w:instrText xml:space="preserve"> SEQ Obrázek \* ARABIC </w:instrText>
+      </w:r>
+      <w:r>
+        <w:fldChar w:fldCharType="separate"/>
+      </w:r>
+      <w:r>
+        <w:rPr>
+          <w:noProof/>
+        </w:rPr>
+        <w:t>5</w:t>
+      </w:r>
+      <w:r>
+        <w:fldChar w:fldCharType="end"/>
+      </w:r>
+      <w:r>
+        <w:t>: Prezentační prototyp</w:t>
+      </w:r>
+      <w:bookmarkEnd w:id="29"/>
+    </w:p>
+    <w:p>
+      <w:pPr>
+        <w:pStyle w:val="Titulek"/>
+      </w:pPr>
+      <w:bookmarkStart w:id="30" w:name="_Toc231411264"/>
+      <w:r>
+        <w:t xml:space="preserve">Obrázek </w:t>
+      </w:r>
+      <w:r>
+        <w:fldChar w:fldCharType="begin"/>
+      </w:r>
+      <w:r>
+        <w:instrText xml:space="preserve"> SEQ Obrázek \* ARABIC </w:instrText>
+      </w:r>
+      <w:r>
+        <w:fldChar w:fldCharType="separate"/>
+      </w:r>
+      <w:r>
+        <w:rPr>
+          <w:noProof/>
+        </w:rPr>
+        <w:t>6</w:t>
+      </w:r>
+      <w:r>
+        <w:fldChar w:fldCharType="end"/>
+      </w:r>
+      <w:r>
+        <w:t>: Prezentační hůlka</w:t>
+      </w:r>
+      <w:bookmarkEnd w:id="30"/>
+    </w:p>
+    <w:p>
+      <w:pPr>
+        <w:pStyle w:val="Nadpis3"/>
+        <w:sectPr>
+          <w:type w:val="continuous"/>
+          <w:pgSz w:w="11906" w:h="16838"/>
+          <w:pgMar w:top="1417" w:right="1417" w:bottom="1417" w:left="1417" w:header="850" w:footer="680" w:gutter="0"/>
+          <w:cols w:num="2" w:space="708"/>
+          <w:docGrid w:linePitch="360"/>
+        </w:sectPr>
+      </w:pPr>
+    </w:p>
+    <w:p>
+      <w:pPr>
+        <w:pStyle w:val="Nadpis3"/>
+        <w:rPr>
+          <w:sz w:val="26"/>
+          <w:szCs w:val="26"/>
+        </w:rPr>
+      </w:pPr>
+      <w:bookmarkStart w:id="31" w:name="_Toc231411337"/>
+      <w:r>
+        <w:t>Vývoj lokalizačních kotev UWB</w:t>
+      </w:r>
+      <w:bookmarkEnd w:id="31"/>
+    </w:p>
+    <w:p>
+      <w:pPr>
+        <w:pStyle w:val="Normlntext"/>
+      </w:pPr>
+      <w:r>
+        <w:t>Po dokončení první verze prototypu pokračoval vývoj projektu návrhem a realizací lokalizačních kotev využívajících technologii UWB. Tyto kotvy mají v budoucí verzi systému sloužit jako součást lokalizační infrastruktury umožňující určování polohy hráčů v herním prostoru.</w:t>
+      </w:r>
+    </w:p>
+    <w:p>
+      <w:pPr>
+        <w:pStyle w:val="Normlntext"/>
+      </w:pPr>
+      <w:r>
+        <w:t>V únoru byly sestaveny první kotvy obsahující modul DWM3001C a mikrokontrolér ESP32-C6-DevKitM-1. Po osazení jednotlivých součástek bylo nutné připravit také odpovídající firmware, který by umožnil komunikaci mezi kotvami a ostatními částmi systému.</w:t>
+      </w:r>
+    </w:p>
+    <w:p>
+      <w:pPr>
+        <w:pStyle w:val="Normlntext"/>
+      </w:pPr>
+      <w:r>
+        <w:t>Během března probíhal vývoj a úpravy softwarové části projektu. Práce se zaměřovala především na přípravu firmware a vytvoření prostředí potřebného pro následné programování jednotlivých kotev. Současně byly prováděny průběžné kontroly zapojení a příprava testovacího prostředí.</w:t>
+      </w:r>
+    </w:p>
+    <w:p>
+      <w:pPr>
+        <w:pStyle w:val="Normlntext"/>
+      </w:pPr>
+      <w:r>
+        <w:t>V dubnu byly zahájeny první pokusy o programování jednotlivých kotev. Během této fáze byly objeveny problémy související s hardwarem. U některých kotev se nepodařilo firmware nahrát, což vedlo k podrobnější diagnostice. Byly identifikovány chyby v zapojení a také několik poškozených UWB modulů, které nebylo možné úspěšně naprogramovat.</w:t>
+      </w:r>
+    </w:p>
+    <w:p>
+      <w:pPr>
+        <w:jc w:val="left"/>
+      </w:pPr>
+      <w:r>
+        <w:br w:type="page"/>
+      </w:r>
+    </w:p>
+    <w:p>
+      <w:pPr>
+        <w:pStyle w:val="Normlntext"/>
+      </w:pPr>
+      <w:r>
+        <w:lastRenderedPageBreak/>
+        <w:t>V květnu proběhla oprava nefunkčních kotev a následné opakované programování. Po odstranění nalezených závad se podařilo všechny funkční kotvy úspěšně naprogramovat a připravit pro další testování. Firmware byl úspěšně nahrán a kotvy byly uvedeny do stavu připraveného pro integraci s ostatními částmi systému. Kompletní ověření funkčnosti však nebylo možné dokončit z důvodu problémů na straně prototypu hůlky, které jsou popsány v dalších kapitolách dokumentace.</w:t>
+      </w:r>
+    </w:p>
+    <w:p>
+      <w:pPr>
+        <w:pStyle w:val="Nadpis3"/>
+      </w:pPr>
+      <w:bookmarkStart w:id="32" w:name="_Toc231411338"/>
+      <w:r>
+        <w:t>Návrh vlastní desky plošných spojů</w:t>
+      </w:r>
+      <w:bookmarkEnd w:id="32"/>
+    </w:p>
+    <w:p>
+      <w:pPr>
+        <w:pStyle w:val="Normlntext"/>
+      </w:pPr>
+      <w:r>
+        <w:t>S rostoucí složitostí projektu začalo být původní zapojení využívající vývojové moduly a propojovací vodiče méně přehledné a obtížně použitelné pro další vývoj. Z tohoto důvodu bylo rozhodnuto o návrhu vlastní desky plošných spojů, která by umožnila integraci všech potřebných komponent do jednoho kompaktního celku.</w:t>
+      </w:r>
+    </w:p>
+    <w:p>
+      <w:pPr>
+        <w:pStyle w:val="Normlntext"/>
+      </w:pPr>
+      <w:r>
+        <w:t xml:space="preserve">Návrh byl realizován v programu </w:t>
+      </w:r>
+      <w:proofErr w:type="spellStart"/>
+      <w:r>
+        <w:t>KiCAD</w:t>
+      </w:r>
+      <w:proofErr w:type="spellEnd"/>
+      <w:r>
+        <w:t>, který umožňuje tvorbu elektrických schémat a následný návrh desek plošných spojů. Prvním krokem bylo vytvoření kompletního elektrického schématu obsahujícího mikrokontrolér, napájecí část, senzory a další součásti systému. Během návrhu bylo nutné ověřovat zapojení jednotlivých komponent pomocí technické dokumentace výrobců a průběžně konzultovat návrh s vedoucím projektu.</w:t>
+      </w:r>
+    </w:p>
+    <w:p>
+      <w:pPr>
+        <w:pStyle w:val="Normlntext"/>
+      </w:pPr>
+      <w:r>
+        <w:t xml:space="preserve">Při tvorbě schématu se ukázalo, že některé používané součástky nebyly dostupné v knihovnách programu. Z tohoto důvodu bylo nutné vytvořit vlastní </w:t>
+      </w:r>
+      <w:proofErr w:type="spellStart"/>
+      <w:r>
+        <w:t>footprinty</w:t>
+      </w:r>
+      <w:proofErr w:type="spellEnd"/>
+      <w:r>
+        <w:t xml:space="preserve"> podle rozměrů uvedených v </w:t>
+      </w:r>
+      <w:proofErr w:type="spellStart"/>
+      <w:r>
+        <w:t>datasheetech</w:t>
+      </w:r>
+      <w:proofErr w:type="spellEnd"/>
+      <w:r>
+        <w:t xml:space="preserve"> výrobců. Před jejich vytvořením byla provedena kontrola rozměrů a ověření rozmístění vývodů jednotlivých součástek, aby bylo možné zajistit správné osazení výsledné desky.</w:t>
+      </w:r>
+    </w:p>
+    <w:p>
+      <w:pPr>
+        <w:pStyle w:val="Normlntext"/>
+      </w:pPr>
+      <w:r>
+        <w:t>Po dokončení elektrického schématu následoval návrh samotné desky plošných spojů. Součástky byly rozmístěny s ohledem na plánované mechanické uspořádání hůlky, délku spojů a požadavky jednotlivých komponent. Následně byly vytvořeny jednotlivé spoje a provedena kontrola návrhu.</w:t>
+      </w:r>
+    </w:p>
+    <w:p>
+      <w:pPr>
+        <w:pStyle w:val="Normlntext"/>
+      </w:pPr>
+      <w:r>
+        <w:t>Po dokončení návrhu byly vygenerovány výrobní podklady ve formátu Gerber a odeslány výrobci PCB. Vlastní deska plošných spojů představuje důležitý krok směrem k finální podobě zařízení, protože umožňuje nahradit původní prototyp sestavený z vývojových modulů kompaktnějším a spolehlivějším řešením.</w:t>
+      </w:r>
+    </w:p>
+    <w:p>
+      <w:pPr>
+        <w:pStyle w:val="Normlntext"/>
+        <w:ind w:firstLine="0"/>
+        <w:sectPr>
+          <w:type w:val="continuous"/>
+          <w:pgSz w:w="11906" w:h="16838"/>
+          <w:pgMar w:top="1417" w:right="1417" w:bottom="1417" w:left="1417" w:header="850" w:footer="680" w:gutter="0"/>
+          <w:cols w:space="708"/>
+          <w:docGrid w:linePitch="360"/>
+        </w:sectPr>
+      </w:pPr>
+    </w:p>
+    <w:p>
+      <w:pPr>
+        <w:pStyle w:val="Normlntext"/>
+        <w:ind w:firstLine="0"/>
+      </w:pPr>
+      <w:r>
+        <w:rPr>
+          <w:noProof/>
+        </w:rPr>
+        <w:lastRenderedPageBreak/>
         <w:drawing>
-          <wp:anchor distT="0" distB="0" distL="114300" distR="114300" simplePos="0" relativeHeight="251666432" behindDoc="0" locked="0" layoutInCell="1" allowOverlap="1" wp14:anchorId="78037A09" wp14:editId="402113B7">
+          <wp:anchor distT="0" distB="0" distL="114300" distR="114300" simplePos="0" relativeHeight="251671552" behindDoc="0" locked="0" layoutInCell="1" allowOverlap="1" wp14:anchorId="1352D36F" wp14:editId="5F4A352D">
             <wp:simplePos x="0" y="0"/>
             <wp:positionH relativeFrom="column">
-              <wp:posOffset>3588385</wp:posOffset>
+              <wp:posOffset>-13946</wp:posOffset>
             </wp:positionH>
             <wp:positionV relativeFrom="paragraph">
-              <wp:posOffset>638175</wp:posOffset>
+              <wp:posOffset>0</wp:posOffset>
             </wp:positionV>
-            <wp:extent cx="2108200" cy="2811780"/>
-            <wp:effectExtent l="0" t="0" r="6350" b="7620"/>
-            <wp:wrapTopAndBottom/>
-            <wp:docPr id="1885194172" name="Picture 3"/>
+            <wp:extent cx="5305425" cy="3759852"/>
+            <wp:effectExtent l="0" t="0" r="0" b="0"/>
+            <wp:wrapSquare wrapText="bothSides"/>
+            <wp:docPr id="2147020723" name="Obrázek 2"/>
             <wp:cNvGraphicFramePr>
               <a:graphicFrameLocks xmlns:a="http://schemas.openxmlformats.org/drawingml/2006/main" noChangeAspect="1"/>
             </wp:cNvGraphicFramePr>
@@ -5833,13 +6897,13 @@
               <a:graphicData uri="http://schemas.openxmlformats.org/drawingml/2006/picture">
                 <pic:pic xmlns:pic="http://schemas.openxmlformats.org/drawingml/2006/picture">
                   <pic:nvPicPr>
-                    <pic:cNvPr id="0" name="Picture 2"/>
+                    <pic:cNvPr id="0" name="Picture 1"/>
                     <pic:cNvPicPr>
                       <a:picLocks noChangeAspect="1" noChangeArrowheads="1"/>
                     </pic:cNvPicPr>
                   </pic:nvPicPr>
                   <pic:blipFill>
-                    <a:blip r:embed="rId20" cstate="print">
+                    <a:blip r:embed="rId21" cstate="print">
                       <a:extLst>
                         <a:ext uri="{28A0092B-C50C-407E-A947-70E740481C1C}">
                           <a14:useLocalDpi xmlns:a14="http://schemas.microsoft.com/office/drawing/2010/main" val="0"/>
@@ -5854,7 +6918,7 @@
                   <pic:spPr bwMode="auto">
                     <a:xfrm>
                       <a:off x="0" y="0"/>
-                      <a:ext cx="2108200" cy="2811780"/>
+                      <a:ext cx="5305425" cy="3759852"/>
                     </a:xfrm>
                     <a:prstGeom prst="rect">
                       <a:avLst/>
@@ -5870,34 +6934,6 @@
           </wp:anchor>
         </w:drawing>
       </w:r>
-      <w:r>
-        <w:t>Součástí této fáze bylo také řešení drobných problémů, které se objevily během testování, a úpravy zapojení a softwaru. Na základě těchto kroků byla postupně ověřena funkčnost celého zařízení jako prototypu splňujícího požadavky zadání ročníkové práce.</w:t>
-      </w:r>
-    </w:p>
-    <w:p>
-      <w:pPr>
-        <w:pStyle w:val="Titulek"/>
-        <w:sectPr>
-          <w:type w:val="continuous"/>
-          <w:pgSz w:w="11906" w:h="16838"/>
-          <w:pgMar w:top="1417" w:right="1417" w:bottom="1417" w:left="1417" w:header="850" w:footer="680" w:gutter="0"/>
-          <w:cols w:space="708"/>
-          <w:docGrid w:linePitch="360"/>
-        </w:sectPr>
-      </w:pPr>
-    </w:p>
-    <w:p>
-      <w:pPr>
-        <w:pStyle w:val="Titulek"/>
-      </w:pPr>
-      <w:bookmarkStart w:id="28" w:name="_Toc219288819"/>
-      <w:r>
-        <w:t>Obrázek 5</w:t>
-      </w:r>
-      <w:r>
-        <w:t>: Prezentační prototyp</w:t>
-      </w:r>
-      <w:bookmarkEnd w:id="28"/>
     </w:p>
     <w:p>
       <w:pPr>
@@ -5910,31 +6946,707 @@
           <w:docGrid w:linePitch="360"/>
         </w:sectPr>
       </w:pPr>
-      <w:r>
-        <w:tab/>
-      </w:r>
-      <w:bookmarkStart w:id="29" w:name="_Toc219288820"/>
-      <w:r>
-        <w:t>Obrázek 6</w:t>
-      </w:r>
-      <w:r>
-        <w:t>: Prezentační hůlka</w:t>
-      </w:r>
-      <w:bookmarkEnd w:id="29"/>
-    </w:p>
-    <w:p/>
+    </w:p>
+    <w:p>
+      <w:pPr>
+        <w:pStyle w:val="Titulek"/>
+      </w:pPr>
+      <w:bookmarkStart w:id="33" w:name="_Toc231411265"/>
+      <w:r>
+        <w:rPr>
+          <w:noProof/>
+        </w:rPr>
+        <w:drawing>
+          <wp:anchor distT="0" distB="0" distL="114300" distR="114300" simplePos="0" relativeHeight="251672576" behindDoc="0" locked="0" layoutInCell="1" allowOverlap="1" wp14:anchorId="191E8EBD" wp14:editId="40479435">
+            <wp:simplePos x="0" y="0"/>
+            <wp:positionH relativeFrom="column">
+              <wp:posOffset>-16510</wp:posOffset>
+            </wp:positionH>
+            <wp:positionV relativeFrom="paragraph">
+              <wp:posOffset>193040</wp:posOffset>
+            </wp:positionV>
+            <wp:extent cx="5753100" cy="1343025"/>
+            <wp:effectExtent l="0" t="0" r="0" b="9525"/>
+            <wp:wrapSquare wrapText="bothSides"/>
+            <wp:docPr id="843562221" name="Obrázek 3"/>
+            <wp:cNvGraphicFramePr>
+              <a:graphicFrameLocks xmlns:a="http://schemas.openxmlformats.org/drawingml/2006/main" noChangeAspect="1"/>
+            </wp:cNvGraphicFramePr>
+            <a:graphic xmlns:a="http://schemas.openxmlformats.org/drawingml/2006/main">
+              <a:graphicData uri="http://schemas.openxmlformats.org/drawingml/2006/picture">
+                <pic:pic xmlns:pic="http://schemas.openxmlformats.org/drawingml/2006/picture">
+                  <pic:nvPicPr>
+                    <pic:cNvPr id="0" name="Picture 2"/>
+                    <pic:cNvPicPr>
+                      <a:picLocks noChangeAspect="1" noChangeArrowheads="1"/>
+                    </pic:cNvPicPr>
+                  </pic:nvPicPr>
+                  <pic:blipFill>
+                    <a:blip r:embed="rId22" cstate="print">
+                      <a:extLst>
+                        <a:ext uri="{28A0092B-C50C-407E-A947-70E740481C1C}">
+                          <a14:useLocalDpi xmlns:a14="http://schemas.microsoft.com/office/drawing/2010/main" val="0"/>
+                        </a:ext>
+                      </a:extLst>
+                    </a:blip>
+                    <a:srcRect/>
+                    <a:stretch>
+                      <a:fillRect/>
+                    </a:stretch>
+                  </pic:blipFill>
+                  <pic:spPr bwMode="auto">
+                    <a:xfrm>
+                      <a:off x="0" y="0"/>
+                      <a:ext cx="5753100" cy="1343025"/>
+                    </a:xfrm>
+                    <a:prstGeom prst="rect">
+                      <a:avLst/>
+                    </a:prstGeom>
+                    <a:noFill/>
+                    <a:ln>
+                      <a:noFill/>
+                    </a:ln>
+                  </pic:spPr>
+                </pic:pic>
+              </a:graphicData>
+            </a:graphic>
+          </wp:anchor>
+        </w:drawing>
+      </w:r>
+      <w:r>
+        <w:t xml:space="preserve">Obrázek </w:t>
+      </w:r>
+      <w:r>
+        <w:fldChar w:fldCharType="begin"/>
+      </w:r>
+      <w:r>
+        <w:instrText xml:space="preserve"> SEQ Obrázek \* ARABIC </w:instrText>
+      </w:r>
+      <w:r>
+        <w:fldChar w:fldCharType="separate"/>
+      </w:r>
+      <w:r>
+        <w:rPr>
+          <w:noProof/>
+        </w:rPr>
+        <w:t>7</w:t>
+      </w:r>
+      <w:r>
+        <w:fldChar w:fldCharType="end"/>
+      </w:r>
+      <w:r>
+        <w:t xml:space="preserve">: Návrh PCB v programu </w:t>
+      </w:r>
+      <w:proofErr w:type="spellStart"/>
+      <w:r>
+        <w:t>KiCAD</w:t>
+      </w:r>
+      <w:bookmarkEnd w:id="33"/>
+      <w:proofErr w:type="spellEnd"/>
+    </w:p>
+    <w:p>
+      <w:pPr>
+        <w:pStyle w:val="Titulek"/>
+      </w:pPr>
+      <w:bookmarkStart w:id="34" w:name="_Toc231411266"/>
+      <w:r>
+        <w:t xml:space="preserve">Obrázek </w:t>
+      </w:r>
+      <w:r>
+        <w:fldChar w:fldCharType="begin"/>
+      </w:r>
+      <w:r>
+        <w:instrText xml:space="preserve"> SEQ Obrázek \* ARABIC </w:instrText>
+      </w:r>
+      <w:r>
+        <w:fldChar w:fldCharType="separate"/>
+      </w:r>
+      <w:r>
+        <w:rPr>
+          <w:noProof/>
+        </w:rPr>
+        <w:t>8</w:t>
+      </w:r>
+      <w:r>
+        <w:fldChar w:fldCharType="end"/>
+      </w:r>
+      <w:r>
+        <w:t>: Náhled PCB</w:t>
+      </w:r>
+      <w:bookmarkEnd w:id="34"/>
+    </w:p>
+    <w:p>
+      <w:pPr>
+        <w:pStyle w:val="Nadpis3"/>
+        <w:sectPr>
+          <w:type w:val="continuous"/>
+          <w:pgSz w:w="11906" w:h="16838"/>
+          <w:pgMar w:top="1417" w:right="1417" w:bottom="1417" w:left="1417" w:header="850" w:footer="680" w:gutter="0"/>
+          <w:cols w:space="708"/>
+          <w:docGrid w:linePitch="360"/>
+        </w:sectPr>
+      </w:pPr>
+    </w:p>
+    <w:p>
+      <w:pPr>
+        <w:pStyle w:val="Nadpis3"/>
+      </w:pPr>
+      <w:bookmarkStart w:id="35" w:name="_Toc231411339"/>
+      <w:r>
+        <w:t xml:space="preserve">Vývoj </w:t>
+      </w:r>
+      <w:proofErr w:type="spellStart"/>
+      <w:r>
+        <w:t>gateway</w:t>
+      </w:r>
+      <w:proofErr w:type="spellEnd"/>
+      <w:r>
+        <w:t xml:space="preserve"> serveru a administračního rozhraní</w:t>
+      </w:r>
+      <w:bookmarkEnd w:id="35"/>
+    </w:p>
+    <w:p>
+      <w:pPr>
+        <w:pStyle w:val="Normlntext"/>
+      </w:pPr>
+      <w:r>
+        <w:t xml:space="preserve">Součástí dalšího vývoje projektu bylo vytvoření </w:t>
+      </w:r>
+      <w:proofErr w:type="spellStart"/>
+      <w:r>
+        <w:t>gateway</w:t>
+      </w:r>
+      <w:proofErr w:type="spellEnd"/>
+      <w:r>
+        <w:t xml:space="preserve"> serveru a webového administračního rozhraní, které slouží pro správu jednotlivých částí systému Laser Wand. Cílem bylo vytvořit centralizované prostředí umožňující sledování stavu zařízení, konfiguraci herního systému a testování jednotlivých funkcí bez nutnosti přímého zásahu do zdrojového kódu.</w:t>
+      </w:r>
+    </w:p>
+    <w:p>
+      <w:pPr>
+        <w:pStyle w:val="Normlntext"/>
+      </w:pPr>
+      <w:r>
+        <w:t>Vytvořené administrační rozhraní poskytuje přehled o stavu serveru, připojených uživatelích, hůlkách a lokalizačních kotvách. Součástí systému jsou také nástroje pro správu her, konfiguraci herních parametrů a sledování jednotlivých komponent systému. Díky webovému rozhraní lze většinu operací provádět vzdáleně prostřednictvím internetového prohlížeče.</w:t>
+      </w:r>
+    </w:p>
+    <w:p>
+      <w:pPr>
+        <w:pStyle w:val="Normlntext"/>
+      </w:pPr>
+      <w:r>
+        <w:t>Při návrhu rozhraní byl kladen důraz na přehlednost a jednoduché ovládání. Jednotlivé funkce byly rozděleny do samostatných sekcí, které umožňují rychlý přístup ke správě her, zařízení a testovacích nástrojů. Součástí rozhraní je také systém monitorování stavu serveru a připojených komponent.</w:t>
+      </w:r>
+    </w:p>
+    <w:p>
+      <w:pPr>
+        <w:pStyle w:val="Normlntext"/>
+      </w:pPr>
+      <w:r>
+        <w:lastRenderedPageBreak/>
+        <w:t xml:space="preserve">Vytvoření </w:t>
+      </w:r>
+      <w:proofErr w:type="spellStart"/>
+      <w:r>
+        <w:t>gateway</w:t>
+      </w:r>
+      <w:proofErr w:type="spellEnd"/>
+      <w:r>
+        <w:t xml:space="preserve"> serveru představuje důležitý krok pro další rozvoj projektu, protože umožňuje propojení jednotlivých částí systému do jednoho celku a vytváří základ pro budoucí správu herního prostředí Laser Wand.</w:t>
+      </w:r>
+    </w:p>
+    <w:p>
+      <w:pPr>
+        <w:pStyle w:val="Nadpis3"/>
+        <w:sectPr>
+          <w:type w:val="continuous"/>
+          <w:pgSz w:w="11906" w:h="16838"/>
+          <w:pgMar w:top="1417" w:right="1417" w:bottom="1417" w:left="1417" w:header="850" w:footer="680" w:gutter="0"/>
+          <w:cols w:space="708"/>
+          <w:docGrid w:linePitch="360"/>
+        </w:sectPr>
+      </w:pPr>
+    </w:p>
+    <w:p>
+      <w:pPr>
+        <w:pStyle w:val="Nadpis3"/>
+      </w:pPr>
+      <w:bookmarkStart w:id="36" w:name="_Toc231411340"/>
+      <w:r>
+        <w:t xml:space="preserve">Vývoj testovacího prostředí </w:t>
+      </w:r>
+      <w:proofErr w:type="spellStart"/>
+      <w:r>
+        <w:t>Playground</w:t>
+      </w:r>
+      <w:bookmarkEnd w:id="36"/>
+      <w:proofErr w:type="spellEnd"/>
+    </w:p>
+    <w:p>
+      <w:pPr>
+        <w:pStyle w:val="Normlntext"/>
+      </w:pPr>
+      <w:r>
+        <w:t xml:space="preserve">Pro ověřování herních mechanik a testování jednotlivých funkcí systému bylo vytvořeno testovací prostředí nazvané </w:t>
+      </w:r>
+      <w:proofErr w:type="spellStart"/>
+      <w:r>
+        <w:t>Playground</w:t>
+      </w:r>
+      <w:proofErr w:type="spellEnd"/>
+      <w:r>
+        <w:t>. Toto prostředí umožňuje simulovat vybrané části budoucí hry i v době, kdy nebyl k dispozici plně funkční hardware.</w:t>
+      </w:r>
+    </w:p>
+    <w:p>
+      <w:pPr>
+        <w:pStyle w:val="Normlntext"/>
+      </w:pPr>
+      <w:proofErr w:type="spellStart"/>
+      <w:r>
+        <w:t>Playground</w:t>
+      </w:r>
+      <w:proofErr w:type="spellEnd"/>
+      <w:r>
+        <w:t xml:space="preserve"> umožňuje vytváření virtuálních hůlek, správu hráčů a simulaci herních událostí. Součástí systému je také herní mapa obsahující překážky a jednotlivé herní objekty. Testovací prostředí dokáže vyhodnocovat pohyb virtuálních hráčů, zásahy mezi hráči a interakce s překážkami v herním prostoru.</w:t>
+      </w:r>
+    </w:p>
+    <w:p>
+      <w:pPr>
+        <w:pStyle w:val="Normlntext"/>
+      </w:pPr>
+      <w:r>
+        <w:t xml:space="preserve">V rámci </w:t>
+      </w:r>
+      <w:proofErr w:type="spellStart"/>
+      <w:r>
+        <w:t>Playground</w:t>
+      </w:r>
+      <w:proofErr w:type="spellEnd"/>
+      <w:r>
+        <w:t xml:space="preserve"> byl vytvořen také základní systém kouzel a herních akcí. Díky tomu bylo možné testovat logiku budoucí hry ještě před dokončením všech hardwarových částí projektu. Prostředí současně sloužilo jako nástroj pro ověřování návrhu herních mechanik a chování jednotlivých částí systému.</w:t>
+      </w:r>
+    </w:p>
+    <w:p>
+      <w:pPr>
+        <w:pStyle w:val="Normlntext"/>
+      </w:pPr>
+      <w:r>
+        <w:t xml:space="preserve">Vytvoření </w:t>
+      </w:r>
+      <w:proofErr w:type="spellStart"/>
+      <w:r>
+        <w:t>Playgroundu</w:t>
+      </w:r>
+      <w:proofErr w:type="spellEnd"/>
+      <w:r>
+        <w:t xml:space="preserve"> umožnilo pokračovat ve vývoji projektu i v době, kdy nebylo možné provádět kompletní testování pomocí fyzické hůlky. Současně poskytlo prostor pro experimentování s herními funkcemi a budoucí podobou systému Laser Wand.</w:t>
+      </w:r>
+      <w:r>
+        <w:rPr>
+          <w:noProof/>
+        </w:rPr>
+        <w:t xml:space="preserve"> </w:t>
+      </w:r>
+    </w:p>
+    <w:p>
+      <w:pPr>
+        <w:pStyle w:val="Titulek"/>
+      </w:pPr>
+      <w:bookmarkStart w:id="37" w:name="_Toc231411267"/>
+      <w:r>
+        <w:rPr>
+          <w:noProof/>
+        </w:rPr>
+        <w:drawing>
+          <wp:inline distT="0" distB="0" distL="0" distR="0" wp14:anchorId="2433DB26" wp14:editId="746AFB19">
+            <wp:extent cx="5753100" cy="2867025"/>
+            <wp:effectExtent l="0" t="0" r="0" b="9525"/>
+            <wp:docPr id="345791459" name="Obrázek 4"/>
+            <wp:cNvGraphicFramePr>
+              <a:graphicFrameLocks xmlns:a="http://schemas.openxmlformats.org/drawingml/2006/main" noChangeAspect="1"/>
+            </wp:cNvGraphicFramePr>
+            <a:graphic xmlns:a="http://schemas.openxmlformats.org/drawingml/2006/main">
+              <a:graphicData uri="http://schemas.openxmlformats.org/drawingml/2006/picture">
+                <pic:pic xmlns:pic="http://schemas.openxmlformats.org/drawingml/2006/picture">
+                  <pic:nvPicPr>
+                    <pic:cNvPr id="0" name="Picture 3"/>
+                    <pic:cNvPicPr>
+                      <a:picLocks noChangeAspect="1" noChangeArrowheads="1"/>
+                    </pic:cNvPicPr>
+                  </pic:nvPicPr>
+                  <pic:blipFill>
+                    <a:blip r:embed="rId23" cstate="print">
+                      <a:extLst>
+                        <a:ext uri="{28A0092B-C50C-407E-A947-70E740481C1C}">
+                          <a14:useLocalDpi xmlns:a14="http://schemas.microsoft.com/office/drawing/2010/main" val="0"/>
+                        </a:ext>
+                      </a:extLst>
+                    </a:blip>
+                    <a:srcRect/>
+                    <a:stretch>
+                      <a:fillRect/>
+                    </a:stretch>
+                  </pic:blipFill>
+                  <pic:spPr bwMode="auto">
+                    <a:xfrm>
+                      <a:off x="0" y="0"/>
+                      <a:ext cx="5753100" cy="2867025"/>
+                    </a:xfrm>
+                    <a:prstGeom prst="rect">
+                      <a:avLst/>
+                    </a:prstGeom>
+                    <a:noFill/>
+                    <a:ln>
+                      <a:noFill/>
+                    </a:ln>
+                  </pic:spPr>
+                </pic:pic>
+              </a:graphicData>
+            </a:graphic>
+          </wp:inline>
+        </w:drawing>
+      </w:r>
+      <w:r>
+        <w:t xml:space="preserve">Obrázek </w:t>
+      </w:r>
+      <w:r>
+        <w:fldChar w:fldCharType="begin"/>
+      </w:r>
+      <w:r>
+        <w:instrText xml:space="preserve"> SEQ Obrázek \* ARABIC </w:instrText>
+      </w:r>
+      <w:r>
+        <w:fldChar w:fldCharType="separate"/>
+      </w:r>
+      <w:r>
+        <w:rPr>
+          <w:noProof/>
+        </w:rPr>
+        <w:t>9</w:t>
+      </w:r>
+      <w:r>
+        <w:fldChar w:fldCharType="end"/>
+      </w:r>
+      <w:r>
+        <w:t>: Administrativní rozhraní</w:t>
+      </w:r>
+      <w:bookmarkEnd w:id="37"/>
+    </w:p>
     <w:p>
       <w:pPr>
         <w:jc w:val="left"/>
-        <w:rPr>
-          <w:rFonts w:asciiTheme="majorHAnsi" w:eastAsiaTheme="majorEastAsia" w:hAnsiTheme="majorHAnsi" w:cstheme="majorBidi"/>
-          <w:sz w:val="26"/>
-          <w:szCs w:val="26"/>
-        </w:rPr>
+        <w:sectPr>
+          <w:type w:val="continuous"/>
+          <w:pgSz w:w="11906" w:h="16838"/>
+          <w:pgMar w:top="1417" w:right="1417" w:bottom="1417" w:left="1417" w:header="850" w:footer="680" w:gutter="0"/>
+          <w:cols w:space="708"/>
+          <w:docGrid w:linePitch="360"/>
+        </w:sectPr>
+      </w:pPr>
+    </w:p>
+    <w:p>
+      <w:pPr>
+        <w:jc w:val="left"/>
       </w:pPr>
       <w:r>
         <w:br w:type="page"/>
       </w:r>
+    </w:p>
+    <w:p>
+      <w:pPr>
+        <w:pStyle w:val="Titulek"/>
+      </w:pPr>
+      <w:bookmarkStart w:id="38" w:name="_Toc231411268"/>
+      <w:r>
+        <w:rPr>
+          <w:noProof/>
+        </w:rPr>
+        <w:lastRenderedPageBreak/>
+        <w:drawing>
+          <wp:anchor distT="0" distB="0" distL="114300" distR="114300" simplePos="0" relativeHeight="251674624" behindDoc="1" locked="0" layoutInCell="1" allowOverlap="1" wp14:anchorId="3998389E" wp14:editId="5A2A5482">
+            <wp:simplePos x="0" y="0"/>
+            <wp:positionH relativeFrom="column">
+              <wp:posOffset>3281680</wp:posOffset>
+            </wp:positionH>
+            <wp:positionV relativeFrom="paragraph">
+              <wp:posOffset>0</wp:posOffset>
+            </wp:positionV>
+            <wp:extent cx="2454275" cy="2385060"/>
+            <wp:effectExtent l="0" t="0" r="3175" b="0"/>
+            <wp:wrapSquare wrapText="bothSides"/>
+            <wp:docPr id="432644945" name="Obrázek 8"/>
+            <wp:cNvGraphicFramePr>
+              <a:graphicFrameLocks xmlns:a="http://schemas.openxmlformats.org/drawingml/2006/main" noChangeAspect="1"/>
+            </wp:cNvGraphicFramePr>
+            <a:graphic xmlns:a="http://schemas.openxmlformats.org/drawingml/2006/main">
+              <a:graphicData uri="http://schemas.openxmlformats.org/drawingml/2006/picture">
+                <pic:pic xmlns:pic="http://schemas.openxmlformats.org/drawingml/2006/picture">
+                  <pic:nvPicPr>
+                    <pic:cNvPr id="0" name="Picture 7"/>
+                    <pic:cNvPicPr>
+                      <a:picLocks noChangeAspect="1" noChangeArrowheads="1"/>
+                    </pic:cNvPicPr>
+                  </pic:nvPicPr>
+                  <pic:blipFill>
+                    <a:blip r:embed="rId24" cstate="print">
+                      <a:extLst>
+                        <a:ext uri="{28A0092B-C50C-407E-A947-70E740481C1C}">
+                          <a14:useLocalDpi xmlns:a14="http://schemas.microsoft.com/office/drawing/2010/main" val="0"/>
+                        </a:ext>
+                      </a:extLst>
+                    </a:blip>
+                    <a:srcRect/>
+                    <a:stretch>
+                      <a:fillRect/>
+                    </a:stretch>
+                  </pic:blipFill>
+                  <pic:spPr bwMode="auto">
+                    <a:xfrm>
+                      <a:off x="0" y="0"/>
+                      <a:ext cx="2454275" cy="2385060"/>
+                    </a:xfrm>
+                    <a:prstGeom prst="rect">
+                      <a:avLst/>
+                    </a:prstGeom>
+                    <a:noFill/>
+                    <a:ln>
+                      <a:noFill/>
+                    </a:ln>
+                  </pic:spPr>
+                </pic:pic>
+              </a:graphicData>
+            </a:graphic>
+            <wp14:sizeRelH relativeFrom="margin">
+              <wp14:pctWidth>0</wp14:pctWidth>
+            </wp14:sizeRelH>
+            <wp14:sizeRelV relativeFrom="margin">
+              <wp14:pctHeight>0</wp14:pctHeight>
+            </wp14:sizeRelV>
+          </wp:anchor>
+        </w:drawing>
+      </w:r>
+      <w:r>
+        <w:rPr>
+          <w:noProof/>
+        </w:rPr>
+        <w:drawing>
+          <wp:anchor distT="0" distB="0" distL="114300" distR="114300" simplePos="0" relativeHeight="251673600" behindDoc="1" locked="0" layoutInCell="1" allowOverlap="1" wp14:anchorId="4904856A" wp14:editId="0FBCD454">
+            <wp:simplePos x="0" y="0"/>
+            <wp:positionH relativeFrom="column">
+              <wp:posOffset>-61595</wp:posOffset>
+            </wp:positionH>
+            <wp:positionV relativeFrom="paragraph">
+              <wp:posOffset>0</wp:posOffset>
+            </wp:positionV>
+            <wp:extent cx="3104515" cy="2385060"/>
+            <wp:effectExtent l="0" t="0" r="635" b="0"/>
+            <wp:wrapSquare wrapText="bothSides"/>
+            <wp:docPr id="1559451937" name="Obrázek 7"/>
+            <wp:cNvGraphicFramePr>
+              <a:graphicFrameLocks xmlns:a="http://schemas.openxmlformats.org/drawingml/2006/main" noChangeAspect="1"/>
+            </wp:cNvGraphicFramePr>
+            <a:graphic xmlns:a="http://schemas.openxmlformats.org/drawingml/2006/main">
+              <a:graphicData uri="http://schemas.openxmlformats.org/drawingml/2006/picture">
+                <pic:pic xmlns:pic="http://schemas.openxmlformats.org/drawingml/2006/picture">
+                  <pic:nvPicPr>
+                    <pic:cNvPr id="0" name="Picture 6"/>
+                    <pic:cNvPicPr>
+                      <a:picLocks noChangeAspect="1" noChangeArrowheads="1"/>
+                    </pic:cNvPicPr>
+                  </pic:nvPicPr>
+                  <pic:blipFill>
+                    <a:blip r:embed="rId25" cstate="print">
+                      <a:extLst>
+                        <a:ext uri="{28A0092B-C50C-407E-A947-70E740481C1C}">
+                          <a14:useLocalDpi xmlns:a14="http://schemas.microsoft.com/office/drawing/2010/main" val="0"/>
+                        </a:ext>
+                      </a:extLst>
+                    </a:blip>
+                    <a:srcRect/>
+                    <a:stretch>
+                      <a:fillRect/>
+                    </a:stretch>
+                  </pic:blipFill>
+                  <pic:spPr bwMode="auto">
+                    <a:xfrm>
+                      <a:off x="0" y="0"/>
+                      <a:ext cx="3104515" cy="2385060"/>
+                    </a:xfrm>
+                    <a:prstGeom prst="rect">
+                      <a:avLst/>
+                    </a:prstGeom>
+                    <a:noFill/>
+                    <a:ln>
+                      <a:noFill/>
+                    </a:ln>
+                  </pic:spPr>
+                </pic:pic>
+              </a:graphicData>
+            </a:graphic>
+          </wp:anchor>
+        </w:drawing>
+      </w:r>
+      <w:r>
+        <w:t xml:space="preserve">Obrázek </w:t>
+      </w:r>
+      <w:r>
+        <w:fldChar w:fldCharType="begin"/>
+      </w:r>
+      <w:r>
+        <w:instrText xml:space="preserve"> SEQ Obrázek \* ARABIC </w:instrText>
+      </w:r>
+      <w:r>
+        <w:fldChar w:fldCharType="separate"/>
+      </w:r>
+      <w:r>
+        <w:rPr>
+          <w:noProof/>
+        </w:rPr>
+        <w:t>10</w:t>
+      </w:r>
+      <w:r>
+        <w:fldChar w:fldCharType="end"/>
+      </w:r>
+      <w:r>
+        <w:t>: Administrativní rozhraní</w:t>
+      </w:r>
+      <w:bookmarkEnd w:id="38"/>
+    </w:p>
+    <w:p>
+      <w:pPr>
+        <w:pStyle w:val="Titulek"/>
+        <w:ind w:firstLine="284"/>
+      </w:pPr>
+      <w:bookmarkStart w:id="39" w:name="_Toc231411269"/>
+      <w:r>
+        <w:t xml:space="preserve">Obrázek </w:t>
+      </w:r>
+      <w:r>
+        <w:fldChar w:fldCharType="begin"/>
+      </w:r>
+      <w:r>
+        <w:instrText xml:space="preserve"> SEQ Obrázek \* ARABIC </w:instrText>
+      </w:r>
+      <w:r>
+        <w:fldChar w:fldCharType="separate"/>
+      </w:r>
+      <w:r>
+        <w:rPr>
+          <w:noProof/>
+        </w:rPr>
+        <w:t>11</w:t>
+      </w:r>
+      <w:r>
+        <w:fldChar w:fldCharType="end"/>
+      </w:r>
+      <w:r>
+        <w:t xml:space="preserve">: Webové zobrazení </w:t>
+      </w:r>
+      <w:proofErr w:type="spellStart"/>
+      <w:r>
+        <w:t>playgroundu</w:t>
+      </w:r>
+      <w:bookmarkEnd w:id="39"/>
+      <w:proofErr w:type="spellEnd"/>
+    </w:p>
+    <w:p>
+      <w:pPr>
+        <w:pStyle w:val="Titulek"/>
+        <w:sectPr>
+          <w:type w:val="continuous"/>
+          <w:pgSz w:w="11906" w:h="16838"/>
+          <w:pgMar w:top="1417" w:right="1417" w:bottom="1417" w:left="1417" w:header="850" w:footer="680" w:gutter="0"/>
+          <w:cols w:num="2" w:space="708"/>
+          <w:docGrid w:linePitch="360"/>
+        </w:sectPr>
+      </w:pPr>
+    </w:p>
+    <w:p>
+      <w:pPr>
+        <w:pStyle w:val="Nadpis3"/>
+      </w:pPr>
+      <w:bookmarkStart w:id="40" w:name="_Toc231411341"/>
+      <w:r>
+        <w:t>Integrace systému a identifikované problémy</w:t>
+      </w:r>
+      <w:bookmarkEnd w:id="40"/>
+    </w:p>
+    <w:p>
+      <w:pPr>
+        <w:pStyle w:val="Normlntext"/>
+      </w:pPr>
+      <w:r>
+        <w:t>Po dokončení jednotlivých částí projektu následovala jejich postupná integrace do jednoho funkčního celku. Cílem bylo propojit hardwarovou část projektu, lokalizační infrastrukturu, serverovou část a testovací prostředí tak, aby bylo možné ověřit správnou komunikaci mezi jednotlivými komponentami systému.</w:t>
+      </w:r>
+    </w:p>
+    <w:p>
+      <w:pPr>
+        <w:pStyle w:val="Normlntext"/>
+      </w:pPr>
+      <w:r>
+        <w:t xml:space="preserve">V průběhu integrace byly úspěšně zprovozněny lokalizační kotvy, na které byl nahrán připravený firmware. Současně pokračoval vývoj </w:t>
+      </w:r>
+      <w:proofErr w:type="spellStart"/>
+      <w:r>
+        <w:t>gateway</w:t>
+      </w:r>
+      <w:proofErr w:type="spellEnd"/>
+      <w:r>
+        <w:t xml:space="preserve"> serveru a testovacího prostředí </w:t>
+      </w:r>
+      <w:proofErr w:type="spellStart"/>
+      <w:r>
+        <w:t>Playground</w:t>
+      </w:r>
+      <w:proofErr w:type="spellEnd"/>
+      <w:r>
+        <w:t>, které umožnilo ověřování herních mechanik i bez kompletně dokončeného hardwaru.</w:t>
+      </w:r>
+    </w:p>
+    <w:p>
+      <w:pPr>
+        <w:pStyle w:val="Normlntext"/>
+      </w:pPr>
+      <w:r>
+        <w:t>Během testování prototypu hůlky se však objevily problémy v komunikaci po sběrnici I²C, která je využívána pro komunikaci s pohybovými senzory. Při měření bylo zjištěno nestandardní napětí na vodičích SDA a SCL, které dosahovalo přibližně 0,5 V namísto očekávané hodnoty 3,3 V. Tato skutečnost naznačuje možné poškození spoje, chybu v návrhu nebo zkrat na sběrnici.</w:t>
+      </w:r>
+    </w:p>
+    <w:p>
+      <w:pPr>
+        <w:pStyle w:val="Normlntext"/>
+      </w:pPr>
+      <w:r>
+        <w:t>Z důvodu této závady nebylo možné dokončit kompletní testování hardwarové části projektu a ověřit komunikaci všech plánovaných komponent. Ostatní části systému však bylo možné dále vyvíjet a testovat samostatně, což umožnilo pokračování prací na projektu bez nutnosti zastavení vývoje.</w:t>
+      </w:r>
+    </w:p>
+    <w:p>
+      <w:pPr>
+        <w:pStyle w:val="Normlntext"/>
+      </w:pPr>
+      <w:r>
+        <w:t>Z důvodu konstrukce původního prototypu nebylo účelné pokoušet se o kompletní opravu nalezené závady. Zařízení bylo sestaveno jako vývojový prototyp využívající vývojové moduly a větší množství vodičových propojení, což výrazně ztěžovalo diagnostiku a případné opravy. Odstranění závady by vyžadovalo rozsáhlý zásah do již sestaveného zařízení a jeho částečnou demontáž.</w:t>
+      </w:r>
+    </w:p>
+    <w:p>
+      <w:pPr>
+        <w:pStyle w:val="Normlntext"/>
+      </w:pPr>
+      <w:r>
+        <w:t>Z tohoto důvodu bylo rozhodnuto pokračovat návrhem vlastní desky plošných spojů, která umožní přehlednější zapojení jednotlivých komponent a současně odstraní řadu problémů vyplývajících z použití původního prototypového zapojení. V době zpracování této dokumentace byla navržená deska objednána do výroby a čekalo se na její dodání. Kompletní integrace hardwarové části projektu proto bude pokračovat po osazení a oživení nové verze zařízení.</w:t>
+      </w:r>
+    </w:p>
+    <w:p>
+      <w:pPr>
+        <w:jc w:val="left"/>
+      </w:pPr>
+      <w:r>
+        <w:br w:type="page"/>
+      </w:r>
+    </w:p>
+    <w:p>
+      <w:pPr>
+        <w:pStyle w:val="Normlntext"/>
+      </w:pPr>
     </w:p>
     <w:p>
       <w:pPr>
@@ -5943,12 +7655,11 @@
           <w:bottom w:val="single" w:sz="4" w:space="1" w:color="FFE79B"/>
         </w:pBdr>
       </w:pPr>
-      <w:bookmarkStart w:id="30" w:name="_Toc231405578"/>
-      <w:r>
-        <w:lastRenderedPageBreak/>
+      <w:bookmarkStart w:id="41" w:name="_Toc231411342"/>
+      <w:r>
         <w:t>Popis pro uživatele</w:t>
       </w:r>
-      <w:bookmarkEnd w:id="30"/>
+      <w:bookmarkEnd w:id="41"/>
     </w:p>
     <w:p>
       <w:pPr>
@@ -5963,7 +7674,7 @@
         <w:pStyle w:val="Normlntext"/>
       </w:pPr>
       <w:r>
-        <w:t xml:space="preserve">Během provozu zařízení automaticky snímá pohyb pomocí akcelerometru, gyroskopu a magnetometru. Získaná data jsou zpracována </w:t>
+        <w:t xml:space="preserve">Během provozu zařízení automaticky snímá pohyb pomocí akcelerometru, jsou zpracována </w:t>
       </w:r>
       <w:proofErr w:type="spellStart"/>
       <w:r>
@@ -5986,11 +7697,11 @@
       <w:pPr>
         <w:pStyle w:val="Nadpis3"/>
       </w:pPr>
-      <w:bookmarkStart w:id="31" w:name="_Toc231405579"/>
+      <w:bookmarkStart w:id="42" w:name="_Toc231411343"/>
       <w:r>
         <w:t>Návod k použití zařízení</w:t>
       </w:r>
-      <w:bookmarkEnd w:id="31"/>
+      <w:bookmarkEnd w:id="42"/>
     </w:p>
     <w:p>
       <w:pPr>
@@ -6005,7 +7716,13 @@
         <w:pStyle w:val="Normlntext"/>
       </w:pPr>
       <w:r>
-        <w:t>Během používání drží hráč hůlku v ruce a provádí pohyby v prostoru. Pohyb zařízení je snímán pomocí integrovaných senzorů a následně zpracováván herním systémem. Na základě těchto dat je určována orientace hůlky a její poloha v herním prostředí.</w:t>
+        <w:t xml:space="preserve">Během používání drží hráč hůlku v ruce a provádí pohyby v prostoru. Pohyb zařízení je snímán pomocí integrovaných senzorů a následně zpracováván herním systémem. </w:t>
+      </w:r>
+      <w:r>
+        <w:t>Na základě těchto dat je určována orientace hůlky a data jsou dále zpracovávána herním systémem</w:t>
+      </w:r>
+      <w:r>
+        <w:t>.</w:t>
       </w:r>
     </w:p>
     <w:p>
@@ -6023,6 +7740,11 @@
       <w:r>
         <w:t>Při používání zařízení je nutné dodržovat základní bezpečnostní pravidla. Zejména není dovoleno směřovat laserový paprsek do očí osob ani zvířat. Zařízení nesmí být vystaveno působení vody, nadměrné vlhkosti ani mechanickému poškození.</w:t>
       </w:r>
+    </w:p>
+    <w:p>
+      <w:pPr>
+        <w:pStyle w:val="Normlntext"/>
+      </w:pPr>
     </w:p>
     <w:p>
       <w:pPr>
@@ -6031,11 +7753,11 @@
           <w:bottom w:val="single" w:sz="4" w:space="1" w:color="FFE79B"/>
         </w:pBdr>
       </w:pPr>
-      <w:bookmarkStart w:id="32" w:name="_Toc231405580"/>
+      <w:bookmarkStart w:id="43" w:name="_Toc231411344"/>
       <w:r>
         <w:t>Rozšíření hardwarových funkcí prototypu</w:t>
       </w:r>
-      <w:bookmarkEnd w:id="32"/>
+      <w:bookmarkEnd w:id="43"/>
     </w:p>
     <w:p>
       <w:pPr>
@@ -6071,11 +7793,8 @@
     </w:p>
     <w:p>
       <w:pPr>
-        <w:jc w:val="left"/>
-      </w:pPr>
-      <w:r>
-        <w:br w:type="page"/>
-      </w:r>
+        <w:pStyle w:val="Normlntext"/>
+      </w:pPr>
     </w:p>
     <w:p>
       <w:pPr>
@@ -6084,12 +7803,11 @@
           <w:bottom w:val="single" w:sz="4" w:space="1" w:color="FFE79B"/>
         </w:pBdr>
       </w:pPr>
-      <w:bookmarkStart w:id="33" w:name="_Toc231405581"/>
-      <w:r>
-        <w:lastRenderedPageBreak/>
+      <w:bookmarkStart w:id="44" w:name="_Toc231411345"/>
+      <w:r>
         <w:t>Testování a bezpečnostní opatření</w:t>
       </w:r>
-      <w:bookmarkEnd w:id="33"/>
+      <w:bookmarkEnd w:id="44"/>
     </w:p>
     <w:p>
       <w:pPr>
@@ -6801,7 +8519,7 @@
       <w:pPr>
         <w:pStyle w:val="Titulek"/>
       </w:pPr>
-      <w:bookmarkStart w:id="34" w:name="_Toc219385198"/>
+      <w:bookmarkStart w:id="45" w:name="_Toc219385198"/>
       <w:r>
         <w:t xml:space="preserve">Kód </w:t>
       </w:r>
@@ -6829,7 +8547,7 @@
       <w:r>
         <w:t>: Ukázka funkce pro update led diody</w:t>
       </w:r>
-      <w:bookmarkEnd w:id="34"/>
+      <w:bookmarkEnd w:id="45"/>
     </w:p>
     <w:p>
       <w:pPr>
@@ -6849,19 +8567,19 @@
         </w:pBdr>
         <w:ind w:left="0"/>
       </w:pPr>
-      <w:bookmarkStart w:id="35" w:name="_Toc231405582"/>
+      <w:bookmarkStart w:id="46" w:name="_Toc231411346"/>
       <w:r>
         <w:lastRenderedPageBreak/>
         <w:t>Závěr</w:t>
       </w:r>
-      <w:bookmarkEnd w:id="35"/>
+      <w:bookmarkEnd w:id="46"/>
     </w:p>
     <w:p>
       <w:pPr>
         <w:pStyle w:val="Normlntext"/>
       </w:pPr>
       <w:r>
-        <w:t>V úvodu ročníkové práce byl stanoven cíl navrhnout a zahájit realizaci zařízení využitelného pro laserovou hru se zaměřením na výběr vhodných technologií, návrh řešení a sestavení základního prototypu. Tyto cíle byly v průběhu pololetí postupně naplňovány v období od října do prosince.</w:t>
+        <w:t>Cílem ročníkové práce bylo navrhnout a realizovat základní části systému Laser Wand, který propojuje elektroniku, programování a herní prvky do jednoho celku. Projekt byl zaměřen na vývoj prototypu herní hůlky schopné snímat pohyb hráče a komunikovat s ostatními částmi systému.</w:t>
       </w:r>
     </w:p>
     <w:p>
@@ -6869,7 +8587,7 @@
         <w:pStyle w:val="Normlntext"/>
       </w:pPr>
       <w:r>
-        <w:t>V rámci teoretické části byl proveden průzkum dostupných technologií a elektronických komponent, na jehož základě byly vybrány vhodné moduly pro realizaci projektu. Tento krok splnil svůj účel a poskytl potřebný přehled pro další rozhodování. V praktické části následovalo objednání vybraných komponent a zahájení práce na sestavení zařízení.</w:t>
+        <w:t>V průběhu práce byla provedena rešerše podobných projektů a použitých technologií. Na jejím základě byly vybrány vhodné elektronické komponenty, vytvořen první funkční prototyp a ověřena základní komunikace mezi jednotlivými částmi zařízení. Součástí práce bylo také testování pohybových senzorů, návrh napájecí části a ověřování funkčnosti mikrokontroléru ESP32-C6.</w:t>
       </w:r>
     </w:p>
     <w:p>
@@ -6877,7 +8595,7 @@
         <w:pStyle w:val="Normlntext"/>
       </w:pPr>
       <w:r>
-        <w:t>Během praktické realizace se podařilo sestavit a otestovat napájecí část zařízení, oživit mikrokontrolér a ověřit základní funkčnost připojených senzorů. Tyto kroky splnily očekávání stanovená na začátku práce. Zároveň se v průběhu vývoje objevily drobné problémy související se zapojením a testováním jednotlivých částí systému, jejichž řešení bylo součástí praktické zkušenosti a přispělo k lepšímu pochopení problematiky.</w:t>
+        <w:t>V navazující části projektu byl realizován vývoj lokalizačních kotev využívajících technologii UWB. Byly sestaveny, diagnostikovány a úspěšně naprogramovány jednotlivé kotvy určené pro budoucí lokalizaci hráčů v herním prostoru. Současně byl vytvořen návrh vlastní desky plošných spojů, která má nahradit původní prototyp sestavený z vývojových modulů a vodičových propojení.</w:t>
       </w:r>
     </w:p>
     <w:p>
@@ -6885,7 +8603,23 @@
         <w:pStyle w:val="Normlntext"/>
       </w:pPr>
       <w:r>
-        <w:t>Práce na projektu mi ukázala, jak důležité je plánování jednotlivých kroků a postupná kontrola funkčnosti během vývoje. Díky rozdělení práce do dílčích úkolů a jejich postupnému plnění bylo možné projekt realizovat systematicky a přehledně. Tato zkušenost mi pomohla lépe pochopit průběh vývoje technického projektu od návrhu až po první funkční prototyp.</w:t>
+        <w:t xml:space="preserve">Další významnou částí projektu bylo vytvoření </w:t>
+      </w:r>
+      <w:proofErr w:type="spellStart"/>
+      <w:r>
+        <w:t>gateway</w:t>
+      </w:r>
+      <w:proofErr w:type="spellEnd"/>
+      <w:r>
+        <w:t xml:space="preserve"> serveru a testovacího prostředí </w:t>
+      </w:r>
+      <w:proofErr w:type="spellStart"/>
+      <w:r>
+        <w:t>Playground</w:t>
+      </w:r>
+      <w:proofErr w:type="spellEnd"/>
+      <w:r>
+        <w:t>. Tyto nástroje umožnily pokračovat ve vývoji a ověřování herních mechanik i v době, kdy nebylo možné dokončit kompletní testování hardwarové části projektu.</w:t>
       </w:r>
     </w:p>
     <w:p>
@@ -6893,7 +8627,15 @@
         <w:pStyle w:val="Normlntext"/>
       </w:pPr>
       <w:r>
-        <w:t>Práce na projektu mi umožnila prohloubit znalosti v oblasti elektroniky, práce s mikrokontroléry a vývoje vestavěných systémů. Získané zkušenosti považuji za přínosné a využitelné při dalším studiu. Výsledkem pololetní části ročníkové práce je funkční základ prototypu zařízení, který splňuje stanovené cíle této etapy a vytváří prostor pro navázání v další části ročníkové práce.</w:t>
+        <w:t>Během vývoje byly identifikovány také technické problémy, zejména závada na sběrnici I²C v prototypu hůlky. Z důvodu konstrukce původního prototypu bylo rozhodnuto pokračovat vývojem nové verze zařízení využívající vlastní desku plošných spojů. Tímto způsobem bylo možné pokračovat v rozvoji projektu efektivněji než rozsáhlou opravou původního zapojení.</w:t>
+      </w:r>
+    </w:p>
+    <w:p>
+      <w:pPr>
+        <w:pStyle w:val="Normlntext"/>
+      </w:pPr>
+      <w:r>
+        <w:t>Práce mi umožnila získat zkušenosti v oblasti návrhu elektroniky, práce s mikrokontroléry, návrhu PCB, vývoje serverových aplikací a integrace jednotlivých částí rozsáhlejšího technického projektu. Projekt Laser Wand představuje základ pro další vývoj, který bude pokračovat v následujícím období.</w:t>
       </w:r>
     </w:p>
     <w:p>
@@ -6901,7 +8643,7 @@
         <w:br w:type="page"/>
       </w:r>
     </w:p>
-    <w:bookmarkStart w:id="36" w:name="_Toc231405583" w:displacedByCustomXml="next"/>
+    <w:bookmarkStart w:id="47" w:name="_Toc231411347" w:displacedByCustomXml="next"/>
     <w:sdt>
       <w:sdtPr>
         <w:rPr>
@@ -6928,7 +8670,7 @@
           <w:r>
             <w:t>Seznam použitých zdrojů</w:t>
           </w:r>
-          <w:bookmarkEnd w:id="36"/>
+          <w:bookmarkEnd w:id="47"/>
         </w:p>
         <w:sdt>
           <w:sdtPr>
@@ -7118,7 +8860,7 @@
                   <w:bCs/>
                   <w:noProof/>
                 </w:rPr>
-                <w:t xml:space="preserve">5. MathWorks. </w:t>
+                <w:t xml:space="preserve">5. QORVO. </w:t>
               </w:r>
               <w:r>
                 <w:rPr>
@@ -7128,7 +8870,7 @@
                   <w:iCs/>
                   <w:noProof/>
                 </w:rPr>
-                <w:t xml:space="preserve">https://www.mathworks.com/help/fusion/gs/determine-orientation-through-sensor-fusion.html. </w:t>
+                <w:t xml:space="preserve">https://www.qorvo.com/innovation/ultra-wideband. </w:t>
               </w:r>
               <w:r>
                 <w:rPr>
@@ -7136,7 +8878,7 @@
                   <w:bCs/>
                   <w:noProof/>
                 </w:rPr>
-                <w:t>[Online] [Citace: 22. Květen 2026.] https://www.mathworks.com/help/fusion/gs/determine-orientation-through-sensor-fusion.html.</w:t>
+                <w:t>[Online] [Citace: 14. Únor 2026.] https://www.qorvo.com/innovation/ultra-wideband.</w:t>
               </w:r>
             </w:p>
             <w:p>
@@ -7310,12 +9052,12 @@
         </w:pBdr>
         <w:ind w:left="0"/>
       </w:pPr>
-      <w:bookmarkStart w:id="37" w:name="_Toc231405584"/>
+      <w:bookmarkStart w:id="48" w:name="_Toc231411348"/>
       <w:r>
         <w:lastRenderedPageBreak/>
         <w:t>Seznam obrázků</w:t>
       </w:r>
-      <w:bookmarkEnd w:id="37"/>
+      <w:bookmarkEnd w:id="48"/>
     </w:p>
     <w:p>
       <w:pPr>
@@ -7374,7 +9116,7 @@
         <w:rPr>
           <w:noProof/>
         </w:rPr>
-        <w:instrText xml:space="preserve"> PAGEREF _Toc219385192 \h </w:instrText>
+        <w:instrText xml:space="preserve"> PAGEREF _Toc231411259 \h </w:instrText>
       </w:r>
       <w:r>
         <w:rPr>
@@ -7439,7 +9181,7 @@
         <w:rPr>
           <w:noProof/>
         </w:rPr>
-        <w:instrText xml:space="preserve"> PAGEREF _Toc219385193 \h </w:instrText>
+        <w:instrText xml:space="preserve"> PAGEREF _Toc231411260 \h </w:instrText>
       </w:r>
       <w:r>
         <w:rPr>
@@ -7504,7 +9246,7 @@
         <w:rPr>
           <w:noProof/>
         </w:rPr>
-        <w:instrText xml:space="preserve"> PAGEREF _Toc219385194 \h </w:instrText>
+        <w:instrText xml:space="preserve"> PAGEREF _Toc231411261 \h </w:instrText>
       </w:r>
       <w:r>
         <w:rPr>
@@ -7569,7 +9311,7 @@
         <w:rPr>
           <w:noProof/>
         </w:rPr>
-        <w:instrText xml:space="preserve"> PAGEREF _Toc219385195 \h </w:instrText>
+        <w:instrText xml:space="preserve"> PAGEREF _Toc231411262 \h </w:instrText>
       </w:r>
       <w:r>
         <w:rPr>
@@ -7587,6 +9329,461 @@
           <w:noProof/>
         </w:rPr>
         <w:t>14</w:t>
+      </w:r>
+      <w:r>
+        <w:rPr>
+          <w:noProof/>
+        </w:rPr>
+        <w:fldChar w:fldCharType="end"/>
+      </w:r>
+    </w:p>
+    <w:p>
+      <w:pPr>
+        <w:pStyle w:val="Seznamobrzk"/>
+        <w:tabs>
+          <w:tab w:val="right" w:leader="dot" w:pos="9062"/>
+        </w:tabs>
+        <w:rPr>
+          <w:rFonts w:cstheme="minorBidi"/>
+          <w:smallCaps w:val="0"/>
+          <w:noProof/>
+          <w:kern w:val="2"/>
+          <w:sz w:val="24"/>
+          <w:szCs w:val="24"/>
+          <w:lang w:eastAsia="cs-CZ"/>
+          <w14:ligatures w14:val="standardContextual"/>
+        </w:rPr>
+      </w:pPr>
+      <w:r>
+        <w:rPr>
+          <w:noProof/>
+        </w:rPr>
+        <w:t>Obrázek 5: Prezentační prototyp</w:t>
+      </w:r>
+      <w:r>
+        <w:rPr>
+          <w:noProof/>
+        </w:rPr>
+        <w:tab/>
+      </w:r>
+      <w:r>
+        <w:rPr>
+          <w:noProof/>
+        </w:rPr>
+        <w:fldChar w:fldCharType="begin"/>
+      </w:r>
+      <w:r>
+        <w:rPr>
+          <w:noProof/>
+        </w:rPr>
+        <w:instrText xml:space="preserve"> PAGEREF _Toc231411263 \h </w:instrText>
+      </w:r>
+      <w:r>
+        <w:rPr>
+          <w:noProof/>
+        </w:rPr>
+      </w:r>
+      <w:r>
+        <w:rPr>
+          <w:noProof/>
+        </w:rPr>
+        <w:fldChar w:fldCharType="separate"/>
+      </w:r>
+      <w:r>
+        <w:rPr>
+          <w:noProof/>
+        </w:rPr>
+        <w:t>15</w:t>
+      </w:r>
+      <w:r>
+        <w:rPr>
+          <w:noProof/>
+        </w:rPr>
+        <w:fldChar w:fldCharType="end"/>
+      </w:r>
+    </w:p>
+    <w:p>
+      <w:pPr>
+        <w:pStyle w:val="Seznamobrzk"/>
+        <w:tabs>
+          <w:tab w:val="right" w:leader="dot" w:pos="9062"/>
+        </w:tabs>
+        <w:rPr>
+          <w:rFonts w:cstheme="minorBidi"/>
+          <w:smallCaps w:val="0"/>
+          <w:noProof/>
+          <w:kern w:val="2"/>
+          <w:sz w:val="24"/>
+          <w:szCs w:val="24"/>
+          <w:lang w:eastAsia="cs-CZ"/>
+          <w14:ligatures w14:val="standardContextual"/>
+        </w:rPr>
+      </w:pPr>
+      <w:r>
+        <w:rPr>
+          <w:noProof/>
+        </w:rPr>
+        <w:t>Obrázek 6: Prezentační hůlka</w:t>
+      </w:r>
+      <w:r>
+        <w:rPr>
+          <w:noProof/>
+        </w:rPr>
+        <w:tab/>
+      </w:r>
+      <w:r>
+        <w:rPr>
+          <w:noProof/>
+        </w:rPr>
+        <w:fldChar w:fldCharType="begin"/>
+      </w:r>
+      <w:r>
+        <w:rPr>
+          <w:noProof/>
+        </w:rPr>
+        <w:instrText xml:space="preserve"> PAGEREF _Toc231411264 \h </w:instrText>
+      </w:r>
+      <w:r>
+        <w:rPr>
+          <w:noProof/>
+        </w:rPr>
+      </w:r>
+      <w:r>
+        <w:rPr>
+          <w:noProof/>
+        </w:rPr>
+        <w:fldChar w:fldCharType="separate"/>
+      </w:r>
+      <w:r>
+        <w:rPr>
+          <w:noProof/>
+        </w:rPr>
+        <w:t>15</w:t>
+      </w:r>
+      <w:r>
+        <w:rPr>
+          <w:noProof/>
+        </w:rPr>
+        <w:fldChar w:fldCharType="end"/>
+      </w:r>
+    </w:p>
+    <w:p>
+      <w:pPr>
+        <w:pStyle w:val="Seznamobrzk"/>
+        <w:tabs>
+          <w:tab w:val="right" w:leader="dot" w:pos="9062"/>
+        </w:tabs>
+        <w:rPr>
+          <w:rFonts w:cstheme="minorBidi"/>
+          <w:smallCaps w:val="0"/>
+          <w:noProof/>
+          <w:kern w:val="2"/>
+          <w:sz w:val="24"/>
+          <w:szCs w:val="24"/>
+          <w:lang w:eastAsia="cs-CZ"/>
+          <w14:ligatures w14:val="standardContextual"/>
+        </w:rPr>
+      </w:pPr>
+      <w:r>
+        <w:rPr>
+          <w:noProof/>
+        </w:rPr>
+        <w:t>Obrázek 7: Návrh PCB v programu KiCAD</w:t>
+      </w:r>
+      <w:r>
+        <w:rPr>
+          <w:noProof/>
+        </w:rPr>
+        <w:tab/>
+      </w:r>
+      <w:r>
+        <w:rPr>
+          <w:noProof/>
+        </w:rPr>
+        <w:fldChar w:fldCharType="begin"/>
+      </w:r>
+      <w:r>
+        <w:rPr>
+          <w:noProof/>
+        </w:rPr>
+        <w:instrText xml:space="preserve"> PAGEREF _Toc231411265 \h </w:instrText>
+      </w:r>
+      <w:r>
+        <w:rPr>
+          <w:noProof/>
+        </w:rPr>
+      </w:r>
+      <w:r>
+        <w:rPr>
+          <w:noProof/>
+        </w:rPr>
+        <w:fldChar w:fldCharType="separate"/>
+      </w:r>
+      <w:r>
+        <w:rPr>
+          <w:noProof/>
+        </w:rPr>
+        <w:t>17</w:t>
+      </w:r>
+      <w:r>
+        <w:rPr>
+          <w:noProof/>
+        </w:rPr>
+        <w:fldChar w:fldCharType="end"/>
+      </w:r>
+    </w:p>
+    <w:p>
+      <w:pPr>
+        <w:pStyle w:val="Seznamobrzk"/>
+        <w:tabs>
+          <w:tab w:val="right" w:leader="dot" w:pos="9062"/>
+        </w:tabs>
+        <w:rPr>
+          <w:rFonts w:cstheme="minorBidi"/>
+          <w:smallCaps w:val="0"/>
+          <w:noProof/>
+          <w:kern w:val="2"/>
+          <w:sz w:val="24"/>
+          <w:szCs w:val="24"/>
+          <w:lang w:eastAsia="cs-CZ"/>
+          <w14:ligatures w14:val="standardContextual"/>
+        </w:rPr>
+      </w:pPr>
+      <w:r>
+        <w:rPr>
+          <w:noProof/>
+        </w:rPr>
+        <w:t>Obrázek 8: Náhled PCB</w:t>
+      </w:r>
+      <w:r>
+        <w:rPr>
+          <w:noProof/>
+        </w:rPr>
+        <w:tab/>
+      </w:r>
+      <w:r>
+        <w:rPr>
+          <w:noProof/>
+        </w:rPr>
+        <w:fldChar w:fldCharType="begin"/>
+      </w:r>
+      <w:r>
+        <w:rPr>
+          <w:noProof/>
+        </w:rPr>
+        <w:instrText xml:space="preserve"> PAGEREF _Toc231411266 \h </w:instrText>
+      </w:r>
+      <w:r>
+        <w:rPr>
+          <w:noProof/>
+        </w:rPr>
+      </w:r>
+      <w:r>
+        <w:rPr>
+          <w:noProof/>
+        </w:rPr>
+        <w:fldChar w:fldCharType="separate"/>
+      </w:r>
+      <w:r>
+        <w:rPr>
+          <w:noProof/>
+        </w:rPr>
+        <w:t>17</w:t>
+      </w:r>
+      <w:r>
+        <w:rPr>
+          <w:noProof/>
+        </w:rPr>
+        <w:fldChar w:fldCharType="end"/>
+      </w:r>
+    </w:p>
+    <w:p>
+      <w:pPr>
+        <w:pStyle w:val="Seznamobrzk"/>
+        <w:tabs>
+          <w:tab w:val="right" w:leader="dot" w:pos="9062"/>
+        </w:tabs>
+        <w:rPr>
+          <w:rFonts w:cstheme="minorBidi"/>
+          <w:smallCaps w:val="0"/>
+          <w:noProof/>
+          <w:kern w:val="2"/>
+          <w:sz w:val="24"/>
+          <w:szCs w:val="24"/>
+          <w:lang w:eastAsia="cs-CZ"/>
+          <w14:ligatures w14:val="standardContextual"/>
+        </w:rPr>
+      </w:pPr>
+      <w:r>
+        <w:rPr>
+          <w:noProof/>
+        </w:rPr>
+        <w:t>Obrázek 9: Administrativní rozhraní</w:t>
+      </w:r>
+      <w:r>
+        <w:rPr>
+          <w:noProof/>
+        </w:rPr>
+        <w:tab/>
+      </w:r>
+      <w:r>
+        <w:rPr>
+          <w:noProof/>
+        </w:rPr>
+        <w:fldChar w:fldCharType="begin"/>
+      </w:r>
+      <w:r>
+        <w:rPr>
+          <w:noProof/>
+        </w:rPr>
+        <w:instrText xml:space="preserve"> PAGEREF _Toc231411267 \h </w:instrText>
+      </w:r>
+      <w:r>
+        <w:rPr>
+          <w:noProof/>
+        </w:rPr>
+      </w:r>
+      <w:r>
+        <w:rPr>
+          <w:noProof/>
+        </w:rPr>
+        <w:fldChar w:fldCharType="separate"/>
+      </w:r>
+      <w:r>
+        <w:rPr>
+          <w:noProof/>
+        </w:rPr>
+        <w:t>18</w:t>
+      </w:r>
+      <w:r>
+        <w:rPr>
+          <w:noProof/>
+        </w:rPr>
+        <w:fldChar w:fldCharType="end"/>
+      </w:r>
+    </w:p>
+    <w:p>
+      <w:pPr>
+        <w:pStyle w:val="Seznamobrzk"/>
+        <w:tabs>
+          <w:tab w:val="right" w:leader="dot" w:pos="9062"/>
+        </w:tabs>
+        <w:rPr>
+          <w:rFonts w:cstheme="minorBidi"/>
+          <w:smallCaps w:val="0"/>
+          <w:noProof/>
+          <w:kern w:val="2"/>
+          <w:sz w:val="24"/>
+          <w:szCs w:val="24"/>
+          <w:lang w:eastAsia="cs-CZ"/>
+          <w14:ligatures w14:val="standardContextual"/>
+        </w:rPr>
+      </w:pPr>
+      <w:r>
+        <w:rPr>
+          <w:noProof/>
+        </w:rPr>
+        <w:t>Obrázek 10: Administrativní rozhraní</w:t>
+      </w:r>
+      <w:r>
+        <w:rPr>
+          <w:noProof/>
+        </w:rPr>
+        <w:tab/>
+      </w:r>
+      <w:r>
+        <w:rPr>
+          <w:noProof/>
+        </w:rPr>
+        <w:fldChar w:fldCharType="begin"/>
+      </w:r>
+      <w:r>
+        <w:rPr>
+          <w:noProof/>
+        </w:rPr>
+        <w:instrText xml:space="preserve"> PAGEREF _Toc231411268 \h </w:instrText>
+      </w:r>
+      <w:r>
+        <w:rPr>
+          <w:noProof/>
+        </w:rPr>
+      </w:r>
+      <w:r>
+        <w:rPr>
+          <w:noProof/>
+        </w:rPr>
+        <w:fldChar w:fldCharType="separate"/>
+      </w:r>
+      <w:r>
+        <w:rPr>
+          <w:noProof/>
+        </w:rPr>
+        <w:t>19</w:t>
+      </w:r>
+      <w:r>
+        <w:rPr>
+          <w:noProof/>
+        </w:rPr>
+        <w:fldChar w:fldCharType="end"/>
+      </w:r>
+    </w:p>
+    <w:p>
+      <w:pPr>
+        <w:pStyle w:val="Seznamobrzk"/>
+        <w:tabs>
+          <w:tab w:val="right" w:leader="dot" w:pos="9062"/>
+        </w:tabs>
+        <w:rPr>
+          <w:rFonts w:cstheme="minorBidi"/>
+          <w:smallCaps w:val="0"/>
+          <w:noProof/>
+          <w:kern w:val="2"/>
+          <w:sz w:val="24"/>
+          <w:szCs w:val="24"/>
+          <w:lang w:eastAsia="cs-CZ"/>
+          <w14:ligatures w14:val="standardContextual"/>
+        </w:rPr>
+      </w:pPr>
+      <w:r>
+        <w:rPr>
+          <w:noProof/>
+        </w:rPr>
+        <w:t>Obrázek 11: Webové zobrazení playgroundu</w:t>
+      </w:r>
+      <w:r>
+        <w:rPr>
+          <w:noProof/>
+        </w:rPr>
+        <w:tab/>
+      </w:r>
+      <w:r>
+        <w:rPr>
+          <w:noProof/>
+        </w:rPr>
+        <w:fldChar w:fldCharType="begin"/>
+      </w:r>
+      <w:r>
+        <w:rPr>
+          <w:noProof/>
+        </w:rPr>
+        <w:instrText xml:space="preserve"> PAGEREF _Toc231411269 \h </w:instrText>
+      </w:r>
+      <w:r>
+        <w:rPr>
+          <w:noProof/>
+        </w:rPr>
+      </w:r>
+      <w:r>
+        <w:rPr>
+          <w:noProof/>
+        </w:rPr>
+        <w:fldChar w:fldCharType="separate"/>
+      </w:r>
+      <w:r>
+        <w:rPr>
+          <w:noProof/>
+        </w:rPr>
+        <w:t>19</w:t>
       </w:r>
       <w:r>
         <w:rPr>
@@ -7614,11 +9811,11 @@
         </w:pBdr>
         <w:ind w:left="0"/>
       </w:pPr>
-      <w:bookmarkStart w:id="38" w:name="_Toc231405585"/>
+      <w:bookmarkStart w:id="49" w:name="_Toc231411349"/>
       <w:r>
         <w:t>Seznam tabulek</w:t>
       </w:r>
-      <w:bookmarkEnd w:id="38"/>
+      <w:bookmarkEnd w:id="49"/>
     </w:p>
     <w:p>
       <w:pPr>
@@ -7792,11 +9989,11 @@
         </w:pBdr>
         <w:ind w:left="0"/>
       </w:pPr>
-      <w:bookmarkStart w:id="39" w:name="_Toc231405586"/>
+      <w:bookmarkStart w:id="50" w:name="_Toc231411350"/>
       <w:r>
         <w:t>Seznam kódů</w:t>
       </w:r>
-      <w:bookmarkEnd w:id="39"/>
+      <w:bookmarkEnd w:id="50"/>
     </w:p>
     <w:p>
       <w:pPr>
@@ -10139,12 +12336,6 @@
 </file>
 
 <file path=customXml/item1.xml><?xml version="1.0" encoding="utf-8"?>
-<p:properties xmlns:p="http://schemas.microsoft.com/office/2006/metadata/properties" xmlns:xsi="http://www.w3.org/2001/XMLSchema-instance" xmlns:pc="http://schemas.microsoft.com/office/infopath/2007/PartnerControls">
-  <documentManagement/>
-</p:properties>
-</file>
-
-<file path=customXml/item2.xml><?xml version="1.0" encoding="utf-8"?>
 <?mso-contentType ?>
 <FormTemplates xmlns="http://schemas.microsoft.com/sharepoint/v3/contenttype/forms">
   <Display>DocumentLibraryForm</Display>
@@ -10153,151 +12344,13 @@
 </FormTemplates>
 </file>
 
-<file path=customXml/item3.xml><?xml version="1.0" encoding="utf-8"?>
-<b:Sources xmlns:b="http://schemas.openxmlformats.org/officeDocument/2006/bibliography" xmlns="http://schemas.openxmlformats.org/officeDocument/2006/bibliography" SelectedStyle="\ISO690Nmerical.XSL" StyleName="ISO 690 – číselná reference" Version="1987">
-  <b:Source>
-    <b:Tag>Esp26</b:Tag>
-    <b:SourceType>InternetSite</b:SourceType>
-    <b:Guid>{A93FBA84-EBF2-4D76-B073-C9FA111C2856}</b:Guid>
-    <b:Author>
-      <b:Author>
-        <b:Corporate>Espressif Systems</b:Corporate>
-      </b:Author>
-    </b:Author>
-    <b:Title>ESP32-C6 Series Datasheet</b:Title>
-    <b:InternetSiteTitle>Espressif Documentation</b:InternetSiteTitle>
-    <b:YearAccessed>2026</b:YearAccessed>
-    <b:MonthAccessed>1</b:MonthAccessed>
-    <b:DayAccessed>12</b:DayAccessed>
-    <b:URL>https://www.espressif.com/en/products/socs/esp32-c6</b:URL>
-    <b:RefOrder>6</b:RefOrder>
-  </b:Source>
-  <b:Source>
-    <b:Tag>Bos26</b:Tag>
-    <b:SourceType>InternetSite</b:SourceType>
-    <b:Guid>{0A8061CB-B94E-4992-A042-1A7BA55A4751}</b:Guid>
-    <b:Author>
-      <b:Author>
-        <b:Corporate>Bosch Sensortec</b:Corporate>
-      </b:Author>
-    </b:Author>
-    <b:Title>BMI160 – Low Power Inertial Measurement Unit</b:Title>
-    <b:InternetSiteTitle>Bosch Sensortec</b:InternetSiteTitle>
-    <b:YearAccessed>2026</b:YearAccessed>
-    <b:MonthAccessed>1</b:MonthAccessed>
-    <b:DayAccessed>12</b:DayAccessed>
-    <b:URL>https://www.bosch-sensortec.com/products/motion-sensors/imus/bmi160/</b:URL>
-    <b:RefOrder>3</b:RefOrder>
-  </b:Source>
-  <b:Source>
-    <b:Tag>Wiz25</b:Tag>
-    <b:SourceType>InternetSite</b:SourceType>
-    <b:Guid>{D0887F76-6747-4807-AB42-A791636F397A}</b:Guid>
-    <b:Author>
-      <b:Author>
-        <b:Corporate>Wizard Tag</b:Corporate>
-      </b:Author>
-    </b:Author>
-    <b:Title>https://www.wizardtag.com/about-us/#about-us</b:Title>
-    <b:InternetSiteTitle>Wizard Tag</b:InternetSiteTitle>
-    <b:Year>2025</b:Year>
-    <b:YearAccessed>2026</b:YearAccessed>
-    <b:MonthAccessed>1</b:MonthAccessed>
-    <b:DayAccessed>12</b:DayAccessed>
-    <b:URL>https://www.wizardtag.com/about-us/#about-us</b:URL>
-    <b:RefOrder>1</b:RefOrder>
-  </b:Source>
-  <b:Source>
-    <b:Tag>Las26</b:Tag>
-    <b:SourceType>InternetSite</b:SourceType>
-    <b:Guid>{6A0DA8CA-4A23-49C1-BC0C-762852CC6ABB}</b:Guid>
-    <b:Author>
-      <b:Author>
-        <b:Corporate>Laskakit</b:Corporate>
-      </b:Author>
-    </b:Author>
-    <b:Title>Digitální kompas QMC5883L</b:Title>
-    <b:InternetSiteTitle>Laskakit</b:InternetSiteTitle>
-    <b:YearAccessed>2026</b:YearAccessed>
-    <b:MonthAccessed>1</b:MonthAccessed>
-    <b:DayAccessed>12</b:DayAccessed>
-    <b:URL>https://www.laskakit.cz/arduino-kompas-qmc5883l/</b:URL>
-    <b:RefOrder>8</b:RefOrder>
-  </b:Source>
-  <b:Source>
-    <b:Tag>Las</b:Tag>
-    <b:SourceType>InternetSite</b:SourceType>
-    <b:Guid>{720A3B8B-2369-4086-866A-8C6FD645EC08}</b:Guid>
-    <b:Author>
-      <b:Author>
-        <b:Corporate>Laskakit</b:Corporate>
-      </b:Author>
-    </b:Author>
-    <b:Title>Nabíjecí modul TP4056 s ochranou</b:Title>
-    <b:InternetSiteTitle>Laskakit</b:InternetSiteTitle>
-    <b:YearAccessed>2026</b:YearAccessed>
-    <b:MonthAccessed>1</b:MonthAccessed>
-    <b:DayAccessed>12</b:DayAccessed>
-    <b:URL>https://www.laskakit.cz/nabijecka-tp4056-s-ochranou/</b:URL>
-    <b:RefOrder>9</b:RefOrder>
-  </b:Source>
-  <b:Source>
-    <b:Tag>Esp32</b:Tag>
-    <b:SourceType>InternetSite</b:SourceType>
-    <b:Guid>{66D88290-40BA-471F-A5CB-3D53A920B968}</b:Guid>
-    <b:Author>
-      <b:Author>
-        <b:Corporate>Espressif Systems</b:Corporate>
-      </b:Author>
-    </b:Author>
-    <b:Title>ESP-IDF Programming Guide</b:Title>
-    <b:InternetSiteTitle>Espressif Documentation</b:InternetSiteTitle>
-    <b:YearAccessed>2026</b:YearAccessed>
-    <b:MonthAccessed>1</b:MonthAccessed>
-    <b:DayAccessed>12</b:DayAccessed>
-    <b:URL>https://docs.espressif.com/projects/esp-idf/en/latest/esp32c6/</b:URL>
-    <b:RefOrder>7</b:RefOrder>
-  </b:Source>
-  <b:Source>
-    <b:Tag>LAS26</b:Tag>
-    <b:SourceType>InternetSite</b:SourceType>
-    <b:Guid>{51356040-1E6B-4792-9459-D0262F570A7C}</b:Guid>
-    <b:Title>LASERTAG NET</b:Title>
-    <b:InternetSiteTitle>https://lasertag.net/blog/Technology_Behind_Advanced_Laser_Tag_Systems</b:InternetSiteTitle>
-    <b:YearAccessed>2026</b:YearAccessed>
-    <b:MonthAccessed>Květen</b:MonthAccessed>
-    <b:DayAccessed>27</b:DayAccessed>
-    <b:URL>https://lasertag.net/blog/Technology_Behind_Advanced_Laser_Tag_Systems</b:URL>
-    <b:RefOrder>2</b:RefOrder>
-  </b:Source>
-  <b:Source>
-    <b:Tag>TDK26</b:Tag>
-    <b:SourceType>InternetSite</b:SourceType>
-    <b:Guid>{A74C91B5-E0A5-45AE-8C95-4E1C5AE4A27B}</b:Guid>
-    <b:Title>TDK</b:Title>
-    <b:InternetSiteTitle>https://www.tdk.com/en/featured_stories/entry_051-metaverse-motion-sensors.html</b:InternetSiteTitle>
-    <b:YearAccessed>2026</b:YearAccessed>
-    <b:MonthAccessed>Květen</b:MonthAccessed>
-    <b:DayAccessed>22</b:DayAccessed>
-    <b:URL>https://www.tdk.com/en/featured_stories/entry_051-metaverse-motion-sensors.html</b:URL>
-    <b:RefOrder>4</b:RefOrder>
-  </b:Source>
-  <b:Source>
-    <b:Tag>htt26</b:Tag>
-    <b:SourceType>InternetSite</b:SourceType>
-    <b:Guid>{8B3753C4-3B9C-4D55-96BB-378A9310CF8C}</b:Guid>
-    <b:InternetSiteTitle>https://www.mathworks.com/help/fusion/gs/determine-orientation-through-sensor-fusion.html</b:InternetSiteTitle>
-    <b:YearAccessed>2026</b:YearAccessed>
-    <b:MonthAccessed>Květen</b:MonthAccessed>
-    <b:DayAccessed>22</b:DayAccessed>
-    <b:URL>https://www.mathworks.com/help/fusion/gs/determine-orientation-through-sensor-fusion.html</b:URL>
-    <b:Title>MathWorks</b:Title>
-    <b:RefOrder>5</b:RefOrder>
-  </b:Source>
-</b:Sources>
+<file path=customXml/item2.xml><?xml version="1.0" encoding="utf-8"?>
+<p:properties xmlns:p="http://schemas.microsoft.com/office/2006/metadata/properties" xmlns:xsi="http://www.w3.org/2001/XMLSchema-instance" xmlns:pc="http://schemas.microsoft.com/office/infopath/2007/PartnerControls">
+  <documentManagement/>
+</p:properties>
 </file>
 
-<file path=customXml/item4.xml><?xml version="1.0" encoding="utf-8"?>
+<file path=customXml/item3.xml><?xml version="1.0" encoding="utf-8"?>
 <ct:contentTypeSchema xmlns:ct="http://schemas.microsoft.com/office/2006/metadata/contentType" xmlns:ma="http://schemas.microsoft.com/office/2006/metadata/properties/metaAttributes" ct:_="" ma:_="" ma:contentTypeName="Dokument" ma:contentTypeID="0x01010050B1E99129EB1C4B94650070FE2E0B3B" ma:contentTypeVersion="4" ma:contentTypeDescription="Vytvoří nový dokument" ma:contentTypeScope="" ma:versionID="4b1406bcfa7da0748f6a3409a4d9ec36">
   <xsd:schema xmlns:xsd="http://www.w3.org/2001/XMLSchema" xmlns:xs="http://www.w3.org/2001/XMLSchema" xmlns:p="http://schemas.microsoft.com/office/2006/metadata/properties" xmlns:ns2="c3e65571-a390-4c9e-b8e9-5d531d8bbe37" xmlns:ns3="754b39a0-e428-4fa2-823f-61c0c676bbed" targetNamespace="http://schemas.microsoft.com/office/2006/metadata/properties" ma:root="true" ma:fieldsID="85554ed8242ef730ce8ebbc69a9f6cc5" ns2:_="" ns3:_="">
     <xsd:import namespace="c3e65571-a390-4c9e-b8e9-5d531d8bbe37"/>
@@ -10462,7 +12515,159 @@
 </ct:contentTypeSchema>
 </file>
 
+<file path=customXml/item4.xml><?xml version="1.0" encoding="utf-8"?>
+<b:Sources xmlns:b="http://schemas.openxmlformats.org/officeDocument/2006/bibliography" xmlns="http://schemas.openxmlformats.org/officeDocument/2006/bibliography" SelectedStyle="\ISO690Nmerical.XSL" StyleName="ISO 690 – číselná reference" Version="1987">
+  <b:Source>
+    <b:Tag>Esp26</b:Tag>
+    <b:SourceType>InternetSite</b:SourceType>
+    <b:Guid>{A93FBA84-EBF2-4D76-B073-C9FA111C2856}</b:Guid>
+    <b:Author>
+      <b:Author>
+        <b:Corporate>Espressif Systems</b:Corporate>
+      </b:Author>
+    </b:Author>
+    <b:Title>ESP32-C6 Series Datasheet</b:Title>
+    <b:InternetSiteTitle>Espressif Documentation</b:InternetSiteTitle>
+    <b:YearAccessed>2026</b:YearAccessed>
+    <b:MonthAccessed>1</b:MonthAccessed>
+    <b:DayAccessed>12</b:DayAccessed>
+    <b:URL>https://www.espressif.com/en/products/socs/esp32-c6</b:URL>
+    <b:RefOrder>6</b:RefOrder>
+  </b:Source>
+  <b:Source>
+    <b:Tag>Bos26</b:Tag>
+    <b:SourceType>InternetSite</b:SourceType>
+    <b:Guid>{0A8061CB-B94E-4992-A042-1A7BA55A4751}</b:Guid>
+    <b:Author>
+      <b:Author>
+        <b:Corporate>Bosch Sensortec</b:Corporate>
+      </b:Author>
+    </b:Author>
+    <b:Title>BMI160 – Low Power Inertial Measurement Unit</b:Title>
+    <b:InternetSiteTitle>Bosch Sensortec</b:InternetSiteTitle>
+    <b:YearAccessed>2026</b:YearAccessed>
+    <b:MonthAccessed>1</b:MonthAccessed>
+    <b:DayAccessed>12</b:DayAccessed>
+    <b:URL>https://www.bosch-sensortec.com/products/motion-sensors/imus/bmi160/</b:URL>
+    <b:RefOrder>3</b:RefOrder>
+  </b:Source>
+  <b:Source>
+    <b:Tag>Wiz25</b:Tag>
+    <b:SourceType>InternetSite</b:SourceType>
+    <b:Guid>{D0887F76-6747-4807-AB42-A791636F397A}</b:Guid>
+    <b:Author>
+      <b:Author>
+        <b:Corporate>Wizard Tag</b:Corporate>
+      </b:Author>
+    </b:Author>
+    <b:Title>https://www.wizardtag.com/about-us/#about-us</b:Title>
+    <b:InternetSiteTitle>Wizard Tag</b:InternetSiteTitle>
+    <b:Year>2025</b:Year>
+    <b:YearAccessed>2026</b:YearAccessed>
+    <b:MonthAccessed>1</b:MonthAccessed>
+    <b:DayAccessed>12</b:DayAccessed>
+    <b:URL>https://www.wizardtag.com/about-us/#about-us</b:URL>
+    <b:RefOrder>1</b:RefOrder>
+  </b:Source>
+  <b:Source>
+    <b:Tag>Las26</b:Tag>
+    <b:SourceType>InternetSite</b:SourceType>
+    <b:Guid>{6A0DA8CA-4A23-49C1-BC0C-762852CC6ABB}</b:Guid>
+    <b:Author>
+      <b:Author>
+        <b:Corporate>Laskakit</b:Corporate>
+      </b:Author>
+    </b:Author>
+    <b:Title>Digitální kompas QMC5883L</b:Title>
+    <b:InternetSiteTitle>Laskakit</b:InternetSiteTitle>
+    <b:YearAccessed>2026</b:YearAccessed>
+    <b:MonthAccessed>1</b:MonthAccessed>
+    <b:DayAccessed>12</b:DayAccessed>
+    <b:URL>https://www.laskakit.cz/arduino-kompas-qmc5883l/</b:URL>
+    <b:RefOrder>8</b:RefOrder>
+  </b:Source>
+  <b:Source>
+    <b:Tag>Las</b:Tag>
+    <b:SourceType>InternetSite</b:SourceType>
+    <b:Guid>{720A3B8B-2369-4086-866A-8C6FD645EC08}</b:Guid>
+    <b:Author>
+      <b:Author>
+        <b:Corporate>Laskakit</b:Corporate>
+      </b:Author>
+    </b:Author>
+    <b:Title>Nabíjecí modul TP4056 s ochranou</b:Title>
+    <b:InternetSiteTitle>Laskakit</b:InternetSiteTitle>
+    <b:YearAccessed>2026</b:YearAccessed>
+    <b:MonthAccessed>1</b:MonthAccessed>
+    <b:DayAccessed>12</b:DayAccessed>
+    <b:URL>https://www.laskakit.cz/nabijecka-tp4056-s-ochranou/</b:URL>
+    <b:RefOrder>9</b:RefOrder>
+  </b:Source>
+  <b:Source>
+    <b:Tag>Esp32</b:Tag>
+    <b:SourceType>InternetSite</b:SourceType>
+    <b:Guid>{66D88290-40BA-471F-A5CB-3D53A920B968}</b:Guid>
+    <b:Author>
+      <b:Author>
+        <b:Corporate>Espressif Systems</b:Corporate>
+      </b:Author>
+    </b:Author>
+    <b:Title>ESP-IDF Programming Guide</b:Title>
+    <b:InternetSiteTitle>Espressif Documentation</b:InternetSiteTitle>
+    <b:YearAccessed>2026</b:YearAccessed>
+    <b:MonthAccessed>1</b:MonthAccessed>
+    <b:DayAccessed>12</b:DayAccessed>
+    <b:URL>https://docs.espressif.com/projects/esp-idf/en/latest/esp32c6/</b:URL>
+    <b:RefOrder>7</b:RefOrder>
+  </b:Source>
+  <b:Source>
+    <b:Tag>LAS26</b:Tag>
+    <b:SourceType>InternetSite</b:SourceType>
+    <b:Guid>{51356040-1E6B-4792-9459-D0262F570A7C}</b:Guid>
+    <b:Title>LASERTAG NET</b:Title>
+    <b:InternetSiteTitle>https://lasertag.net/blog/Technology_Behind_Advanced_Laser_Tag_Systems</b:InternetSiteTitle>
+    <b:YearAccessed>2026</b:YearAccessed>
+    <b:MonthAccessed>Květen</b:MonthAccessed>
+    <b:DayAccessed>27</b:DayAccessed>
+    <b:URL>https://lasertag.net/blog/Technology_Behind_Advanced_Laser_Tag_Systems</b:URL>
+    <b:RefOrder>2</b:RefOrder>
+  </b:Source>
+  <b:Source>
+    <b:Tag>TDK26</b:Tag>
+    <b:SourceType>InternetSite</b:SourceType>
+    <b:Guid>{A74C91B5-E0A5-45AE-8C95-4E1C5AE4A27B}</b:Guid>
+    <b:Title>TDK</b:Title>
+    <b:InternetSiteTitle>https://www.tdk.com/en/featured_stories/entry_051-metaverse-motion-sensors.html</b:InternetSiteTitle>
+    <b:YearAccessed>2026</b:YearAccessed>
+    <b:MonthAccessed>Květen</b:MonthAccessed>
+    <b:DayAccessed>22</b:DayAccessed>
+    <b:URL>https://www.tdk.com/en/featured_stories/entry_051-metaverse-motion-sensors.html</b:URL>
+    <b:RefOrder>4</b:RefOrder>
+  </b:Source>
+  <b:Source>
+    <b:Tag>QOR26</b:Tag>
+    <b:SourceType>InternetSite</b:SourceType>
+    <b:Guid>{F65380FB-7C05-4A68-AD39-ACE1F36CF5E8}</b:Guid>
+    <b:YearAccessed>2026</b:YearAccessed>
+    <b:MonthAccessed>Únor</b:MonthAccessed>
+    <b:DayAccessed>14</b:DayAccessed>
+    <b:URL>https://www.qorvo.com/innovation/ultra-wideband</b:URL>
+    <b:Title>QORVO</b:Title>
+    <b:InternetSiteTitle>https://www.qorvo.com/innovation/ultra-wideband</b:InternetSiteTitle>
+    <b:RefOrder>5</b:RefOrder>
+  </b:Source>
+</b:Sources>
+</file>
+
 <file path=customXml/itemProps1.xml><?xml version="1.0" encoding="utf-8"?>
+<ds:datastoreItem xmlns:ds="http://schemas.openxmlformats.org/officeDocument/2006/customXml" ds:itemID="{4FF85B71-35EB-4667-B5A7-25BC67E7B3EE}">
+  <ds:schemaRefs>
+    <ds:schemaRef ds:uri="http://schemas.microsoft.com/sharepoint/v3/contenttype/forms"/>
+  </ds:schemaRefs>
+</ds:datastoreItem>
+</file>
+
+<file path=customXml/itemProps2.xml><?xml version="1.0" encoding="utf-8"?>
 <ds:datastoreItem xmlns:ds="http://schemas.openxmlformats.org/officeDocument/2006/customXml" ds:itemID="{43079A01-61F3-44B1-90C1-B1FEC405C657}">
   <ds:schemaRefs>
     <ds:schemaRef ds:uri="http://schemas.microsoft.com/office/2006/metadata/properties"/>
@@ -10471,23 +12676,7 @@
 </ds:datastoreItem>
 </file>
 
-<file path=customXml/itemProps2.xml><?xml version="1.0" encoding="utf-8"?>
-<ds:datastoreItem xmlns:ds="http://schemas.openxmlformats.org/officeDocument/2006/customXml" ds:itemID="{4FF85B71-35EB-4667-B5A7-25BC67E7B3EE}">
-  <ds:schemaRefs>
-    <ds:schemaRef ds:uri="http://schemas.microsoft.com/sharepoint/v3/contenttype/forms"/>
-  </ds:schemaRefs>
-</ds:datastoreItem>
-</file>
-
 <file path=customXml/itemProps3.xml><?xml version="1.0" encoding="utf-8"?>
-<ds:datastoreItem xmlns:ds="http://schemas.openxmlformats.org/officeDocument/2006/customXml" ds:itemID="{A43EF0B7-7C27-4C14-A444-0738FE89FE2F}">
-  <ds:schemaRefs>
-    <ds:schemaRef ds:uri="http://schemas.openxmlformats.org/officeDocument/2006/bibliography"/>
-  </ds:schemaRefs>
-</ds:datastoreItem>
-</file>
-
-<file path=customXml/itemProps4.xml><?xml version="1.0" encoding="utf-8"?>
 <ds:datastoreItem xmlns:ds="http://schemas.openxmlformats.org/officeDocument/2006/customXml" ds:itemID="{82A38B51-6072-4AA7-82FD-DFB83251AC2E}">
   <ds:schemaRefs>
     <ds:schemaRef ds:uri="http://schemas.microsoft.com/office/2006/metadata/contentType"/>
@@ -10504,4 +12693,12 @@
     <ds:schemaRef ds:uri="http://schemas.microsoft.com/internal/obd"/>
   </ds:schemaRefs>
 </ds:datastoreItem>
+</file>
+
+<file path=customXml/itemProps4.xml><?xml version="1.0" encoding="utf-8"?>
+<ds:datastoreItem xmlns:ds="http://schemas.openxmlformats.org/officeDocument/2006/customXml" ds:itemID="{0C766228-ECD1-4600-A32F-57288624DC8F}">
+  <ds:schemaRefs>
+    <ds:schemaRef ds:uri="http://schemas.openxmlformats.org/officeDocument/2006/bibliography"/>
+  </ds:schemaRefs>
+</ds:datastoreItem>
 </file>
</xml_diff>

<commit_message>
Update dokumentace + update prezentace
</commit_message>
<xml_diff>
--- a/Dokumentace_Strachon.docx
+++ b/Dokumentace_Strachon.docx
@@ -127,7 +127,7 @@
           <w:lang w:eastAsia="cs-CZ"/>
         </w:rPr>
         <w:drawing>
-          <wp:anchor distT="0" distB="0" distL="114300" distR="114300" simplePos="0" relativeHeight="251661312" behindDoc="0" locked="0" layoutInCell="1" allowOverlap="1" wp14:anchorId="227665D6" wp14:editId="627079EC">
+          <wp:anchor distT="0" distB="0" distL="114300" distR="114300" simplePos="0" relativeHeight="251661312" behindDoc="0" locked="0" layoutInCell="1" allowOverlap="1" wp14:anchorId="227665D6" wp14:editId="2A907BB6">
             <wp:simplePos x="0" y="0"/>
             <wp:positionH relativeFrom="margin">
               <wp:align>center</wp:align>
@@ -430,7 +430,7 @@
           <w:rPr>
             <w:noProof/>
           </w:rPr>
-          <w:t>07.06.2026</w:t>
+          <w:t>08.06.2026</w:t>
         </w:r>
       </w:fldSimple>
     </w:p>
@@ -518,91 +518,55 @@
         <w:rPr>
           <w:shd w:val="clear" w:color="auto" w:fill="FFFFFF"/>
         </w:rPr>
-        <w:t xml:space="preserve"> </w:t>
-      </w:r>
-      <w:proofErr w:type="spellStart"/>
+        <w:t xml:space="preserve"> Haberzettl</w:t>
+      </w:r>
       <w:r>
         <w:rPr>
           <w:shd w:val="clear" w:color="auto" w:fill="FFFFFF"/>
         </w:rPr>
-        <w:t>Haberzettl</w:t>
+        <w:t>ovi</w:t>
       </w:r>
       <w:r>
         <w:rPr>
           <w:shd w:val="clear" w:color="auto" w:fill="FFFFFF"/>
         </w:rPr>
+        <w:t xml:space="preserve"> za cenné rady z oblasti elektrotechniky, Josef</w:t>
+      </w:r>
+      <w:r>
+        <w:rPr>
+          <w:shd w:val="clear" w:color="auto" w:fill="FFFFFF"/>
+        </w:rPr>
+        <w:t>u</w:t>
+      </w:r>
+      <w:r>
+        <w:rPr>
+          <w:shd w:val="clear" w:color="auto" w:fill="FFFFFF"/>
+        </w:rPr>
+        <w:t xml:space="preserve"> Strachoň</w:t>
+      </w:r>
+      <w:r>
+        <w:rPr>
+          <w:shd w:val="clear" w:color="auto" w:fill="FFFFFF"/>
+        </w:rPr>
         <w:t>ovi</w:t>
       </w:r>
-      <w:proofErr w:type="spellEnd"/>
       <w:r>
         <w:rPr>
           <w:shd w:val="clear" w:color="auto" w:fill="FFFFFF"/>
         </w:rPr>
-        <w:t xml:space="preserve"> za cenné rady z oblasti elektrotechniky, Josef</w:t>
+        <w:t xml:space="preserve"> st. </w:t>
       </w:r>
       <w:r>
         <w:rPr>
           <w:shd w:val="clear" w:color="auto" w:fill="FFFFFF"/>
         </w:rPr>
-        <w:t>u</w:t>
+        <w:t>za materiální a technickou podporu, zejména poskytnutí vybavení potřebného pro pájení</w:t>
       </w:r>
       <w:r>
         <w:rPr>
           <w:shd w:val="clear" w:color="auto" w:fill="FFFFFF"/>
         </w:rPr>
-        <w:t xml:space="preserve"> </w:t>
-      </w:r>
-      <w:proofErr w:type="spellStart"/>
-      <w:r>
-        <w:rPr>
-          <w:shd w:val="clear" w:color="auto" w:fill="FFFFFF"/>
-        </w:rPr>
-        <w:t>Strachoň</w:t>
-      </w:r>
-      <w:r>
-        <w:rPr>
-          <w:shd w:val="clear" w:color="auto" w:fill="FFFFFF"/>
-        </w:rPr>
-        <w:t>ovi</w:t>
-      </w:r>
-      <w:proofErr w:type="spellEnd"/>
-      <w:r>
-        <w:rPr>
-          <w:shd w:val="clear" w:color="auto" w:fill="FFFFFF"/>
-        </w:rPr>
-        <w:t xml:space="preserve"> st. </w:t>
-      </w:r>
-      <w:r>
-        <w:rPr>
-          <w:shd w:val="clear" w:color="auto" w:fill="FFFFFF"/>
-        </w:rPr>
-        <w:t>za materiální a technickou podporu, zejména poskytnutí vybavení potřebného pro pájení</w:t>
-      </w:r>
-      <w:r>
-        <w:rPr>
-          <w:shd w:val="clear" w:color="auto" w:fill="FFFFFF"/>
-        </w:rPr>
-        <w:t xml:space="preserve">, </w:t>
-      </w:r>
-      <w:r>
-        <w:rPr>
-          <w:shd w:val="clear" w:color="auto" w:fill="FFFFFF"/>
-        </w:rPr>
-        <w:t xml:space="preserve">a Tomáši Martinu Holubovi za pomoc při návrhu desky plošných spojů v programu </w:t>
-      </w:r>
-      <w:proofErr w:type="spellStart"/>
-      <w:r>
-        <w:rPr>
-          <w:shd w:val="clear" w:color="auto" w:fill="FFFFFF"/>
-        </w:rPr>
-        <w:t>KiCAD</w:t>
-      </w:r>
-      <w:proofErr w:type="spellEnd"/>
-      <w:r>
-        <w:rPr>
-          <w:shd w:val="clear" w:color="auto" w:fill="FFFFFF"/>
-        </w:rPr>
-        <w:t xml:space="preserve"> a za technické konzultace během vývoje projektu.</w:t>
+        <w:t>, a Tomáši Martinu Holubovi za pomoc při návrhu desky plošných spojů v programu KiCAD a za technické konzultace během vývoje projektu.</w:t>
       </w:r>
     </w:p>
     <w:p/>
@@ -665,24 +629,14 @@
         <w:t>ESP32, UWB, akcelerometr, gyroskop, magnetometr, napájecí článek, laser game,</w:t>
       </w:r>
       <w:r>
+        <w:t xml:space="preserve"> KiCAD,</w:t>
+      </w:r>
+      <w:r>
         <w:t xml:space="preserve"> </w:t>
       </w:r>
-      <w:proofErr w:type="spellStart"/>
-      <w:r>
-        <w:t>KiCAD</w:t>
-      </w:r>
-      <w:proofErr w:type="spellEnd"/>
-      <w:r>
-        <w:t>,</w:t>
-      </w:r>
-      <w:r>
-        <w:t xml:space="preserve"> </w:t>
-      </w:r>
-      <w:proofErr w:type="spellStart"/>
       <w:r>
         <w:t>playground</w:t>
       </w:r>
-      <w:proofErr w:type="spellEnd"/>
       <w:r>
         <w:br w:type="page"/>
       </w:r>
@@ -729,7 +683,7 @@
         </w:p>
         <w:p>
           <w:pPr>
-            <w:pStyle w:val="Obsah1"/>
+            <w:pStyle w:val="TOC1"/>
             <w:tabs>
               <w:tab w:val="right" w:leader="dot" w:pos="9062"/>
             </w:tabs>
@@ -754,7 +708,7 @@
           <w:hyperlink w:anchor="_Toc231758253" w:history="1">
             <w:r>
               <w:rPr>
-                <w:rStyle w:val="Hypertextovodkaz"/>
+                <w:rStyle w:val="Hyperlink"/>
                 <w:noProof/>
               </w:rPr>
               <w:t>Úvod</w:t>
@@ -811,7 +765,7 @@
         </w:p>
         <w:p>
           <w:pPr>
-            <w:pStyle w:val="Obsah1"/>
+            <w:pStyle w:val="TOC1"/>
             <w:tabs>
               <w:tab w:val="left" w:pos="440"/>
               <w:tab w:val="right" w:leader="dot" w:pos="9062"/>
@@ -828,7 +782,7 @@
           <w:hyperlink w:anchor="_Toc231758254" w:history="1">
             <w:r>
               <w:rPr>
-                <w:rStyle w:val="Hypertextovodkaz"/>
+                <w:rStyle w:val="Hyperlink"/>
                 <w:noProof/>
               </w:rPr>
               <w:t>1</w:t>
@@ -846,7 +800,7 @@
             </w:r>
             <w:r>
               <w:rPr>
-                <w:rStyle w:val="Hypertextovodkaz"/>
+                <w:rStyle w:val="Hyperlink"/>
                 <w:noProof/>
               </w:rPr>
               <w:t>Teoretická část</w:t>
@@ -903,7 +857,7 @@
         </w:p>
         <w:p>
           <w:pPr>
-            <w:pStyle w:val="Obsah2"/>
+            <w:pStyle w:val="TOC2"/>
             <w:tabs>
               <w:tab w:val="left" w:pos="960"/>
               <w:tab w:val="right" w:leader="dot" w:pos="9062"/>
@@ -920,7 +874,7 @@
           <w:hyperlink w:anchor="_Toc231758255" w:history="1">
             <w:r>
               <w:rPr>
-                <w:rStyle w:val="Hypertextovodkaz"/>
+                <w:rStyle w:val="Hyperlink"/>
                 <w:noProof/>
               </w:rPr>
               <w:t>1.1</w:t>
@@ -938,7 +892,7 @@
             </w:r>
             <w:r>
               <w:rPr>
-                <w:rStyle w:val="Hypertextovodkaz"/>
+                <w:rStyle w:val="Hyperlink"/>
                 <w:noProof/>
               </w:rPr>
               <w:t>Rešerše</w:t>
@@ -995,7 +949,7 @@
         </w:p>
         <w:p>
           <w:pPr>
-            <w:pStyle w:val="Obsah3"/>
+            <w:pStyle w:val="TOC3"/>
             <w:tabs>
               <w:tab w:val="left" w:pos="1200"/>
               <w:tab w:val="right" w:leader="dot" w:pos="9062"/>
@@ -1012,7 +966,7 @@
           <w:hyperlink w:anchor="_Toc231758256" w:history="1">
             <w:r>
               <w:rPr>
-                <w:rStyle w:val="Hypertextovodkaz"/>
+                <w:rStyle w:val="Hyperlink"/>
                 <w:noProof/>
               </w:rPr>
               <w:t>1.1.1</w:t>
@@ -1030,7 +984,7 @@
             </w:r>
             <w:r>
               <w:rPr>
-                <w:rStyle w:val="Hypertextovodkaz"/>
+                <w:rStyle w:val="Hyperlink"/>
                 <w:noProof/>
               </w:rPr>
               <w:t>Wizard Tag</w:t>
@@ -1087,7 +1041,7 @@
         </w:p>
         <w:p>
           <w:pPr>
-            <w:pStyle w:val="Obsah3"/>
+            <w:pStyle w:val="TOC3"/>
             <w:tabs>
               <w:tab w:val="left" w:pos="1200"/>
               <w:tab w:val="right" w:leader="dot" w:pos="9062"/>
@@ -1104,7 +1058,7 @@
           <w:hyperlink w:anchor="_Toc231758257" w:history="1">
             <w:r>
               <w:rPr>
-                <w:rStyle w:val="Hypertextovodkaz"/>
+                <w:rStyle w:val="Hyperlink"/>
                 <w:noProof/>
               </w:rPr>
               <w:t>1.1.2</w:t>
@@ -1122,7 +1076,7 @@
             </w:r>
             <w:r>
               <w:rPr>
-                <w:rStyle w:val="Hypertextovodkaz"/>
+                <w:rStyle w:val="Hyperlink"/>
                 <w:noProof/>
               </w:rPr>
               <w:t>Klasická laser game</w:t>
@@ -1179,7 +1133,7 @@
         </w:p>
         <w:p>
           <w:pPr>
-            <w:pStyle w:val="Obsah3"/>
+            <w:pStyle w:val="TOC3"/>
             <w:tabs>
               <w:tab w:val="left" w:pos="1200"/>
               <w:tab w:val="right" w:leader="dot" w:pos="9062"/>
@@ -1196,7 +1150,7 @@
           <w:hyperlink w:anchor="_Toc231758258" w:history="1">
             <w:r>
               <w:rPr>
-                <w:rStyle w:val="Hypertextovodkaz"/>
+                <w:rStyle w:val="Hyperlink"/>
                 <w:noProof/>
               </w:rPr>
               <w:t>1.1.3</w:t>
@@ -1214,7 +1168,7 @@
             </w:r>
             <w:r>
               <w:rPr>
-                <w:rStyle w:val="Hypertextovodkaz"/>
+                <w:rStyle w:val="Hyperlink"/>
                 <w:noProof/>
               </w:rPr>
               <w:t>Pohybové senzory v herních systémech</w:t>
@@ -1271,7 +1225,7 @@
         </w:p>
         <w:p>
           <w:pPr>
-            <w:pStyle w:val="Obsah2"/>
+            <w:pStyle w:val="TOC2"/>
             <w:tabs>
               <w:tab w:val="left" w:pos="960"/>
               <w:tab w:val="right" w:leader="dot" w:pos="9062"/>
@@ -1288,7 +1242,7 @@
           <w:hyperlink w:anchor="_Toc231758259" w:history="1">
             <w:r>
               <w:rPr>
-                <w:rStyle w:val="Hypertextovodkaz"/>
+                <w:rStyle w:val="Hyperlink"/>
                 <w:noProof/>
               </w:rPr>
               <w:t>1.2</w:t>
@@ -1306,7 +1260,7 @@
             </w:r>
             <w:r>
               <w:rPr>
-                <w:rStyle w:val="Hypertextovodkaz"/>
+                <w:rStyle w:val="Hyperlink"/>
                 <w:noProof/>
               </w:rPr>
               <w:t>Technologie</w:t>
@@ -1363,7 +1317,7 @@
         </w:p>
         <w:p>
           <w:pPr>
-            <w:pStyle w:val="Obsah3"/>
+            <w:pStyle w:val="TOC3"/>
             <w:tabs>
               <w:tab w:val="left" w:pos="1200"/>
               <w:tab w:val="right" w:leader="dot" w:pos="9062"/>
@@ -1380,7 +1334,7 @@
           <w:hyperlink w:anchor="_Toc231758260" w:history="1">
             <w:r>
               <w:rPr>
-                <w:rStyle w:val="Hypertextovodkaz"/>
+                <w:rStyle w:val="Hyperlink"/>
                 <w:noProof/>
               </w:rPr>
               <w:t>1.2.1</w:t>
@@ -1398,7 +1352,7 @@
             </w:r>
             <w:r>
               <w:rPr>
-                <w:rStyle w:val="Hypertextovodkaz"/>
+                <w:rStyle w:val="Hyperlink"/>
                 <w:noProof/>
               </w:rPr>
               <w:t>Mikrokontrolér a vývojové prostředí</w:t>
@@ -1455,7 +1409,7 @@
         </w:p>
         <w:p>
           <w:pPr>
-            <w:pStyle w:val="Obsah3"/>
+            <w:pStyle w:val="TOC3"/>
             <w:tabs>
               <w:tab w:val="left" w:pos="1200"/>
               <w:tab w:val="right" w:leader="dot" w:pos="9062"/>
@@ -1472,7 +1426,7 @@
           <w:hyperlink w:anchor="_Toc231758261" w:history="1">
             <w:r>
               <w:rPr>
-                <w:rStyle w:val="Hypertextovodkaz"/>
+                <w:rStyle w:val="Hyperlink"/>
                 <w:noProof/>
               </w:rPr>
               <w:t>1.2.2</w:t>
@@ -1490,7 +1444,7 @@
             </w:r>
             <w:r>
               <w:rPr>
-                <w:rStyle w:val="Hypertextovodkaz"/>
+                <w:rStyle w:val="Hyperlink"/>
                 <w:noProof/>
               </w:rPr>
               <w:t>Technologie UWB</w:t>
@@ -1547,7 +1501,7 @@
         </w:p>
         <w:p>
           <w:pPr>
-            <w:pStyle w:val="Obsah3"/>
+            <w:pStyle w:val="TOC3"/>
             <w:tabs>
               <w:tab w:val="left" w:pos="1200"/>
               <w:tab w:val="right" w:leader="dot" w:pos="9062"/>
@@ -1564,7 +1518,7 @@
           <w:hyperlink w:anchor="_Toc231758262" w:history="1">
             <w:r>
               <w:rPr>
-                <w:rStyle w:val="Hypertextovodkaz"/>
+                <w:rStyle w:val="Hyperlink"/>
                 <w:noProof/>
               </w:rPr>
               <w:t>1.2.3</w:t>
@@ -1582,7 +1536,7 @@
             </w:r>
             <w:r>
               <w:rPr>
-                <w:rStyle w:val="Hypertextovodkaz"/>
+                <w:rStyle w:val="Hyperlink"/>
                 <w:noProof/>
               </w:rPr>
               <w:t>Hardware a elektronické komponenty</w:t>
@@ -1639,7 +1593,7 @@
         </w:p>
         <w:p>
           <w:pPr>
-            <w:pStyle w:val="Obsah1"/>
+            <w:pStyle w:val="TOC1"/>
             <w:tabs>
               <w:tab w:val="left" w:pos="440"/>
               <w:tab w:val="right" w:leader="dot" w:pos="9062"/>
@@ -1656,7 +1610,7 @@
           <w:hyperlink w:anchor="_Toc231758263" w:history="1">
             <w:r>
               <w:rPr>
-                <w:rStyle w:val="Hypertextovodkaz"/>
+                <w:rStyle w:val="Hyperlink"/>
                 <w:noProof/>
               </w:rPr>
               <w:t>2</w:t>
@@ -1674,7 +1628,7 @@
             </w:r>
             <w:r>
               <w:rPr>
-                <w:rStyle w:val="Hypertextovodkaz"/>
+                <w:rStyle w:val="Hyperlink"/>
                 <w:noProof/>
               </w:rPr>
               <w:t>Praktická část</w:t>
@@ -1731,7 +1685,7 @@
         </w:p>
         <w:p>
           <w:pPr>
-            <w:pStyle w:val="Obsah2"/>
+            <w:pStyle w:val="TOC2"/>
             <w:tabs>
               <w:tab w:val="left" w:pos="960"/>
               <w:tab w:val="right" w:leader="dot" w:pos="9062"/>
@@ -1748,7 +1702,7 @@
           <w:hyperlink w:anchor="_Toc231758264" w:history="1">
             <w:r>
               <w:rPr>
-                <w:rStyle w:val="Hypertextovodkaz"/>
+                <w:rStyle w:val="Hyperlink"/>
                 <w:noProof/>
               </w:rPr>
               <w:t>2.1</w:t>
@@ -1766,7 +1720,7 @@
             </w:r>
             <w:r>
               <w:rPr>
-                <w:rStyle w:val="Hypertextovodkaz"/>
+                <w:rStyle w:val="Hyperlink"/>
                 <w:noProof/>
               </w:rPr>
               <w:t>Návrhy</w:t>
@@ -1823,7 +1777,7 @@
         </w:p>
         <w:p>
           <w:pPr>
-            <w:pStyle w:val="Obsah2"/>
+            <w:pStyle w:val="TOC2"/>
             <w:tabs>
               <w:tab w:val="left" w:pos="960"/>
               <w:tab w:val="right" w:leader="dot" w:pos="9062"/>
@@ -1840,7 +1794,7 @@
           <w:hyperlink w:anchor="_Toc231758265" w:history="1">
             <w:r>
               <w:rPr>
-                <w:rStyle w:val="Hypertextovodkaz"/>
+                <w:rStyle w:val="Hyperlink"/>
                 <w:noProof/>
               </w:rPr>
               <w:t>2.2</w:t>
@@ -1858,7 +1812,7 @@
             </w:r>
             <w:r>
               <w:rPr>
-                <w:rStyle w:val="Hypertextovodkaz"/>
+                <w:rStyle w:val="Hyperlink"/>
                 <w:noProof/>
               </w:rPr>
               <w:t>Produktizace</w:t>
@@ -1915,7 +1869,7 @@
         </w:p>
         <w:p>
           <w:pPr>
-            <w:pStyle w:val="Obsah3"/>
+            <w:pStyle w:val="TOC3"/>
             <w:tabs>
               <w:tab w:val="left" w:pos="1200"/>
               <w:tab w:val="right" w:leader="dot" w:pos="9062"/>
@@ -1932,7 +1886,7 @@
           <w:hyperlink w:anchor="_Toc231758266" w:history="1">
             <w:r>
               <w:rPr>
-                <w:rStyle w:val="Hypertextovodkaz"/>
+                <w:rStyle w:val="Hyperlink"/>
                 <w:noProof/>
               </w:rPr>
               <w:t>2.2.1</w:t>
@@ -1950,7 +1904,7 @@
             </w:r>
             <w:r>
               <w:rPr>
-                <w:rStyle w:val="Hypertextovodkaz"/>
+                <w:rStyle w:val="Hyperlink"/>
                 <w:noProof/>
               </w:rPr>
               <w:t>Objednání a příprava komponent</w:t>
@@ -2007,7 +1961,7 @@
         </w:p>
         <w:p>
           <w:pPr>
-            <w:pStyle w:val="Obsah3"/>
+            <w:pStyle w:val="TOC3"/>
             <w:tabs>
               <w:tab w:val="left" w:pos="1200"/>
               <w:tab w:val="right" w:leader="dot" w:pos="9062"/>
@@ -2024,7 +1978,7 @@
           <w:hyperlink w:anchor="_Toc231758267" w:history="1">
             <w:r>
               <w:rPr>
-                <w:rStyle w:val="Hypertextovodkaz"/>
+                <w:rStyle w:val="Hyperlink"/>
                 <w:noProof/>
               </w:rPr>
               <w:t>2.2.2</w:t>
@@ -2042,7 +1996,7 @@
             </w:r>
             <w:r>
               <w:rPr>
-                <w:rStyle w:val="Hypertextovodkaz"/>
+                <w:rStyle w:val="Hyperlink"/>
                 <w:noProof/>
               </w:rPr>
               <w:t>Sestavení a testování napájecí části</w:t>
@@ -2099,7 +2053,7 @@
         </w:p>
         <w:p>
           <w:pPr>
-            <w:pStyle w:val="Obsah3"/>
+            <w:pStyle w:val="TOC3"/>
             <w:tabs>
               <w:tab w:val="left" w:pos="1200"/>
               <w:tab w:val="right" w:leader="dot" w:pos="9062"/>
@@ -2116,7 +2070,7 @@
           <w:hyperlink w:anchor="_Toc231758268" w:history="1">
             <w:r>
               <w:rPr>
-                <w:rStyle w:val="Hypertextovodkaz"/>
+                <w:rStyle w:val="Hyperlink"/>
                 <w:noProof/>
               </w:rPr>
               <w:t>2.2.3</w:t>
@@ -2134,7 +2088,7 @@
             </w:r>
             <w:r>
               <w:rPr>
-                <w:rStyle w:val="Hypertextovodkaz"/>
+                <w:rStyle w:val="Hyperlink"/>
                 <w:noProof/>
               </w:rPr>
               <w:t>Oživení mikrokontroléru</w:t>
@@ -2191,7 +2145,7 @@
         </w:p>
         <w:p>
           <w:pPr>
-            <w:pStyle w:val="Obsah3"/>
+            <w:pStyle w:val="TOC3"/>
             <w:tabs>
               <w:tab w:val="left" w:pos="1200"/>
               <w:tab w:val="right" w:leader="dot" w:pos="9062"/>
@@ -2208,7 +2162,7 @@
           <w:hyperlink w:anchor="_Toc231758269" w:history="1">
             <w:r>
               <w:rPr>
-                <w:rStyle w:val="Hypertextovodkaz"/>
+                <w:rStyle w:val="Hyperlink"/>
                 <w:noProof/>
               </w:rPr>
               <w:t>2.2.4</w:t>
@@ -2226,7 +2180,7 @@
             </w:r>
             <w:r>
               <w:rPr>
-                <w:rStyle w:val="Hypertextovodkaz"/>
+                <w:rStyle w:val="Hyperlink"/>
                 <w:noProof/>
               </w:rPr>
               <w:t>Zapojení a testování senzorů</w:t>
@@ -2283,7 +2237,7 @@
         </w:p>
         <w:p>
           <w:pPr>
-            <w:pStyle w:val="Obsah3"/>
+            <w:pStyle w:val="TOC3"/>
             <w:tabs>
               <w:tab w:val="left" w:pos="1200"/>
               <w:tab w:val="right" w:leader="dot" w:pos="9062"/>
@@ -2300,7 +2254,7 @@
           <w:hyperlink w:anchor="_Toc231758270" w:history="1">
             <w:r>
               <w:rPr>
-                <w:rStyle w:val="Hypertextovodkaz"/>
+                <w:rStyle w:val="Hyperlink"/>
                 <w:noProof/>
               </w:rPr>
               <w:t>2.2.5</w:t>
@@ -2318,7 +2272,7 @@
             </w:r>
             <w:r>
               <w:rPr>
-                <w:rStyle w:val="Hypertextovodkaz"/>
+                <w:rStyle w:val="Hyperlink"/>
                 <w:noProof/>
               </w:rPr>
               <w:t>Sestavení prvního prototypu</w:t>
@@ -2375,7 +2329,7 @@
         </w:p>
         <w:p>
           <w:pPr>
-            <w:pStyle w:val="Obsah3"/>
+            <w:pStyle w:val="TOC3"/>
             <w:tabs>
               <w:tab w:val="left" w:pos="1200"/>
               <w:tab w:val="right" w:leader="dot" w:pos="9062"/>
@@ -2392,7 +2346,7 @@
           <w:hyperlink w:anchor="_Toc231758271" w:history="1">
             <w:r>
               <w:rPr>
-                <w:rStyle w:val="Hypertextovodkaz"/>
+                <w:rStyle w:val="Hyperlink"/>
                 <w:noProof/>
               </w:rPr>
               <w:t>2.2.6</w:t>
@@ -2410,7 +2364,7 @@
             </w:r>
             <w:r>
               <w:rPr>
-                <w:rStyle w:val="Hypertextovodkaz"/>
+                <w:rStyle w:val="Hyperlink"/>
                 <w:noProof/>
               </w:rPr>
               <w:t>Vyhodnocení funkčnosti prototypu</w:t>
@@ -2467,7 +2421,7 @@
         </w:p>
         <w:p>
           <w:pPr>
-            <w:pStyle w:val="Obsah3"/>
+            <w:pStyle w:val="TOC3"/>
             <w:tabs>
               <w:tab w:val="left" w:pos="1200"/>
               <w:tab w:val="right" w:leader="dot" w:pos="9062"/>
@@ -2484,7 +2438,7 @@
           <w:hyperlink w:anchor="_Toc231758272" w:history="1">
             <w:r>
               <w:rPr>
-                <w:rStyle w:val="Hypertextovodkaz"/>
+                <w:rStyle w:val="Hyperlink"/>
                 <w:noProof/>
               </w:rPr>
               <w:t>2.2.7</w:t>
@@ -2502,7 +2456,7 @@
             </w:r>
             <w:r>
               <w:rPr>
-                <w:rStyle w:val="Hypertextovodkaz"/>
+                <w:rStyle w:val="Hyperlink"/>
                 <w:noProof/>
               </w:rPr>
               <w:t>Vývoj lokalizačních kotev UWB</w:t>
@@ -2559,7 +2513,7 @@
         </w:p>
         <w:p>
           <w:pPr>
-            <w:pStyle w:val="Obsah3"/>
+            <w:pStyle w:val="TOC3"/>
             <w:tabs>
               <w:tab w:val="left" w:pos="1200"/>
               <w:tab w:val="right" w:leader="dot" w:pos="9062"/>
@@ -2576,7 +2530,7 @@
           <w:hyperlink w:anchor="_Toc231758273" w:history="1">
             <w:r>
               <w:rPr>
-                <w:rStyle w:val="Hypertextovodkaz"/>
+                <w:rStyle w:val="Hyperlink"/>
                 <w:noProof/>
               </w:rPr>
               <w:t>2.2.8</w:t>
@@ -2594,7 +2548,7 @@
             </w:r>
             <w:r>
               <w:rPr>
-                <w:rStyle w:val="Hypertextovodkaz"/>
+                <w:rStyle w:val="Hyperlink"/>
                 <w:noProof/>
               </w:rPr>
               <w:t>Návrh vlastní desky plošných spojů</w:t>
@@ -2651,7 +2605,7 @@
         </w:p>
         <w:p>
           <w:pPr>
-            <w:pStyle w:val="Obsah3"/>
+            <w:pStyle w:val="TOC3"/>
             <w:tabs>
               <w:tab w:val="left" w:pos="1200"/>
               <w:tab w:val="right" w:leader="dot" w:pos="9062"/>
@@ -2668,7 +2622,7 @@
           <w:hyperlink w:anchor="_Toc231758274" w:history="1">
             <w:r>
               <w:rPr>
-                <w:rStyle w:val="Hypertextovodkaz"/>
+                <w:rStyle w:val="Hyperlink"/>
                 <w:noProof/>
               </w:rPr>
               <w:t>2.2.9</w:t>
@@ -2686,7 +2640,7 @@
             </w:r>
             <w:r>
               <w:rPr>
-                <w:rStyle w:val="Hypertextovodkaz"/>
+                <w:rStyle w:val="Hyperlink"/>
                 <w:noProof/>
               </w:rPr>
               <w:t>Vývoj gateway serveru a administračního rozhraní</w:t>
@@ -2743,7 +2697,7 @@
         </w:p>
         <w:p>
           <w:pPr>
-            <w:pStyle w:val="Obsah3"/>
+            <w:pStyle w:val="TOC3"/>
             <w:tabs>
               <w:tab w:val="left" w:pos="1440"/>
               <w:tab w:val="right" w:leader="dot" w:pos="9062"/>
@@ -2760,7 +2714,7 @@
           <w:hyperlink w:anchor="_Toc231758275" w:history="1">
             <w:r>
               <w:rPr>
-                <w:rStyle w:val="Hypertextovodkaz"/>
+                <w:rStyle w:val="Hyperlink"/>
                 <w:noProof/>
               </w:rPr>
               <w:t>2.2.10</w:t>
@@ -2778,7 +2732,7 @@
             </w:r>
             <w:r>
               <w:rPr>
-                <w:rStyle w:val="Hypertextovodkaz"/>
+                <w:rStyle w:val="Hyperlink"/>
                 <w:noProof/>
               </w:rPr>
               <w:t>Vývoj testovacího prostředí Playground</w:t>
@@ -2835,7 +2789,7 @@
         </w:p>
         <w:p>
           <w:pPr>
-            <w:pStyle w:val="Obsah3"/>
+            <w:pStyle w:val="TOC3"/>
             <w:tabs>
               <w:tab w:val="left" w:pos="1440"/>
               <w:tab w:val="right" w:leader="dot" w:pos="9062"/>
@@ -2852,7 +2806,7 @@
           <w:hyperlink w:anchor="_Toc231758276" w:history="1">
             <w:r>
               <w:rPr>
-                <w:rStyle w:val="Hypertextovodkaz"/>
+                <w:rStyle w:val="Hyperlink"/>
                 <w:noProof/>
               </w:rPr>
               <w:t>2.2.11</w:t>
@@ -2870,7 +2824,7 @@
             </w:r>
             <w:r>
               <w:rPr>
-                <w:rStyle w:val="Hypertextovodkaz"/>
+                <w:rStyle w:val="Hyperlink"/>
                 <w:noProof/>
               </w:rPr>
               <w:t>Integrace systému a identifikované problémy</w:t>
@@ -2927,7 +2881,7 @@
         </w:p>
         <w:p>
           <w:pPr>
-            <w:pStyle w:val="Obsah2"/>
+            <w:pStyle w:val="TOC2"/>
             <w:tabs>
               <w:tab w:val="left" w:pos="960"/>
               <w:tab w:val="right" w:leader="dot" w:pos="9062"/>
@@ -2944,7 +2898,7 @@
           <w:hyperlink w:anchor="_Toc231758277" w:history="1">
             <w:r>
               <w:rPr>
-                <w:rStyle w:val="Hypertextovodkaz"/>
+                <w:rStyle w:val="Hyperlink"/>
                 <w:noProof/>
               </w:rPr>
               <w:t>2.3</w:t>
@@ -2962,7 +2916,7 @@
             </w:r>
             <w:r>
               <w:rPr>
-                <w:rStyle w:val="Hypertextovodkaz"/>
+                <w:rStyle w:val="Hyperlink"/>
                 <w:noProof/>
               </w:rPr>
               <w:t>Popis pro uživatele</w:t>
@@ -3019,7 +2973,7 @@
         </w:p>
         <w:p>
           <w:pPr>
-            <w:pStyle w:val="Obsah3"/>
+            <w:pStyle w:val="TOC3"/>
             <w:tabs>
               <w:tab w:val="left" w:pos="1200"/>
               <w:tab w:val="right" w:leader="dot" w:pos="9062"/>
@@ -3036,7 +2990,7 @@
           <w:hyperlink w:anchor="_Toc231758278" w:history="1">
             <w:r>
               <w:rPr>
-                <w:rStyle w:val="Hypertextovodkaz"/>
+                <w:rStyle w:val="Hyperlink"/>
                 <w:noProof/>
               </w:rPr>
               <w:t>2.3.1</w:t>
@@ -3054,7 +3008,7 @@
             </w:r>
             <w:r>
               <w:rPr>
-                <w:rStyle w:val="Hypertextovodkaz"/>
+                <w:rStyle w:val="Hyperlink"/>
                 <w:noProof/>
               </w:rPr>
               <w:t>Návod k použití zařízení</w:t>
@@ -3111,7 +3065,7 @@
         </w:p>
         <w:p>
           <w:pPr>
-            <w:pStyle w:val="Obsah2"/>
+            <w:pStyle w:val="TOC2"/>
             <w:tabs>
               <w:tab w:val="left" w:pos="960"/>
               <w:tab w:val="right" w:leader="dot" w:pos="9062"/>
@@ -3128,7 +3082,7 @@
           <w:hyperlink w:anchor="_Toc231758279" w:history="1">
             <w:r>
               <w:rPr>
-                <w:rStyle w:val="Hypertextovodkaz"/>
+                <w:rStyle w:val="Hyperlink"/>
                 <w:noProof/>
               </w:rPr>
               <w:t>2.4</w:t>
@@ -3146,7 +3100,7 @@
             </w:r>
             <w:r>
               <w:rPr>
-                <w:rStyle w:val="Hypertextovodkaz"/>
+                <w:rStyle w:val="Hyperlink"/>
                 <w:noProof/>
               </w:rPr>
               <w:t>Rozšíření hardwarových funkcí prototypu</w:t>
@@ -3203,7 +3157,7 @@
         </w:p>
         <w:p>
           <w:pPr>
-            <w:pStyle w:val="Obsah2"/>
+            <w:pStyle w:val="TOC2"/>
             <w:tabs>
               <w:tab w:val="left" w:pos="960"/>
               <w:tab w:val="right" w:leader="dot" w:pos="9062"/>
@@ -3220,7 +3174,7 @@
           <w:hyperlink w:anchor="_Toc231758280" w:history="1">
             <w:r>
               <w:rPr>
-                <w:rStyle w:val="Hypertextovodkaz"/>
+                <w:rStyle w:val="Hyperlink"/>
                 <w:noProof/>
               </w:rPr>
               <w:t>2.5</w:t>
@@ -3238,7 +3192,7 @@
             </w:r>
             <w:r>
               <w:rPr>
-                <w:rStyle w:val="Hypertextovodkaz"/>
+                <w:rStyle w:val="Hyperlink"/>
                 <w:noProof/>
               </w:rPr>
               <w:t>Testování a bezpečnostní opatření</w:t>
@@ -3295,7 +3249,7 @@
         </w:p>
         <w:p>
           <w:pPr>
-            <w:pStyle w:val="Obsah1"/>
+            <w:pStyle w:val="TOC1"/>
             <w:tabs>
               <w:tab w:val="right" w:leader="dot" w:pos="9062"/>
             </w:tabs>
@@ -3311,7 +3265,7 @@
           <w:hyperlink w:anchor="_Toc231758281" w:history="1">
             <w:r>
               <w:rPr>
-                <w:rStyle w:val="Hypertextovodkaz"/>
+                <w:rStyle w:val="Hyperlink"/>
                 <w:noProof/>
               </w:rPr>
               <w:t>Závěr</w:t>
@@ -3368,7 +3322,7 @@
         </w:p>
         <w:p>
           <w:pPr>
-            <w:pStyle w:val="Obsah1"/>
+            <w:pStyle w:val="TOC1"/>
             <w:tabs>
               <w:tab w:val="right" w:leader="dot" w:pos="9062"/>
             </w:tabs>
@@ -3384,7 +3338,7 @@
           <w:hyperlink w:anchor="_Toc231758282" w:history="1">
             <w:r>
               <w:rPr>
-                <w:rStyle w:val="Hypertextovodkaz"/>
+                <w:rStyle w:val="Hyperlink"/>
                 <w:noProof/>
               </w:rPr>
               <w:t>Seznam použitých zdrojů</w:t>
@@ -3441,7 +3395,7 @@
         </w:p>
         <w:p>
           <w:pPr>
-            <w:pStyle w:val="Obsah1"/>
+            <w:pStyle w:val="TOC1"/>
             <w:tabs>
               <w:tab w:val="right" w:leader="dot" w:pos="9062"/>
             </w:tabs>
@@ -3457,7 +3411,7 @@
           <w:hyperlink w:anchor="_Toc231758283" w:history="1">
             <w:r>
               <w:rPr>
-                <w:rStyle w:val="Hypertextovodkaz"/>
+                <w:rStyle w:val="Hyperlink"/>
                 <w:noProof/>
               </w:rPr>
               <w:t>Seznam obrázků</w:t>
@@ -3514,7 +3468,7 @@
         </w:p>
         <w:p>
           <w:pPr>
-            <w:pStyle w:val="Obsah1"/>
+            <w:pStyle w:val="TOC1"/>
             <w:tabs>
               <w:tab w:val="right" w:leader="dot" w:pos="9062"/>
             </w:tabs>
@@ -3530,7 +3484,7 @@
           <w:hyperlink w:anchor="_Toc231758284" w:history="1">
             <w:r>
               <w:rPr>
-                <w:rStyle w:val="Hypertextovodkaz"/>
+                <w:rStyle w:val="Hyperlink"/>
                 <w:noProof/>
               </w:rPr>
               <w:t>Seznam tabulek</w:t>
@@ -3587,7 +3541,7 @@
         </w:p>
         <w:p>
           <w:pPr>
-            <w:pStyle w:val="Obsah1"/>
+            <w:pStyle w:val="TOC1"/>
             <w:tabs>
               <w:tab w:val="right" w:leader="dot" w:pos="9062"/>
             </w:tabs>
@@ -3603,7 +3557,7 @@
           <w:hyperlink w:anchor="_Toc231758285" w:history="1">
             <w:r>
               <w:rPr>
-                <w:rStyle w:val="Hypertextovodkaz"/>
+                <w:rStyle w:val="Hyperlink"/>
                 <w:noProof/>
               </w:rPr>
               <w:t>Seznam kódů</w:t>
@@ -3660,7 +3614,7 @@
         </w:p>
         <w:p>
           <w:pPr>
-            <w:pStyle w:val="Obsah1"/>
+            <w:pStyle w:val="TOC1"/>
             <w:tabs>
               <w:tab w:val="right" w:leader="dot" w:pos="9062"/>
             </w:tabs>
@@ -3676,7 +3630,7 @@
           <w:hyperlink w:anchor="_Toc231758286" w:history="1">
             <w:r>
               <w:rPr>
-                <w:rStyle w:val="Hypertextovodkaz"/>
+                <w:rStyle w:val="Hyperlink"/>
                 <w:noProof/>
               </w:rPr>
               <w:t>Obsah média</w:t>
@@ -3813,7 +3767,7 @@
     </w:p>
     <w:p>
       <w:pPr>
-        <w:pStyle w:val="Nadpis1"/>
+        <w:pStyle w:val="Heading1"/>
         <w:pBdr>
           <w:bottom w:val="single" w:sz="4" w:space="1" w:color="FFC000"/>
         </w:pBdr>
@@ -3828,7 +3782,7 @@
     </w:p>
     <w:p>
       <w:pPr>
-        <w:pStyle w:val="Nadpis2"/>
+        <w:pStyle w:val="Heading2"/>
       </w:pPr>
       <w:bookmarkStart w:id="2" w:name="_Toc231758255"/>
       <w:r>
@@ -3838,7 +3792,7 @@
     </w:p>
     <w:p>
       <w:pPr>
-        <w:pStyle w:val="Nadpis3"/>
+        <w:pStyle w:val="Heading3"/>
       </w:pPr>
       <w:bookmarkStart w:id="3" w:name="_Toc231758256"/>
       <w:r>
@@ -3971,7 +3925,7 @@
     </w:p>
     <w:p>
       <w:pPr>
-        <w:pStyle w:val="Titulek"/>
+        <w:pStyle w:val="Caption"/>
         <w:jc w:val="center"/>
       </w:pPr>
       <w:bookmarkStart w:id="4" w:name="_Toc219099614"/>
@@ -3979,27 +3933,14 @@
       <w:r>
         <w:t xml:space="preserve">Obrázek </w:t>
       </w:r>
-      <w:r>
-        <w:fldChar w:fldCharType="begin"/>
-      </w:r>
-      <w:r>
-        <w:instrText xml:space="preserve"> SEQ Obrázek \* ARABIC </w:instrText>
-      </w:r>
-      <w:r>
-        <w:fldChar w:fldCharType="separate"/>
-      </w:r>
-      <w:r>
-        <w:rPr>
-          <w:noProof/>
-        </w:rPr>
-        <w:t>1</w:t>
-      </w:r>
-      <w:r>
-        <w:rPr>
-          <w:noProof/>
-        </w:rPr>
-        <w:fldChar w:fldCharType="end"/>
-      </w:r>
+      <w:fldSimple w:instr=" SEQ Obrázek \* ARABIC ">
+        <w:r>
+          <w:rPr>
+            <w:noProof/>
+          </w:rPr>
+          <w:t>1</w:t>
+        </w:r>
+      </w:fldSimple>
       <w:r>
         <w:t xml:space="preserve">: </w:t>
       </w:r>
@@ -4061,7 +4002,7 @@
     </w:p>
     <w:p>
       <w:pPr>
-        <w:pStyle w:val="Nadpis3"/>
+        <w:pStyle w:val="Heading3"/>
       </w:pPr>
       <w:bookmarkStart w:id="6" w:name="_Toc231758257"/>
       <w:r>
@@ -4091,7 +4032,19 @@
         <w:pStyle w:val="Normlntext"/>
       </w:pPr>
       <w:r>
-        <w:t>Laser game mě inspirovala hlavně základním principem hry, tedy vyhodnocováním zásahů v reálném čase. Zároveň má ale i omezení, například nutnost speciální arény a pevně daného prostoru. Právě tyto omezení byly jedním z důvodů, proč jsem se chtěl zaměřit na jiné řešení herního systému.</w:t>
+        <w:t>Laser game mě inspirovala hlavně základním principem hry, tedy vyhodnocováním zásahů v reálném čase. Zároveň má ale i omezení, například nutnost speciální arény a pevně daného prostoru. Právě t</w:t>
+      </w:r>
+      <w:r>
+        <w:t>a</w:t>
+      </w:r>
+      <w:r>
+        <w:t>to omezení byl</w:t>
+      </w:r>
+      <w:r>
+        <w:t>a</w:t>
+      </w:r>
+      <w:r>
+        <w:t xml:space="preserve"> jedním z důvodů, proč jsem se chtěl zaměřit na jiné řešení herního systému.</w:t>
       </w:r>
       <w:sdt>
         <w:sdtPr>
@@ -4122,7 +4075,7 @@
     </w:p>
     <w:p>
       <w:pPr>
-        <w:pStyle w:val="Nadpis3"/>
+        <w:pStyle w:val="Heading3"/>
       </w:pPr>
       <w:bookmarkStart w:id="7" w:name="_Toc231758258"/>
       <w:r>
@@ -4135,7 +4088,13 @@
         <w:pStyle w:val="Normlntext"/>
       </w:pPr>
       <w:r>
-        <w:t>Pohybové senzory se dnes často používají v různých herních zařízeních. Nejčastěji se jedná o akcelerometry a gyroskopy, které dokážou snímat pohyb, náklon nebo otáčení zařízení. Tyto senzory se běžně nachází například v herních ovladačích, mobilních telefonech nebo ve virtuální realitě.</w:t>
+        <w:t>Pohybové senzory se dnes často používají v různých herních zařízeních. Nejčastěji se jedná o akcelerometry a gyroskopy, které dokážou snímat pohyb, náklon nebo otáčení zařízení. Tyto senzory se běžně nacház</w:t>
+      </w:r>
+      <w:r>
+        <w:t>ej</w:t>
+      </w:r>
+      <w:r>
+        <w:t>í například v herních ovladačích, mobilních telefonech nebo ve virtuální realitě.</w:t>
       </w:r>
       <w:sdt>
         <w:sdtPr>
@@ -4211,7 +4170,7 @@
     </w:p>
     <w:p>
       <w:pPr>
-        <w:pStyle w:val="Nadpis2"/>
+        <w:pStyle w:val="Heading2"/>
       </w:pPr>
       <w:bookmarkStart w:id="8" w:name="_Toc231758259"/>
       <w:r>
@@ -4225,7 +4184,19 @@
         <w:pStyle w:val="Normlntext"/>
       </w:pPr>
       <w:r>
-        <w:t>V této kapitole jsou popsány technologie, které byly použity nebo zvažovány při zpracování ročníkové práce. Kapitola se zaměřuje na hardwarové i softwarové technologie, vývojové prostředí a další nástroje využité při návrhu a realizaci projektu. U jednotlivých technologií je uveden jejich obecný popis a následně způsob využití v rámci tohoto projektu.</w:t>
+        <w:t>V této kapitole jsou popsány technologie, které byly použity nebo zvažovány při zpracování ročníkové práce. Kapitola se zaměřuje na hardwarové i softwarové technologie, vývojové prostředí a další nástroje využité při návrhu a realizaci projektu. U jednotlivých technologií j</w:t>
+      </w:r>
+      <w:r>
+        <w:t>sou</w:t>
+      </w:r>
+      <w:r>
+        <w:t xml:space="preserve"> uveden</w:t>
+      </w:r>
+      <w:r>
+        <w:t>y</w:t>
+      </w:r>
+      <w:r>
+        <w:t xml:space="preserve"> jejich obecný popis a následně způsob využití v rámci tohoto projektu.</w:t>
       </w:r>
       <w:r>
         <w:t xml:space="preserve"> </w:t>
@@ -4233,7 +4204,7 @@
     </w:p>
     <w:p>
       <w:pPr>
-        <w:pStyle w:val="Nadpis3"/>
+        <w:pStyle w:val="Heading3"/>
       </w:pPr>
       <w:bookmarkStart w:id="9" w:name="_Toc231758260"/>
       <w:r>
@@ -4246,23 +4217,13 @@
         <w:pStyle w:val="Normlntext"/>
       </w:pPr>
       <w:r>
-        <w:t xml:space="preserve">ESP32-C6 je mikrokontrolér určený pro </w:t>
-      </w:r>
-      <w:proofErr w:type="spellStart"/>
-      <w:r>
-        <w:t>embedded</w:t>
-      </w:r>
-      <w:proofErr w:type="spellEnd"/>
-      <w:r>
-        <w:t xml:space="preserve"> aplikace, který kombinuje výpočetní výkon s podporou moderních bezdrátových technologií, jako je Wi-Fi a Bluetooth. Je navržen pro použití v </w:t>
-      </w:r>
-      <w:proofErr w:type="spellStart"/>
-      <w:r>
-        <w:t>IoT</w:t>
-      </w:r>
-      <w:proofErr w:type="spellEnd"/>
-      <w:r>
-        <w:t xml:space="preserve"> a interaktivních systémech a umožňuje přímou práci s periferiemi mikrokontroléru. </w:t>
+        <w:t>ESP32-C6 je mikrokontrolér určený pro embedded aplikace, který kombinuje výpočetní výkon s podporou moderních bezdrátových technologií, jako j</w:t>
+      </w:r>
+      <w:r>
+        <w:t>sou</w:t>
+      </w:r>
+      <w:r>
+        <w:t xml:space="preserve"> Wi-Fi a Bluetooth. Je navržen pro použití v IoT a interaktivních systémech a umožňuje přímou práci s periferiemi mikrokontroléru. </w:t>
       </w:r>
       <w:sdt>
         <w:sdtPr>
@@ -4296,39 +4257,7 @@
         <w:pStyle w:val="Normlntext"/>
       </w:pPr>
       <w:r>
-        <w:t xml:space="preserve">Pro programování mikrokontroléru ESP32-C6 existuje několik vývojových prostředí, mezi nejpoužívanější patří </w:t>
-      </w:r>
-      <w:proofErr w:type="spellStart"/>
-      <w:r>
-        <w:t>Arduino</w:t>
-      </w:r>
-      <w:proofErr w:type="spellEnd"/>
-      <w:r>
-        <w:t xml:space="preserve"> IDE a ESP-IDF. ESP-IDF (</w:t>
-      </w:r>
-      <w:proofErr w:type="spellStart"/>
-      <w:r>
-        <w:t>Espressif</w:t>
-      </w:r>
-      <w:proofErr w:type="spellEnd"/>
-      <w:r>
-        <w:t xml:space="preserve"> </w:t>
-      </w:r>
-      <w:proofErr w:type="spellStart"/>
-      <w:r>
-        <w:t>IoT</w:t>
-      </w:r>
-      <w:proofErr w:type="spellEnd"/>
-      <w:r>
-        <w:t xml:space="preserve"> Development Framework) je oficiální vývojové prostředí výrobce </w:t>
-      </w:r>
-      <w:proofErr w:type="spellStart"/>
-      <w:r>
-        <w:t>Espressif</w:t>
-      </w:r>
-      <w:proofErr w:type="spellEnd"/>
-      <w:r>
-        <w:t xml:space="preserve">, které poskytuje přímý přístup k hardwarovým funkcím mikrokontroléru a je určeno především pro pokročilejší vývoj vestavěných systémů. </w:t>
+        <w:t xml:space="preserve">Pro programování mikrokontroléru ESP32-C6 existuje několik vývojových prostředí, mezi nejpoužívanější patří Arduino IDE a ESP-IDF. ESP-IDF (Espressif IoT Development Framework) je oficiální vývojové prostředí výrobce Espressif, které poskytuje přímý přístup k hardwarovým funkcím mikrokontroléru a je určeno především pro pokročilejší vývoj vestavěných systémů. </w:t>
       </w:r>
       <w:sdt>
         <w:sdtPr>
@@ -4375,33 +4304,20 @@
     </w:p>
     <w:p>
       <w:pPr>
-        <w:pStyle w:val="Titulek"/>
+        <w:pStyle w:val="Caption"/>
       </w:pPr>
       <w:bookmarkStart w:id="10" w:name="_Toc231758245"/>
       <w:r>
         <w:t xml:space="preserve">Tabulka </w:t>
       </w:r>
-      <w:r>
-        <w:fldChar w:fldCharType="begin"/>
-      </w:r>
-      <w:r>
-        <w:instrText xml:space="preserve"> SEQ Tabulka \* ARABIC </w:instrText>
-      </w:r>
-      <w:r>
-        <w:fldChar w:fldCharType="separate"/>
-      </w:r>
-      <w:r>
-        <w:rPr>
-          <w:noProof/>
-        </w:rPr>
-        <w:t>1</w:t>
-      </w:r>
-      <w:r>
-        <w:rPr>
-          <w:noProof/>
-        </w:rPr>
-        <w:fldChar w:fldCharType="end"/>
-      </w:r>
+      <w:fldSimple w:instr=" SEQ Tabulka \* ARABIC ">
+        <w:r>
+          <w:rPr>
+            <w:noProof/>
+          </w:rPr>
+          <w:t>1</w:t>
+        </w:r>
+      </w:fldSimple>
       <w:r>
         <w:t>: Vývojové prostředí</w:t>
       </w:r>
@@ -4409,7 +4325,7 @@
     </w:p>
     <w:tbl>
       <w:tblPr>
-        <w:tblStyle w:val="Mkatabulky"/>
+        <w:tblStyle w:val="TableGrid"/>
         <w:tblW w:w="0" w:type="auto"/>
         <w:tblBorders>
           <w:top w:val="single" w:sz="12" w:space="0" w:color="auto"/>
@@ -4462,13 +4378,8 @@
               <w:ind w:firstLine="0"/>
               <w:jc w:val="center"/>
             </w:pPr>
-            <w:proofErr w:type="spellStart"/>
-            <w:r>
-              <w:t>Arduino</w:t>
-            </w:r>
-            <w:proofErr w:type="spellEnd"/>
-            <w:r>
-              <w:t xml:space="preserve"> IDE</w:t>
+            <w:r>
+              <w:t>Arduino IDE</w:t>
             </w:r>
           </w:p>
         </w:tc>
@@ -4833,7 +4744,7 @@
     </w:tbl>
     <w:p>
       <w:pPr>
-        <w:pStyle w:val="Nadpis3"/>
+        <w:pStyle w:val="Heading3"/>
       </w:pPr>
       <w:bookmarkStart w:id="11" w:name="_Toc231758261"/>
       <w:r>
@@ -4846,21 +4757,7 @@
         <w:pStyle w:val="Normlntext"/>
       </w:pPr>
       <w:r>
-        <w:t xml:space="preserve">Ultra </w:t>
-      </w:r>
-      <w:proofErr w:type="spellStart"/>
-      <w:r>
-        <w:t>Wideband</w:t>
-      </w:r>
-      <w:proofErr w:type="spellEnd"/>
-      <w:r>
-        <w:t xml:space="preserve"> (</w:t>
-      </w:r>
-      <w:r>
-        <w:t xml:space="preserve">dále jen </w:t>
-      </w:r>
-      <w:r>
-        <w:t>UWB) je bezdrátová technologie určená pro přesné určování vzdálenosti a polohy zařízení v prostoru. Na rozdíl od běžných technologií, jako jsou Wi-Fi nebo Bluetooth, využívá velmi krátké rádiové impulsy rozprostřené přes široké frekvenční pásmo. Díky tomu je možné dosahovat vysoké přesnosti měření vzdálenosti mezi jednotlivými zařízeními.</w:t>
+        <w:t>Ultra Wideband (dále jen UWB) je bezdrátová technologie určená pro přesné určování vzdálenosti a polohy zařízení v prostoru. Na rozdíl od běžných technologií, jako jsou Wi-Fi nebo Bluetooth, využívá velmi krátké rádiové impulsy rozprostřené přes široké frekvenční pásmo. Díky tomu je možné dosahovat vysoké přesnosti měření vzdálenosti mezi jednotlivými zařízeními.</w:t>
       </w:r>
     </w:p>
     <w:p>
@@ -4916,7 +4813,7 @@
     </w:p>
     <w:p>
       <w:pPr>
-        <w:pStyle w:val="Nadpis3"/>
+        <w:pStyle w:val="Heading3"/>
       </w:pPr>
       <w:bookmarkStart w:id="12" w:name="_Toc231758262"/>
       <w:r>
@@ -5044,33 +4941,20 @@
     </w:p>
     <w:p>
       <w:pPr>
-        <w:pStyle w:val="Titulek"/>
+        <w:pStyle w:val="Caption"/>
       </w:pPr>
       <w:bookmarkStart w:id="13" w:name="_Toc231758246"/>
       <w:r>
         <w:t xml:space="preserve">Tabulka </w:t>
       </w:r>
-      <w:r>
-        <w:fldChar w:fldCharType="begin"/>
-      </w:r>
-      <w:r>
-        <w:instrText xml:space="preserve"> SEQ Tabulka \* ARABIC </w:instrText>
-      </w:r>
-      <w:r>
-        <w:fldChar w:fldCharType="separate"/>
-      </w:r>
-      <w:r>
-        <w:rPr>
-          <w:noProof/>
-        </w:rPr>
-        <w:t>2</w:t>
-      </w:r>
-      <w:r>
-        <w:rPr>
-          <w:noProof/>
-        </w:rPr>
-        <w:fldChar w:fldCharType="end"/>
-      </w:r>
+      <w:fldSimple w:instr=" SEQ Tabulka \* ARABIC ">
+        <w:r>
+          <w:rPr>
+            <w:noProof/>
+          </w:rPr>
+          <w:t>2</w:t>
+        </w:r>
+      </w:fldSimple>
       <w:r>
         <w:t>: Komponenty.</w:t>
       </w:r>
@@ -5078,7 +4962,7 @@
     </w:p>
     <w:tbl>
       <w:tblPr>
-        <w:tblStyle w:val="Mkatabulky"/>
+        <w:tblStyle w:val="TableGrid"/>
         <w:tblW w:w="9072" w:type="dxa"/>
         <w:tblInd w:w="-15" w:type="dxa"/>
         <w:tblBorders>
@@ -5365,10 +5249,7 @@
               <w:jc w:val="center"/>
             </w:pPr>
             <w:r>
-              <w:t>GY-BMI16</w:t>
-            </w:r>
-            <w:r>
-              <w:t>0</w:t>
+              <w:t>GY-BMI160</w:t>
             </w:r>
           </w:p>
         </w:tc>
@@ -5594,13 +5475,7 @@
               <w:rPr>
                 <w:bCs/>
               </w:rPr>
-              <w:t>Nabíječka</w:t>
-            </w:r>
-            <w:r>
-              <w:rPr>
-                <w:bCs/>
-              </w:rPr>
-              <w:t xml:space="preserve"> </w:t>
+              <w:t xml:space="preserve">Nabíječka </w:t>
             </w:r>
             <w:r>
               <w:t>TP4056 s ochranou USB-C</w:t>
@@ -5913,7 +5788,7 @@
     </w:p>
     <w:p>
       <w:pPr>
-        <w:pStyle w:val="Nadpis1"/>
+        <w:pStyle w:val="Heading1"/>
         <w:pBdr>
           <w:bottom w:val="single" w:sz="4" w:space="1" w:color="FFC000"/>
         </w:pBdr>
@@ -5922,10 +5797,7 @@
       <w:bookmarkStart w:id="14" w:name="_Toc231758263"/>
       <w:r>
         <w:lastRenderedPageBreak/>
-        <w:t>Praktická</w:t>
-      </w:r>
-      <w:r>
-        <w:t xml:space="preserve"> část</w:t>
+        <w:t>Praktická část</w:t>
       </w:r>
       <w:bookmarkEnd w:id="14"/>
     </w:p>
@@ -5934,15 +5806,19 @@
         <w:pStyle w:val="Normlntext"/>
       </w:pPr>
       <w:r>
-        <w:t xml:space="preserve">Praktická část práce popisuje postup realizace projektu od prvotního průzkumu až po vývoj a testování jednotlivých částí systému. Jednotlivé kroky jsou řazeny podle průběhu vývoje projektu během školního roku. V této části je popsán návrh řešení, realizace prvního prototypu, vývoj lokalizačních kotev využívajících technologii UWB, návrh vlastní desky plošných spojů, vývoj serverové části systému a testovacího prostředí </w:t>
-      </w:r>
-      <w:proofErr w:type="spellStart"/>
-      <w:r>
-        <w:t>Playground</w:t>
-      </w:r>
-      <w:proofErr w:type="spellEnd"/>
-      <w:r>
-        <w:t>. Součástí kapitoly je také popis identifikovaných problémů a jejich řešení v průběhu vývoje projektu.</w:t>
+        <w:t>Praktická část práce popisuje postup realizace projektu od prvotního průzkumu až po vývoj a testování jednotlivých částí systému. Jednotlivé kroky jsou řazeny podle průběhu vývoje projektu během školního roku. V této části j</w:t>
+      </w:r>
+      <w:r>
+        <w:t>sou</w:t>
+      </w:r>
+      <w:r>
+        <w:t xml:space="preserve"> popsán</w:t>
+      </w:r>
+      <w:r>
+        <w:t>y</w:t>
+      </w:r>
+      <w:r>
+        <w:t xml:space="preserve"> návrh řešení, realizace prvního prototypu, vývoj lokalizačních kotev využívajících technologii UWB, návrh vlastní desky plošných spojů, vývoj serverové části systému a testovacího prostředí Playground. Součástí kapitoly je také popis identifikovaných problémů a jejich řešení v průběhu vývoje projektu.</w:t>
       </w:r>
     </w:p>
     <w:p>
@@ -5952,7 +5828,7 @@
     </w:p>
     <w:p>
       <w:pPr>
-        <w:pStyle w:val="Nadpis2"/>
+        <w:pStyle w:val="Heading2"/>
         <w:pBdr>
           <w:bottom w:val="single" w:sz="4" w:space="1" w:color="FFE79B"/>
         </w:pBdr>
@@ -5968,10 +5844,7 @@
         <w:pStyle w:val="Normlntext"/>
       </w:pPr>
       <w:r>
-        <w:t xml:space="preserve">V úvodní fázi projektu byl proveden průzkum dostupných elektronických modulů a technologií, které bylo možné v projektu využít. Tento průzkum zahrnoval porovnání základních parametrů jednotlivých komponent, jejich ceny a dostupnosti u dodavatelů. </w:t>
-      </w:r>
-      <w:r>
-        <w:t>Pro další rozhodování byla na základě získaných informací využita srovnávací tabulka uvedená v předchozí kapitole.</w:t>
+        <w:t>V úvodní fázi projektu byl proveden průzkum dostupných elektronických modulů a technologií, které bylo možné v projektu využít. Tento průzkum zahrnoval porovnání základních parametrů jednotlivých komponent, jejich cen a dostupnosti u dodavatelů. Pro další rozhodování byla na základě získaných informací využita srovnávací tabulka uvedená v předchozí kapitole.</w:t>
       </w:r>
     </w:p>
     <w:p>
@@ -5979,15 +5852,19 @@
         <w:pStyle w:val="Normlntext"/>
       </w:pPr>
       <w:r>
-        <w:t xml:space="preserve">Součástí návrhové fáze byl také průzkum vývojových prostředí vhodných pro mikrokontrolér ESP32. Byla zvažována prostředí </w:t>
-      </w:r>
-      <w:proofErr w:type="spellStart"/>
-      <w:r>
-        <w:t>Arduino</w:t>
-      </w:r>
-      <w:proofErr w:type="spellEnd"/>
-      <w:r>
-        <w:t xml:space="preserve"> IDE a ESP-IDF, která byla nainstalována a stručně otestována. Na základě porovnání jejich možností a náročnosti bylo zvoleno prostředí ESP-IDF, se kterým jsem se během práce postupně učil pracovat.</w:t>
+        <w:t>Součástí návrhové fáze byl také průzkum vývojových prostředí vhodných pro mikrokontrolér ESP32. Byl</w:t>
+      </w:r>
+      <w:r>
+        <w:t>y</w:t>
+      </w:r>
+      <w:r>
+        <w:t xml:space="preserve"> zv</w:t>
+      </w:r>
+      <w:r>
+        <w:t>áženy</w:t>
+      </w:r>
+      <w:r>
+        <w:t xml:space="preserve"> prostředí Arduino IDE a ESP-IDF, která byla nainstalována a stručně otestována. Na základě porovnání jejich možností a náročnosti bylo zvoleno prostředí ESP-IDF, se kterým jsem se během práce postupně učil pracovat.</w:t>
       </w:r>
     </w:p>
     <w:p>
@@ -6049,39 +5926,38 @@
         </w:drawing>
       </w:r>
       <w:r>
-        <w:t>Na základě zvolených komponent a technologií byl vytvořeno blokové schéma zařízení. V této fázi bylo řešeno základní rozdělení systému na jednotlivé funkční části, jako je mikrokontrolér, napájení a senzory, a jejich vzájemná návaznost. Tento návrh sloužil jako podklad pro následnou realizaci projektu.</w:t>
-      </w:r>
-    </w:p>
-    <w:p>
-      <w:pPr>
-        <w:pStyle w:val="Titulek"/>
+        <w:t>Na základě zvolených komponent a technologií byl</w:t>
+      </w:r>
+      <w:r>
+        <w:t>o</w:t>
+      </w:r>
+      <w:r>
+        <w:t xml:space="preserve"> vytvořeno blokové schéma zařízení. V této fázi bylo řešeno základní rozdělení systému na jednotlivé funkční části, jako j</w:t>
+      </w:r>
+      <w:r>
+        <w:t>sou</w:t>
+      </w:r>
+      <w:r>
+        <w:t xml:space="preserve"> mikrokontrolér, napájení a senzory, a jejich vzájemná návaznost. Tento návrh sloužil jako podklad pro následnou realizaci projektu.</w:t>
+      </w:r>
+    </w:p>
+    <w:p>
+      <w:pPr>
+        <w:pStyle w:val="Caption"/>
       </w:pPr>
       <w:bookmarkStart w:id="16" w:name="_Toc219099615"/>
       <w:bookmarkStart w:id="17" w:name="_Toc231758235"/>
       <w:r>
         <w:t xml:space="preserve">Obrázek </w:t>
       </w:r>
-      <w:r>
-        <w:fldChar w:fldCharType="begin"/>
-      </w:r>
-      <w:r>
-        <w:instrText xml:space="preserve"> SEQ Obrázek \* ARABIC </w:instrText>
-      </w:r>
-      <w:r>
-        <w:fldChar w:fldCharType="separate"/>
-      </w:r>
-      <w:r>
-        <w:rPr>
-          <w:noProof/>
-        </w:rPr>
-        <w:t>2</w:t>
-      </w:r>
-      <w:r>
-        <w:rPr>
-          <w:noProof/>
-        </w:rPr>
-        <w:fldChar w:fldCharType="end"/>
-      </w:r>
+      <w:fldSimple w:instr=" SEQ Obrázek \* ARABIC ">
+        <w:r>
+          <w:rPr>
+            <w:noProof/>
+          </w:rPr>
+          <w:t>2</w:t>
+        </w:r>
+      </w:fldSimple>
       <w:r>
         <w:t>: Blokové Schéma</w:t>
       </w:r>
@@ -6108,7 +5984,7 @@
     </w:p>
     <w:p>
       <w:pPr>
-        <w:pStyle w:val="Nadpis2"/>
+        <w:pStyle w:val="Heading2"/>
         <w:pBdr>
           <w:bottom w:val="single" w:sz="4" w:space="1" w:color="FFE79B"/>
         </w:pBdr>
@@ -6131,7 +6007,7 @@
     </w:p>
     <w:p>
       <w:pPr>
-        <w:pStyle w:val="Nadpis3"/>
+        <w:pStyle w:val="Heading3"/>
       </w:pPr>
       <w:bookmarkStart w:id="20" w:name="_Toc231758266"/>
       <w:r>
@@ -6157,7 +6033,7 @@
     </w:p>
     <w:p>
       <w:pPr>
-        <w:pStyle w:val="Nadpis3"/>
+        <w:pStyle w:val="Heading3"/>
       </w:pPr>
       <w:bookmarkStart w:id="21" w:name="_Toc231758267"/>
       <w:r>
@@ -6183,7 +6059,7 @@
     </w:p>
     <w:p>
       <w:pPr>
-        <w:pStyle w:val="Nadpis3"/>
+        <w:pStyle w:val="Heading3"/>
       </w:pPr>
       <w:bookmarkStart w:id="22" w:name="_Toc231758268"/>
       <w:r>
@@ -6217,7 +6093,7 @@
     </w:p>
     <w:p>
       <w:pPr>
-        <w:pStyle w:val="Nadpis3"/>
+        <w:pStyle w:val="Heading3"/>
       </w:pPr>
       <w:bookmarkStart w:id="23" w:name="_Toc231758269"/>
       <w:r>
@@ -6247,12 +6123,18 @@
         <w:pStyle w:val="Normlntext"/>
       </w:pPr>
       <w:r>
-        <w:t>Během testování bylo nutné věnovat pozornost i praktickým aspektům, jako je umístění senzorů, vliv pohybu ruky a potřeba kalibrace. Tyto zkušenosti přispěly k lepšímu pochopení chování senzorů v reálných podmínkách.</w:t>
-      </w:r>
-    </w:p>
-    <w:p>
-      <w:pPr>
-        <w:pStyle w:val="Nadpis3"/>
+        <w:t>Během testování bylo nutné věnovat pozornost i praktickým aspektům, jako j</w:t>
+      </w:r>
+      <w:r>
+        <w:t>sou</w:t>
+      </w:r>
+      <w:r>
+        <w:t xml:space="preserve"> umístění senzorů, vliv pohybu ruky a potřeba kalibrace. Tyto zkušenosti přispěly k lepšímu pochopení chování senzorů v reálných podmínkách.</w:t>
+      </w:r>
+    </w:p>
+    <w:p>
+      <w:pPr>
+        <w:pStyle w:val="Heading3"/>
       </w:pPr>
       <w:bookmarkStart w:id="24" w:name="_Toc231758270"/>
       <w:r>
@@ -6278,7 +6160,7 @@
     </w:p>
     <w:p>
       <w:pPr>
-        <w:pStyle w:val="Nadpis3"/>
+        <w:pStyle w:val="Heading3"/>
       </w:pPr>
       <w:bookmarkStart w:id="25" w:name="_Toc231758271"/>
       <w:r>
@@ -6448,34 +6330,21 @@
     </w:p>
     <w:p>
       <w:pPr>
-        <w:pStyle w:val="Titulek"/>
+        <w:pStyle w:val="Caption"/>
       </w:pPr>
       <w:bookmarkStart w:id="27" w:name="_Toc231758236"/>
       <w:bookmarkEnd w:id="19"/>
       <w:r>
         <w:t xml:space="preserve">Obrázek </w:t>
       </w:r>
-      <w:r>
-        <w:fldChar w:fldCharType="begin"/>
-      </w:r>
-      <w:r>
-        <w:instrText xml:space="preserve"> SEQ Obrázek \* ARABIC </w:instrText>
-      </w:r>
-      <w:r>
-        <w:fldChar w:fldCharType="separate"/>
-      </w:r>
-      <w:r>
-        <w:rPr>
-          <w:noProof/>
-        </w:rPr>
-        <w:t>3</w:t>
-      </w:r>
-      <w:r>
-        <w:rPr>
-          <w:noProof/>
-        </w:rPr>
-        <w:fldChar w:fldCharType="end"/>
-      </w:r>
+      <w:fldSimple w:instr=" SEQ Obrázek \* ARABIC ">
+        <w:r>
+          <w:rPr>
+            <w:noProof/>
+          </w:rPr>
+          <w:t>3</w:t>
+        </w:r>
+      </w:fldSimple>
       <w:r>
         <w:t>: Reálné zapojení</w:t>
       </w:r>
@@ -6483,33 +6352,20 @@
     </w:p>
     <w:p>
       <w:pPr>
-        <w:pStyle w:val="Titulek"/>
+        <w:pStyle w:val="Caption"/>
       </w:pPr>
       <w:bookmarkStart w:id="28" w:name="_Toc231758237"/>
       <w:r>
         <w:t xml:space="preserve">Obrázek </w:t>
       </w:r>
-      <w:r>
-        <w:fldChar w:fldCharType="begin"/>
-      </w:r>
-      <w:r>
-        <w:instrText xml:space="preserve"> SEQ Obrázek \* ARABIC </w:instrText>
-      </w:r>
-      <w:r>
-        <w:fldChar w:fldCharType="separate"/>
-      </w:r>
-      <w:r>
-        <w:rPr>
-          <w:noProof/>
-        </w:rPr>
-        <w:t>4</w:t>
-      </w:r>
-      <w:r>
-        <w:rPr>
-          <w:noProof/>
-        </w:rPr>
-        <w:fldChar w:fldCharType="end"/>
-      </w:r>
+      <w:fldSimple w:instr=" SEQ Obrázek \* ARABIC ">
+        <w:r>
+          <w:rPr>
+            <w:noProof/>
+          </w:rPr>
+          <w:t>4</w:t>
+        </w:r>
+      </w:fldSimple>
       <w:r>
         <w:t>: 1. zkouška zapojení</w:t>
       </w:r>
@@ -6689,12 +6545,18 @@
         </w:drawing>
       </w:r>
       <w:r>
-        <w:t>Součástí této fáze bylo také řešení drobných problémů, které se objevily během testování, a úpravy zapojení a softwaru. Na základě těchto kroků byla postupně ověřena funkčnost celého zařízení jako prototypu splňujícího požadavky zadání ročníkové práce.</w:t>
-      </w:r>
-    </w:p>
-    <w:p>
-      <w:pPr>
-        <w:pStyle w:val="Titulek"/>
+        <w:t>Součástí této fáze byl</w:t>
+      </w:r>
+      <w:r>
+        <w:t>o</w:t>
+      </w:r>
+      <w:r>
+        <w:t xml:space="preserve"> také řešení drobných problémů, které se objevily během testování, a úpravy zapojení a softwaru. Na základě těchto kroků byla postupně ověřena funkčnost celého zařízení jako prototypu splňujícího požadavky zadání ročníkové práce.</w:t>
+      </w:r>
+    </w:p>
+    <w:p>
+      <w:pPr>
+        <w:pStyle w:val="Caption"/>
         <w:sectPr>
           <w:type w:val="continuous"/>
           <w:pgSz w:w="11906" w:h="16838"/>
@@ -6706,33 +6568,20 @@
     </w:p>
     <w:p>
       <w:pPr>
-        <w:pStyle w:val="Titulek"/>
+        <w:pStyle w:val="Caption"/>
       </w:pPr>
       <w:bookmarkStart w:id="29" w:name="_Toc231758238"/>
       <w:r>
         <w:t xml:space="preserve">Obrázek </w:t>
       </w:r>
-      <w:r>
-        <w:fldChar w:fldCharType="begin"/>
-      </w:r>
-      <w:r>
-        <w:instrText xml:space="preserve"> SEQ Obrázek \* ARABIC </w:instrText>
-      </w:r>
-      <w:r>
-        <w:fldChar w:fldCharType="separate"/>
-      </w:r>
-      <w:r>
-        <w:rPr>
-          <w:noProof/>
-        </w:rPr>
-        <w:t>5</w:t>
-      </w:r>
-      <w:r>
-        <w:rPr>
-          <w:noProof/>
-        </w:rPr>
-        <w:fldChar w:fldCharType="end"/>
-      </w:r>
+      <w:fldSimple w:instr=" SEQ Obrázek \* ARABIC ">
+        <w:r>
+          <w:rPr>
+            <w:noProof/>
+          </w:rPr>
+          <w:t>5</w:t>
+        </w:r>
+      </w:fldSimple>
       <w:r>
         <w:t>: Prezentační prototyp</w:t>
       </w:r>
@@ -6740,33 +6589,20 @@
     </w:p>
     <w:p>
       <w:pPr>
-        <w:pStyle w:val="Titulek"/>
+        <w:pStyle w:val="Caption"/>
       </w:pPr>
       <w:bookmarkStart w:id="30" w:name="_Toc231758239"/>
       <w:r>
         <w:t xml:space="preserve">Obrázek </w:t>
       </w:r>
-      <w:r>
-        <w:fldChar w:fldCharType="begin"/>
-      </w:r>
-      <w:r>
-        <w:instrText xml:space="preserve"> SEQ Obrázek \* ARABIC </w:instrText>
-      </w:r>
-      <w:r>
-        <w:fldChar w:fldCharType="separate"/>
-      </w:r>
-      <w:r>
-        <w:rPr>
-          <w:noProof/>
-        </w:rPr>
-        <w:t>6</w:t>
-      </w:r>
-      <w:r>
-        <w:rPr>
-          <w:noProof/>
-        </w:rPr>
-        <w:fldChar w:fldCharType="end"/>
-      </w:r>
+      <w:fldSimple w:instr=" SEQ Obrázek \* ARABIC ">
+        <w:r>
+          <w:rPr>
+            <w:noProof/>
+          </w:rPr>
+          <w:t>6</w:t>
+        </w:r>
+      </w:fldSimple>
       <w:r>
         <w:t>: Prezentační hůlka</w:t>
       </w:r>
@@ -6774,7 +6610,7 @@
     </w:p>
     <w:p>
       <w:pPr>
-        <w:pStyle w:val="Nadpis3"/>
+        <w:pStyle w:val="Heading3"/>
         <w:sectPr>
           <w:type w:val="continuous"/>
           <w:pgSz w:w="11906" w:h="16838"/>
@@ -6786,7 +6622,7 @@
     </w:p>
     <w:p>
       <w:pPr>
-        <w:pStyle w:val="Nadpis3"/>
+        <w:pStyle w:val="Heading3"/>
         <w:rPr>
           <w:sz w:val="26"/>
           <w:szCs w:val="26"/>
@@ -6849,7 +6685,7 @@
     </w:p>
     <w:p>
       <w:pPr>
-        <w:pStyle w:val="Nadpis3"/>
+        <w:pStyle w:val="Heading3"/>
       </w:pPr>
       <w:bookmarkStart w:id="32" w:name="_Toc231758273"/>
       <w:r>
@@ -6870,15 +6706,7 @@
         <w:pStyle w:val="Normlntext"/>
       </w:pPr>
       <w:r>
-        <w:t xml:space="preserve">Návrh byl realizován v programu </w:t>
-      </w:r>
-      <w:proofErr w:type="spellStart"/>
-      <w:r>
-        <w:t>KiCAD</w:t>
-      </w:r>
-      <w:proofErr w:type="spellEnd"/>
-      <w:r>
-        <w:t>, který umožňuje tvorbu elektrických schémat a následný návrh desek plošných spojů. Prvním krokem bylo vytvoření kompletního elektrického schématu obsahujícího mikrokontrolér, napájecí část, senzory a další součásti systému. Během návrhu bylo nutné ověřovat zapojení jednotlivých komponent pomocí technické dokumentace výrobců a průběžně konzultovat návrh s vedoucím projektu.</w:t>
+        <w:t>Návrh byl realizován v programu KiCAD, který umožňuje tvorbu elektrických schémat a následný návrh desek plošných spojů. Prvním krokem bylo vytvoření kompletního elektrického schématu obsahujícího mikrokontrolér, napájecí část, senzory a další součásti systému. Během návrhu bylo nutné ověřovat zapojení jednotlivých komponent pomocí technické dokumentace výrobců a průběžně konzultovat návrh s vedoucím projektu.</w:t>
       </w:r>
     </w:p>
     <w:p>
@@ -6886,23 +6714,7 @@
         <w:pStyle w:val="Normlntext"/>
       </w:pPr>
       <w:r>
-        <w:t xml:space="preserve">Při tvorbě schématu se ukázalo, že některé používané součástky nebyly dostupné v knihovnách programu. Z tohoto důvodu bylo nutné vytvořit vlastní </w:t>
-      </w:r>
-      <w:proofErr w:type="spellStart"/>
-      <w:r>
-        <w:t>footprinty</w:t>
-      </w:r>
-      <w:proofErr w:type="spellEnd"/>
-      <w:r>
-        <w:t xml:space="preserve"> podle rozměrů uvedených v </w:t>
-      </w:r>
-      <w:proofErr w:type="spellStart"/>
-      <w:r>
-        <w:t>datasheetech</w:t>
-      </w:r>
-      <w:proofErr w:type="spellEnd"/>
-      <w:r>
-        <w:t xml:space="preserve"> výrobců. Před jejich vytvořením byla provedena kontrola rozměrů a ověření rozmístění vývodů jednotlivých součástek, aby bylo možné zajistit správné osazení výsledné desky.</w:t>
+        <w:t>Při tvorbě schématu se ukázalo, že některé používané součástky nebyly dostupné v knihovnách programu. Z tohoto důvodu bylo nutné vytvořit vlastní footprinty podle rozměrů uvedených v datasheetech výrobců. Před jejich vytvořením byla provedena kontrola rozměrů a ověření rozmístění vývodů jednotlivých součástek, aby bylo možné zajistit správné osazení výsledné desky.</w:t>
       </w:r>
     </w:p>
     <w:p>
@@ -6945,7 +6757,7 @@
         </w:rPr>
         <w:lastRenderedPageBreak/>
         <w:drawing>
-          <wp:anchor distT="0" distB="0" distL="114300" distR="114300" simplePos="0" relativeHeight="251671552" behindDoc="0" locked="0" layoutInCell="1" allowOverlap="1" wp14:anchorId="1352D36F" wp14:editId="566EE1AC">
+          <wp:anchor distT="0" distB="0" distL="114300" distR="114300" simplePos="0" relativeHeight="251671552" behindDoc="0" locked="0" layoutInCell="1" allowOverlap="1" wp14:anchorId="1352D36F" wp14:editId="6DB742F4">
             <wp:simplePos x="0" y="0"/>
             <wp:positionH relativeFrom="column">
               <wp:posOffset>-13946</wp:posOffset>
@@ -7004,7 +6816,7 @@
     </w:p>
     <w:p>
       <w:pPr>
-        <w:pStyle w:val="Titulek"/>
+        <w:pStyle w:val="Caption"/>
         <w:sectPr>
           <w:type w:val="continuous"/>
           <w:pgSz w:w="11906" w:h="16838"/>
@@ -7016,7 +6828,7 @@
     </w:p>
     <w:p>
       <w:pPr>
-        <w:pStyle w:val="Titulek"/>
+        <w:pStyle w:val="Caption"/>
       </w:pPr>
       <w:bookmarkStart w:id="33" w:name="_Toc231758240"/>
       <w:r>
@@ -7083,66 +6895,35 @@
       <w:r>
         <w:t xml:space="preserve">Obrázek </w:t>
       </w:r>
-      <w:r>
-        <w:fldChar w:fldCharType="begin"/>
-      </w:r>
-      <w:r>
-        <w:instrText xml:space="preserve"> SEQ Obrázek \* ARABIC </w:instrText>
-      </w:r>
-      <w:r>
-        <w:fldChar w:fldCharType="separate"/>
-      </w:r>
-      <w:r>
-        <w:rPr>
-          <w:noProof/>
-        </w:rPr>
-        <w:t>7</w:t>
-      </w:r>
-      <w:r>
-        <w:rPr>
-          <w:noProof/>
-        </w:rPr>
-        <w:fldChar w:fldCharType="end"/>
-      </w:r>
-      <w:r>
-        <w:t xml:space="preserve">: Návrh PCB v programu </w:t>
-      </w:r>
-      <w:proofErr w:type="spellStart"/>
-      <w:r>
-        <w:t>KiCAD</w:t>
+      <w:fldSimple w:instr=" SEQ Obrázek \* ARABIC ">
+        <w:r>
+          <w:rPr>
+            <w:noProof/>
+          </w:rPr>
+          <w:t>7</w:t>
+        </w:r>
+      </w:fldSimple>
+      <w:r>
+        <w:t>: Návrh PCB v programu KiCAD</w:t>
       </w:r>
       <w:bookmarkEnd w:id="33"/>
-      <w:proofErr w:type="spellEnd"/>
-    </w:p>
-    <w:p>
-      <w:pPr>
-        <w:pStyle w:val="Titulek"/>
+    </w:p>
+    <w:p>
+      <w:pPr>
+        <w:pStyle w:val="Caption"/>
       </w:pPr>
       <w:bookmarkStart w:id="34" w:name="_Toc231758241"/>
       <w:r>
         <w:t xml:space="preserve">Obrázek </w:t>
       </w:r>
-      <w:r>
-        <w:fldChar w:fldCharType="begin"/>
-      </w:r>
-      <w:r>
-        <w:instrText xml:space="preserve"> SEQ Obrázek \* ARABIC </w:instrText>
-      </w:r>
-      <w:r>
-        <w:fldChar w:fldCharType="separate"/>
-      </w:r>
-      <w:r>
-        <w:rPr>
-          <w:noProof/>
-        </w:rPr>
-        <w:t>8</w:t>
-      </w:r>
-      <w:r>
-        <w:rPr>
-          <w:noProof/>
-        </w:rPr>
-        <w:fldChar w:fldCharType="end"/>
-      </w:r>
+      <w:fldSimple w:instr=" SEQ Obrázek \* ARABIC ">
+        <w:r>
+          <w:rPr>
+            <w:noProof/>
+          </w:rPr>
+          <w:t>8</w:t>
+        </w:r>
+      </w:fldSimple>
       <w:r>
         <w:t>: Náhled PCB</w:t>
       </w:r>
@@ -7150,7 +6931,7 @@
     </w:p>
     <w:p>
       <w:pPr>
-        <w:pStyle w:val="Nadpis3"/>
+        <w:pStyle w:val="Heading3"/>
         <w:sectPr>
           <w:type w:val="continuous"/>
           <w:pgSz w:w="11906" w:h="16838"/>
@@ -7162,19 +6943,11 @@
     </w:p>
     <w:p>
       <w:pPr>
-        <w:pStyle w:val="Nadpis3"/>
+        <w:pStyle w:val="Heading3"/>
       </w:pPr>
       <w:bookmarkStart w:id="35" w:name="_Toc231758274"/>
       <w:r>
-        <w:t xml:space="preserve">Vývoj </w:t>
-      </w:r>
-      <w:proofErr w:type="spellStart"/>
-      <w:r>
-        <w:t>gateway</w:t>
-      </w:r>
-      <w:proofErr w:type="spellEnd"/>
-      <w:r>
-        <w:t xml:space="preserve"> serveru a administračního rozhraní</w:t>
+        <w:t>Vývoj gateway serveru a administračního rozhraní</w:t>
       </w:r>
       <w:bookmarkEnd w:id="35"/>
     </w:p>
@@ -7183,15 +6956,7 @@
         <w:pStyle w:val="Normlntext"/>
       </w:pPr>
       <w:r>
-        <w:t xml:space="preserve">Součástí dalšího vývoje projektu bylo vytvoření </w:t>
-      </w:r>
-      <w:proofErr w:type="spellStart"/>
-      <w:r>
-        <w:t>gateway</w:t>
-      </w:r>
-      <w:proofErr w:type="spellEnd"/>
-      <w:r>
-        <w:t xml:space="preserve"> serveru a webového administračního rozhraní, které slouží pro správu jednotlivých částí systému Laser Wand. Cílem bylo vytvořit centralizované prostředí umožňující sledování stavu zařízení, konfiguraci herního systému a testování jednotlivých funkcí bez nutnosti přímého zásahu do zdrojového kódu.</w:t>
+        <w:t>Součástí dalšího vývoje projektu bylo vytvoření gateway serveru a webového administračního rozhraní, které slouží pro správu jednotlivých částí systému Laser Wand. Cílem bylo vytvořit centralizované prostředí umožňující sledování stavu zařízení, konfiguraci herního systému a testování jednotlivých funkcí bez nutnosti přímého zásahu do zdrojového kódu.</w:t>
       </w:r>
     </w:p>
     <w:p>
@@ -7216,20 +6981,12 @@
       </w:pPr>
       <w:r>
         <w:lastRenderedPageBreak/>
-        <w:t xml:space="preserve">Vytvoření </w:t>
-      </w:r>
-      <w:proofErr w:type="spellStart"/>
-      <w:r>
-        <w:t>gateway</w:t>
-      </w:r>
-      <w:proofErr w:type="spellEnd"/>
-      <w:r>
-        <w:t xml:space="preserve"> serveru představuje důležitý krok pro další rozvoj projektu, protože umožňuje propojení jednotlivých částí systému do jednoho celku a vytváří základ pro budoucí správu herního prostředí Laser Wand.</w:t>
-      </w:r>
-    </w:p>
-    <w:p>
-      <w:pPr>
-        <w:pStyle w:val="Nadpis3"/>
+        <w:t>Vytvoření gateway serveru představuje důležitý krok pro další rozvoj projektu, protože umožňuje propojení jednotlivých částí systému do jednoho celku a vytváří základ pro budoucí správu herního prostředí Laser Wand.</w:t>
+      </w:r>
+    </w:p>
+    <w:p>
+      <w:pPr>
+        <w:pStyle w:val="Heading3"/>
         <w:sectPr>
           <w:type w:val="continuous"/>
           <w:pgSz w:w="11906" w:h="16838"/>
@@ -7241,46 +6998,28 @@
     </w:p>
     <w:p>
       <w:pPr>
-        <w:pStyle w:val="Nadpis3"/>
+        <w:pStyle w:val="Heading3"/>
       </w:pPr>
       <w:bookmarkStart w:id="36" w:name="_Toc231758275"/>
       <w:r>
-        <w:t xml:space="preserve">Vývoj testovacího prostředí </w:t>
-      </w:r>
-      <w:proofErr w:type="spellStart"/>
-      <w:r>
-        <w:t>Playground</w:t>
+        <w:t>Vývoj testovacího prostředí Playground</w:t>
       </w:r>
       <w:bookmarkEnd w:id="36"/>
-      <w:proofErr w:type="spellEnd"/>
     </w:p>
     <w:p>
       <w:pPr>
         <w:pStyle w:val="Normlntext"/>
       </w:pPr>
       <w:r>
-        <w:t xml:space="preserve">Pro ověřování herních mechanik a testování jednotlivých funkcí systému bylo vytvořeno testovací prostředí nazvané </w:t>
-      </w:r>
-      <w:proofErr w:type="spellStart"/>
-      <w:r>
-        <w:t>Playground</w:t>
-      </w:r>
-      <w:proofErr w:type="spellEnd"/>
-      <w:r>
-        <w:t>. Toto prostředí umožňuje simulovat vybrané části budoucí hry i v době, kdy nebyl k dispozici plně funkční hardware.</w:t>
+        <w:t>Pro ověřování herních mechanik a testování jednotlivých funkcí systému bylo vytvořeno testovací prostředí nazvané Playground. Toto prostředí umožňuje simulovat vybrané části budoucí hry i v době, kdy nebyl k dispozici plně funkční hardware.</w:t>
       </w:r>
     </w:p>
     <w:p>
       <w:pPr>
         <w:pStyle w:val="Normlntext"/>
       </w:pPr>
-      <w:proofErr w:type="spellStart"/>
-      <w:r>
-        <w:t>Playground</w:t>
-      </w:r>
-      <w:proofErr w:type="spellEnd"/>
-      <w:r>
-        <w:t xml:space="preserve"> umožňuje vytváření virtuálních hůlek, správu hráčů a simulaci herních událostí. Součástí systému je také herní mapa obsahující překážky a jednotlivé herní objekty. Testovací prostředí dokáže vyhodnocovat pohyb virtuálních hráčů, zásahy mezi hráči a interakce s překážkami v herním prostoru.</w:t>
+      <w:r>
+        <w:t>Playground umožňuje vytváření virtuálních hůlek, správu hráčů a simulaci herních událostí. Součástí systému je také herní mapa obsahující překážky a jednotlivé herní objekty. Testovací prostředí dokáže vyhodnocovat pohyb virtuálních hráčů, zásahy mezi hráči a interakce s překážkami v herním prostoru.</w:t>
       </w:r>
     </w:p>
     <w:p>
@@ -7288,15 +7027,7 @@
         <w:pStyle w:val="Normlntext"/>
       </w:pPr>
       <w:r>
-        <w:t xml:space="preserve">V rámci </w:t>
-      </w:r>
-      <w:proofErr w:type="spellStart"/>
-      <w:r>
-        <w:t>Playground</w:t>
-      </w:r>
-      <w:proofErr w:type="spellEnd"/>
-      <w:r>
-        <w:t xml:space="preserve"> byl vytvořen také základní systém kouzel a herních akcí. Díky tomu bylo možné testovat logiku budoucí hry ještě před dokončením všech hardwarových částí projektu. Prostředí současně sloužilo jako nástroj pro ověřování návrhu herních mechanik a chování jednotlivých částí systému.</w:t>
+        <w:t>V rámci Playground byl vytvořen také základní systém kouzel a herních akcí. Díky tomu bylo možné testovat logiku budoucí hry ještě před dokončením všech hardwarových částí projektu. Prostředí současně sloužilo jako nástroj pro ověřování návrhu herních mechanik a chování jednotlivých částí systému.</w:t>
       </w:r>
     </w:p>
     <w:p>
@@ -7304,15 +7035,7 @@
         <w:pStyle w:val="Normlntext"/>
       </w:pPr>
       <w:r>
-        <w:t xml:space="preserve">Vytvoření </w:t>
-      </w:r>
-      <w:proofErr w:type="spellStart"/>
-      <w:r>
-        <w:t>Playgroundu</w:t>
-      </w:r>
-      <w:proofErr w:type="spellEnd"/>
-      <w:r>
-        <w:t xml:space="preserve"> umožnilo pokračovat ve vývoji projektu i v době, kdy nebylo možné provádět kompletní testování pomocí fyzické hůlky. Současně poskytlo prostor pro experimentování s herními funkcemi a budoucí podobou systému Laser Wand.</w:t>
+        <w:t>Vytvoření Playgroundu umožnilo pokračovat ve vývoji projektu i v době, kdy nebylo možné provádět kompletní testování pomocí fyzické hůlky. Současně poskytlo prostor pro experimentování s herními funkcemi a budoucí podobou systému Laser Wand.</w:t>
       </w:r>
       <w:r>
         <w:rPr>
@@ -7323,7 +7046,7 @@
     </w:p>
     <w:p>
       <w:pPr>
-        <w:pStyle w:val="Titulek"/>
+        <w:pStyle w:val="Caption"/>
       </w:pPr>
       <w:bookmarkStart w:id="37" w:name="_Toc231758242"/>
       <w:r>
@@ -7382,27 +7105,14 @@
       <w:r>
         <w:t xml:space="preserve">Obrázek </w:t>
       </w:r>
-      <w:r>
-        <w:fldChar w:fldCharType="begin"/>
-      </w:r>
-      <w:r>
-        <w:instrText xml:space="preserve"> SEQ Obrázek \* ARABIC </w:instrText>
-      </w:r>
-      <w:r>
-        <w:fldChar w:fldCharType="separate"/>
-      </w:r>
-      <w:r>
-        <w:rPr>
-          <w:noProof/>
-        </w:rPr>
-        <w:t>9</w:t>
-      </w:r>
-      <w:r>
-        <w:rPr>
-          <w:noProof/>
-        </w:rPr>
-        <w:fldChar w:fldCharType="end"/>
-      </w:r>
+      <w:fldSimple w:instr=" SEQ Obrázek \* ARABIC ">
+        <w:r>
+          <w:rPr>
+            <w:noProof/>
+          </w:rPr>
+          <w:t>9</w:t>
+        </w:r>
+      </w:fldSimple>
       <w:r>
         <w:t>: Administrativní rozhraní</w:t>
       </w:r>
@@ -7430,7 +7140,7 @@
     </w:p>
     <w:p>
       <w:pPr>
-        <w:pStyle w:val="Titulek"/>
+        <w:pStyle w:val="Caption"/>
       </w:pPr>
       <w:bookmarkStart w:id="38" w:name="_Toc231758243"/>
       <w:r>
@@ -7565,27 +7275,14 @@
       <w:r>
         <w:t xml:space="preserve">Obrázek </w:t>
       </w:r>
-      <w:r>
-        <w:fldChar w:fldCharType="begin"/>
-      </w:r>
-      <w:r>
-        <w:instrText xml:space="preserve"> SEQ Obrázek \* ARABIC </w:instrText>
-      </w:r>
-      <w:r>
-        <w:fldChar w:fldCharType="separate"/>
-      </w:r>
-      <w:r>
-        <w:rPr>
-          <w:noProof/>
-        </w:rPr>
-        <w:t>10</w:t>
-      </w:r>
-      <w:r>
-        <w:rPr>
-          <w:noProof/>
-        </w:rPr>
-        <w:fldChar w:fldCharType="end"/>
-      </w:r>
+      <w:fldSimple w:instr=" SEQ Obrázek \* ARABIC ">
+        <w:r>
+          <w:rPr>
+            <w:noProof/>
+          </w:rPr>
+          <w:t>10</w:t>
+        </w:r>
+      </w:fldSimple>
       <w:r>
         <w:t>: Administrativní rozhraní</w:t>
       </w:r>
@@ -7593,47 +7290,29 @@
     </w:p>
     <w:p>
       <w:pPr>
-        <w:pStyle w:val="Titulek"/>
+        <w:pStyle w:val="Caption"/>
         <w:ind w:firstLine="284"/>
       </w:pPr>
       <w:bookmarkStart w:id="39" w:name="_Toc231758244"/>
       <w:r>
         <w:t xml:space="preserve">Obrázek </w:t>
       </w:r>
-      <w:r>
-        <w:fldChar w:fldCharType="begin"/>
-      </w:r>
-      <w:r>
-        <w:instrText xml:space="preserve"> SEQ Obrázek \* ARABIC </w:instrText>
-      </w:r>
-      <w:r>
-        <w:fldChar w:fldCharType="separate"/>
-      </w:r>
-      <w:r>
-        <w:rPr>
-          <w:noProof/>
-        </w:rPr>
-        <w:t>11</w:t>
-      </w:r>
-      <w:r>
-        <w:rPr>
-          <w:noProof/>
-        </w:rPr>
-        <w:fldChar w:fldCharType="end"/>
-      </w:r>
-      <w:r>
-        <w:t xml:space="preserve">: Webové zobrazení </w:t>
-      </w:r>
-      <w:proofErr w:type="spellStart"/>
-      <w:r>
-        <w:t>playgroundu</w:t>
+      <w:fldSimple w:instr=" SEQ Obrázek \* ARABIC ">
+        <w:r>
+          <w:rPr>
+            <w:noProof/>
+          </w:rPr>
+          <w:t>11</w:t>
+        </w:r>
+      </w:fldSimple>
+      <w:r>
+        <w:t>: Webové zobrazení playgroundu</w:t>
       </w:r>
       <w:bookmarkEnd w:id="39"/>
-      <w:proofErr w:type="spellEnd"/>
-    </w:p>
-    <w:p>
-      <w:pPr>
-        <w:pStyle w:val="Titulek"/>
+    </w:p>
+    <w:p>
+      <w:pPr>
+        <w:pStyle w:val="Caption"/>
         <w:sectPr>
           <w:type w:val="continuous"/>
           <w:pgSz w:w="11906" w:h="16838"/>
@@ -7645,7 +7324,7 @@
     </w:p>
     <w:p>
       <w:pPr>
-        <w:pStyle w:val="Nadpis3"/>
+        <w:pStyle w:val="Heading3"/>
       </w:pPr>
       <w:bookmarkStart w:id="40" w:name="_Toc231758276"/>
       <w:r>
@@ -7666,23 +7345,7 @@
         <w:pStyle w:val="Normlntext"/>
       </w:pPr>
       <w:r>
-        <w:t xml:space="preserve">V průběhu integrace byly úspěšně zprovozněny lokalizační kotvy, na které byl nahrán připravený firmware. Současně pokračoval vývoj </w:t>
-      </w:r>
-      <w:proofErr w:type="spellStart"/>
-      <w:r>
-        <w:t>gateway</w:t>
-      </w:r>
-      <w:proofErr w:type="spellEnd"/>
-      <w:r>
-        <w:t xml:space="preserve"> serveru a testovacího prostředí </w:t>
-      </w:r>
-      <w:proofErr w:type="spellStart"/>
-      <w:r>
-        <w:t>Playground</w:t>
-      </w:r>
-      <w:proofErr w:type="spellEnd"/>
-      <w:r>
-        <w:t>, které umožnilo ověřování herních mechanik i bez kompletně dokončeného hardwaru.</w:t>
+        <w:t>V průběhu integrace byly úspěšně zprovozněny lokalizační kotvy, na které byl nahrán připravený firmware. Současně pokračoval vývoj gateway serveru a testovacího prostředí Playground, které umožnilo ověřování herních mechanik i bez kompletně dokončeného hardwaru.</w:t>
       </w:r>
     </w:p>
     <w:p>
@@ -7714,7 +7377,13 @@
         <w:pStyle w:val="Normlntext"/>
       </w:pPr>
       <w:r>
-        <w:t>Z tohoto důvodu bylo rozhodnuto pokračovat návrhem vlastní desky plošných spojů, která umožní přehlednější zapojení jednotlivých komponent a současně odstraní řadu problémů vyplývajících z použití původního prototypového zapojení. V době zpracování této dokumentace byla navržená deska objednána do výroby a čekalo se na její dodání. Kompletní integrace hardwarové části projektu proto bude pokračovat po osazení a oživení nové verze zařízení.</w:t>
+        <w:t xml:space="preserve">Z tohoto důvodu bylo rozhodnuto pokračovat </w:t>
+      </w:r>
+      <w:r>
+        <w:t>v návrhu</w:t>
+      </w:r>
+      <w:r>
+        <w:t xml:space="preserve"> vlastní desky plošných spojů, která umožní přehlednější zapojení jednotlivých komponent a současně odstraní řadu problémů vyplývajících z použití původního prototypového zapojení. V době zpracování této dokumentace byla navržená deska objednána do výroby a čekalo se na její dodání. Kompletní integrace hardwarové části projektu proto bude pokračovat po osazení a oživení nové verze zařízení.</w:t>
       </w:r>
     </w:p>
     <w:p>
@@ -7727,7 +7396,7 @@
     </w:p>
     <w:p>
       <w:pPr>
-        <w:pStyle w:val="Nadpis2"/>
+        <w:pStyle w:val="Heading2"/>
         <w:pBdr>
           <w:bottom w:val="single" w:sz="4" w:space="1" w:color="FFE79B"/>
         </w:pBdr>
@@ -7752,15 +7421,37 @@
         <w:pStyle w:val="Normlntext"/>
       </w:pPr>
       <w:r>
-        <w:t xml:space="preserve">Během provozu zařízení automaticky snímá pohyb pomocí akcelerometru, jsou zpracována </w:t>
-      </w:r>
-      <w:proofErr w:type="spellStart"/>
-      <w:r>
-        <w:t>mikrokontrolérem</w:t>
-      </w:r>
-      <w:proofErr w:type="spellEnd"/>
-      <w:r>
-        <w:t xml:space="preserve"> a využita v rámci herního systému. Zařízení nevyžaduje žádné složité ovládání ze strany uživatele a po zapnutí je připraveno k použití.</w:t>
+        <w:t xml:space="preserve">Během provozu zařízení </w:t>
+      </w:r>
+      <w:r>
+        <w:t xml:space="preserve">jsou </w:t>
+      </w:r>
+      <w:r>
+        <w:t>automaticky snímá</w:t>
+      </w:r>
+      <w:r>
+        <w:t>ny</w:t>
+      </w:r>
+      <w:r>
+        <w:t xml:space="preserve"> pohyb</w:t>
+      </w:r>
+      <w:r>
+        <w:t>y</w:t>
+      </w:r>
+      <w:r>
+        <w:t xml:space="preserve"> pomocí akcelerometru, </w:t>
+      </w:r>
+      <w:r>
+        <w:t>zpracovány</w:t>
+      </w:r>
+      <w:r>
+        <w:t xml:space="preserve"> mikrokontrolérem a využit</w:t>
+      </w:r>
+      <w:r>
+        <w:t>y</w:t>
+      </w:r>
+      <w:r>
+        <w:t xml:space="preserve"> v rámci herního systému. Zařízení nevyžaduje žádné složité ovládání ze strany uživatele a po zapnutí je připraveno k použití.</w:t>
       </w:r>
     </w:p>
     <w:p>
@@ -7768,12 +7459,12 @@
         <w:pStyle w:val="Normlntext"/>
       </w:pPr>
       <w:r>
-        <w:t>Po ukončení používání je možné zařízení vypnout a v případě potřeby znovu nabít. Pro správnou funkci se doporučuje chránit zařízení před mechanickým poškozením a používat jej v běžných provozních podmínkách.</w:t>
-      </w:r>
-    </w:p>
-    <w:p>
-      <w:pPr>
-        <w:pStyle w:val="Nadpis3"/>
+        <w:t>Po ukončení používání je možné zařízení vypnout a v případě potřeby znovu nabít. Pro správnou funkci se doporučuje chránit zařízení před mechanickým poškozením a používat je v běžných provozních podmínkách.</w:t>
+      </w:r>
+    </w:p>
+    <w:p>
+      <w:pPr>
+        <w:pStyle w:val="Heading3"/>
       </w:pPr>
       <w:bookmarkStart w:id="42" w:name="_Toc231758278"/>
       <w:r>
@@ -7826,7 +7517,7 @@
     </w:p>
     <w:p>
       <w:pPr>
-        <w:pStyle w:val="Nadpis2"/>
+        <w:pStyle w:val="Heading2"/>
         <w:pBdr>
           <w:bottom w:val="single" w:sz="4" w:space="1" w:color="FFE79B"/>
         </w:pBdr>
@@ -7858,15 +7549,7 @@
         <w:pStyle w:val="Normlntext"/>
       </w:pPr>
       <w:r>
-        <w:t xml:space="preserve">Zařízení je dále vybaveno pohybovými senzory, konkrétně akcelerometrem a magnetometrem, které umožňují snímání pohybu a orientace zařízení v prostoru. Všechny hardwarové prvky jsou řízeny </w:t>
-      </w:r>
-      <w:proofErr w:type="spellStart"/>
-      <w:r>
-        <w:t>mikrokontrolérem</w:t>
-      </w:r>
-      <w:proofErr w:type="spellEnd"/>
-      <w:r>
-        <w:t xml:space="preserve"> ESP32, který zajišťuje zpracování dat a řízení jednotlivých částí systému. Napájení zařízení je řešeno pomocí Li-ion baterie.</w:t>
+        <w:t>Zařízení je dále vybaveno pohybovými senzory, konkrétně akcelerometrem a magnetometrem, které umožňují snímání pohybu a orientace zařízení v prostoru. Všechny hardwarové prvky jsou řízeny mikrokontrolérem ESP32, který zajišťuje zpracování dat a řízení jednotlivých částí systému. Napájení zařízení je řešeno pomocí Li-ion baterie.</w:t>
       </w:r>
     </w:p>
     <w:p>
@@ -7876,7 +7559,7 @@
     </w:p>
     <w:p>
       <w:pPr>
-        <w:pStyle w:val="Nadpis2"/>
+        <w:pStyle w:val="Heading2"/>
         <w:pBdr>
           <w:bottom w:val="single" w:sz="4" w:space="1" w:color="FFE79B"/>
         </w:pBdr>
@@ -7931,7 +7614,7 @@
     </w:p>
     <w:p>
       <w:pPr>
-        <w:pStyle w:val="Normlnweb"/>
+        <w:pStyle w:val="NormalWeb"/>
         <w:pBdr>
           <w:top w:val="single" w:sz="6" w:space="2" w:color="888888"/>
           <w:left w:val="single" w:sz="6" w:space="2" w:color="888888"/>
@@ -7991,7 +7674,6 @@
         </w:rPr>
         <w:t xml:space="preserve"> </w:t>
       </w:r>
-      <w:proofErr w:type="spellStart"/>
       <w:r>
         <w:rPr>
           <w:rFonts w:ascii="Consolas" w:hAnsi="Consolas" w:cs="Courier New"/>
@@ -8001,7 +7683,6 @@
         </w:rPr>
         <w:t>void</w:t>
       </w:r>
-      <w:proofErr w:type="spellEnd"/>
       <w:r>
         <w:rPr>
           <w:rFonts w:ascii="Consolas" w:hAnsi="Consolas" w:cs="Courier New"/>
@@ -8009,9 +7690,26 @@
           <w:sz w:val="20"/>
           <w:szCs w:val="20"/>
         </w:rPr>
-        <w:t xml:space="preserve"> </w:t>
-      </w:r>
-      <w:proofErr w:type="spellStart"/>
+        <w:t xml:space="preserve"> update_led_for_state</w:t>
+      </w:r>
+      <w:r>
+        <w:rPr>
+          <w:rFonts w:ascii="Consolas" w:hAnsi="Consolas" w:cs="Courier New"/>
+          <w:color w:val="666600"/>
+          <w:sz w:val="20"/>
+          <w:szCs w:val="20"/>
+        </w:rPr>
+        <w:t>(</w:t>
+      </w:r>
+      <w:r>
+        <w:rPr>
+          <w:rFonts w:ascii="Consolas" w:hAnsi="Consolas" w:cs="Courier New"/>
+          <w:color w:val="660066"/>
+          <w:sz w:val="20"/>
+          <w:szCs w:val="20"/>
+        </w:rPr>
+        <w:t>device_state_t</w:t>
+      </w:r>
       <w:r>
         <w:rPr>
           <w:rFonts w:ascii="Consolas" w:hAnsi="Consolas" w:cs="Courier New"/>
@@ -8019,9 +7717,8 @@
           <w:sz w:val="20"/>
           <w:szCs w:val="20"/>
         </w:rPr>
-        <w:t>update_led_for_state</w:t>
-      </w:r>
-      <w:proofErr w:type="spellEnd"/>
+        <w:t xml:space="preserve"> state</w:t>
+      </w:r>
       <w:r>
         <w:rPr>
           <w:rFonts w:ascii="Consolas" w:hAnsi="Consolas" w:cs="Courier New"/>
@@ -8029,52 +7726,12 @@
           <w:sz w:val="20"/>
           <w:szCs w:val="20"/>
         </w:rPr>
-        <w:t>(</w:t>
-      </w:r>
-      <w:proofErr w:type="spellStart"/>
-      <w:r>
-        <w:rPr>
-          <w:rFonts w:ascii="Consolas" w:hAnsi="Consolas" w:cs="Courier New"/>
-          <w:color w:val="660066"/>
-          <w:sz w:val="20"/>
-          <w:szCs w:val="20"/>
-        </w:rPr>
-        <w:t>device_state_t</w:t>
-      </w:r>
-      <w:proofErr w:type="spellEnd"/>
-      <w:r>
-        <w:rPr>
-          <w:rFonts w:ascii="Consolas" w:hAnsi="Consolas" w:cs="Courier New"/>
-          <w:color w:val="000000"/>
-          <w:sz w:val="20"/>
-          <w:szCs w:val="20"/>
-        </w:rPr>
-        <w:t xml:space="preserve"> </w:t>
-      </w:r>
-      <w:proofErr w:type="spellStart"/>
-      <w:r>
-        <w:rPr>
-          <w:rFonts w:ascii="Consolas" w:hAnsi="Consolas" w:cs="Courier New"/>
-          <w:color w:val="000000"/>
-          <w:sz w:val="20"/>
-          <w:szCs w:val="20"/>
-        </w:rPr>
-        <w:t>state</w:t>
-      </w:r>
-      <w:proofErr w:type="spellEnd"/>
-      <w:r>
-        <w:rPr>
-          <w:rFonts w:ascii="Consolas" w:hAnsi="Consolas" w:cs="Courier New"/>
-          <w:color w:val="666600"/>
-          <w:sz w:val="20"/>
-          <w:szCs w:val="20"/>
-        </w:rPr>
         <w:t>)</w:t>
       </w:r>
     </w:p>
     <w:p>
       <w:pPr>
-        <w:pStyle w:val="Normlnweb"/>
+        <w:pStyle w:val="NormalWeb"/>
         <w:pBdr>
           <w:top w:val="single" w:sz="6" w:space="2" w:color="888888"/>
           <w:left w:val="single" w:sz="6" w:space="2" w:color="888888"/>
@@ -8127,7 +7784,7 @@
     </w:p>
     <w:p>
       <w:pPr>
-        <w:pStyle w:val="Normlnweb"/>
+        <w:pStyle w:val="NormalWeb"/>
         <w:pBdr>
           <w:top w:val="single" w:sz="6" w:space="2" w:color="888888"/>
           <w:left w:val="single" w:sz="6" w:space="2" w:color="888888"/>
@@ -8204,7 +7861,6 @@
         </w:rPr>
         <w:t>(</w:t>
       </w:r>
-      <w:proofErr w:type="spellStart"/>
       <w:r>
         <w:rPr>
           <w:rFonts w:ascii="Consolas" w:hAnsi="Consolas" w:cs="Courier New"/>
@@ -8214,7 +7870,6 @@
         </w:rPr>
         <w:t>state</w:t>
       </w:r>
-      <w:proofErr w:type="spellEnd"/>
       <w:r>
         <w:rPr>
           <w:rFonts w:ascii="Consolas" w:hAnsi="Consolas" w:cs="Courier New"/>
@@ -8245,7 +7900,7 @@
     </w:p>
     <w:p>
       <w:pPr>
-        <w:pStyle w:val="Normlnweb"/>
+        <w:pStyle w:val="NormalWeb"/>
         <w:pBdr>
           <w:top w:val="single" w:sz="6" w:space="2" w:color="888888"/>
           <w:left w:val="single" w:sz="6" w:space="2" w:color="888888"/>
@@ -8325,7 +7980,7 @@
     </w:p>
     <w:p>
       <w:pPr>
-        <w:pStyle w:val="Normlnweb"/>
+        <w:pStyle w:val="NormalWeb"/>
         <w:pBdr>
           <w:top w:val="single" w:sz="6" w:space="2" w:color="888888"/>
           <w:left w:val="single" w:sz="6" w:space="2" w:color="888888"/>
@@ -8373,9 +8028,17 @@
           <w:sz w:val="20"/>
           <w:szCs w:val="20"/>
         </w:rPr>
-        <w:t xml:space="preserve">            </w:t>
-      </w:r>
-      <w:proofErr w:type="spellStart"/>
+        <w:t xml:space="preserve">            led_controller_set_state</w:t>
+      </w:r>
+      <w:r>
+        <w:rPr>
+          <w:rFonts w:ascii="Consolas" w:hAnsi="Consolas" w:cs="Courier New"/>
+          <w:color w:val="666600"/>
+          <w:sz w:val="20"/>
+          <w:szCs w:val="20"/>
+        </w:rPr>
+        <w:t>(</w:t>
+      </w:r>
       <w:r>
         <w:rPr>
           <w:rFonts w:ascii="Consolas" w:hAnsi="Consolas" w:cs="Courier New"/>
@@ -8383,9 +8046,8 @@
           <w:sz w:val="20"/>
           <w:szCs w:val="20"/>
         </w:rPr>
-        <w:t>led_controller_set_state</w:t>
-      </w:r>
-      <w:proofErr w:type="spellEnd"/>
+        <w:t>LED_STATE_CALIBRATING</w:t>
+      </w:r>
       <w:r>
         <w:rPr>
           <w:rFonts w:ascii="Consolas" w:hAnsi="Consolas" w:cs="Courier New"/>
@@ -8393,30 +8055,12 @@
           <w:sz w:val="20"/>
           <w:szCs w:val="20"/>
         </w:rPr>
-        <w:t>(</w:t>
-      </w:r>
-      <w:r>
-        <w:rPr>
-          <w:rFonts w:ascii="Consolas" w:hAnsi="Consolas" w:cs="Courier New"/>
-          <w:color w:val="000000"/>
-          <w:sz w:val="20"/>
-          <w:szCs w:val="20"/>
-        </w:rPr>
-        <w:t>LED_STATE_CALIBRATING</w:t>
-      </w:r>
-      <w:r>
-        <w:rPr>
-          <w:rFonts w:ascii="Consolas" w:hAnsi="Consolas" w:cs="Courier New"/>
-          <w:color w:val="666600"/>
-          <w:sz w:val="20"/>
-          <w:szCs w:val="20"/>
-        </w:rPr>
         <w:t>);</w:t>
       </w:r>
     </w:p>
     <w:p>
       <w:pPr>
-        <w:pStyle w:val="Normlnweb"/>
+        <w:pStyle w:val="NormalWeb"/>
         <w:pBdr>
           <w:top w:val="single" w:sz="6" w:space="2" w:color="888888"/>
           <w:left w:val="single" w:sz="6" w:space="2" w:color="888888"/>
@@ -8466,7 +8110,6 @@
         </w:rPr>
         <w:t xml:space="preserve">            </w:t>
       </w:r>
-      <w:proofErr w:type="spellStart"/>
       <w:r>
         <w:rPr>
           <w:rFonts w:ascii="Consolas" w:hAnsi="Consolas" w:cs="Courier New"/>
@@ -8476,7 +8119,6 @@
         </w:rPr>
         <w:t>break</w:t>
       </w:r>
-      <w:proofErr w:type="spellEnd"/>
       <w:r>
         <w:rPr>
           <w:rFonts w:ascii="Consolas" w:hAnsi="Consolas" w:cs="Courier New"/>
@@ -8489,7 +8131,7 @@
     </w:p>
     <w:p>
       <w:pPr>
-        <w:pStyle w:val="Normlnweb"/>
+        <w:pStyle w:val="NormalWeb"/>
         <w:pBdr>
           <w:top w:val="single" w:sz="6" w:space="2" w:color="888888"/>
           <w:left w:val="single" w:sz="6" w:space="2" w:color="888888"/>
@@ -8569,7 +8211,7 @@
     </w:p>
     <w:p>
       <w:pPr>
-        <w:pStyle w:val="Normlnweb"/>
+        <w:pStyle w:val="NormalWeb"/>
         <w:pBdr>
           <w:top w:val="single" w:sz="6" w:space="2" w:color="888888"/>
           <w:left w:val="single" w:sz="6" w:space="2" w:color="888888"/>
@@ -8649,7 +8291,7 @@
     </w:p>
     <w:p>
       <w:pPr>
-        <w:pStyle w:val="Normlnweb"/>
+        <w:pStyle w:val="NormalWeb"/>
         <w:pBdr>
           <w:top w:val="single" w:sz="6" w:space="2" w:color="888888"/>
           <w:left w:val="single" w:sz="6" w:space="2" w:color="888888"/>
@@ -8697,9 +8339,17 @@
           <w:sz w:val="20"/>
           <w:szCs w:val="20"/>
         </w:rPr>
-        <w:t xml:space="preserve">            </w:t>
-      </w:r>
-      <w:proofErr w:type="spellStart"/>
+        <w:t xml:space="preserve">            led_controller_set_state</w:t>
+      </w:r>
+      <w:r>
+        <w:rPr>
+          <w:rFonts w:ascii="Consolas" w:hAnsi="Consolas" w:cs="Courier New"/>
+          <w:color w:val="666600"/>
+          <w:sz w:val="20"/>
+          <w:szCs w:val="20"/>
+        </w:rPr>
+        <w:t>(</w:t>
+      </w:r>
       <w:r>
         <w:rPr>
           <w:rFonts w:ascii="Consolas" w:hAnsi="Consolas" w:cs="Courier New"/>
@@ -8707,9 +8357,8 @@
           <w:sz w:val="20"/>
           <w:szCs w:val="20"/>
         </w:rPr>
-        <w:t>led_controller_set_state</w:t>
-      </w:r>
-      <w:proofErr w:type="spellEnd"/>
+        <w:t>LED_STATE_WAITING</w:t>
+      </w:r>
       <w:r>
         <w:rPr>
           <w:rFonts w:ascii="Consolas" w:hAnsi="Consolas" w:cs="Courier New"/>
@@ -8717,30 +8366,12 @@
           <w:sz w:val="20"/>
           <w:szCs w:val="20"/>
         </w:rPr>
-        <w:t>(</w:t>
-      </w:r>
-      <w:r>
-        <w:rPr>
-          <w:rFonts w:ascii="Consolas" w:hAnsi="Consolas" w:cs="Courier New"/>
-          <w:color w:val="000000"/>
-          <w:sz w:val="20"/>
-          <w:szCs w:val="20"/>
-        </w:rPr>
-        <w:t>LED_STATE_WAITING</w:t>
-      </w:r>
-      <w:r>
-        <w:rPr>
-          <w:rFonts w:ascii="Consolas" w:hAnsi="Consolas" w:cs="Courier New"/>
-          <w:color w:val="666600"/>
-          <w:sz w:val="20"/>
-          <w:szCs w:val="20"/>
-        </w:rPr>
         <w:t>);</w:t>
       </w:r>
     </w:p>
     <w:p>
       <w:pPr>
-        <w:pStyle w:val="Normlnweb"/>
+        <w:pStyle w:val="NormalWeb"/>
         <w:pBdr>
           <w:top w:val="single" w:sz="6" w:space="2" w:color="888888"/>
           <w:left w:val="single" w:sz="6" w:space="2" w:color="888888"/>
@@ -8790,7 +8421,6 @@
         </w:rPr>
         <w:t xml:space="preserve">            </w:t>
       </w:r>
-      <w:proofErr w:type="spellStart"/>
       <w:r>
         <w:rPr>
           <w:rFonts w:ascii="Consolas" w:hAnsi="Consolas" w:cs="Courier New"/>
@@ -8800,7 +8430,6 @@
         </w:rPr>
         <w:t>break</w:t>
       </w:r>
-      <w:proofErr w:type="spellEnd"/>
       <w:r>
         <w:rPr>
           <w:rFonts w:ascii="Consolas" w:hAnsi="Consolas" w:cs="Courier New"/>
@@ -8813,7 +8442,7 @@
     </w:p>
     <w:p>
       <w:pPr>
-        <w:pStyle w:val="Normlnweb"/>
+        <w:pStyle w:val="NormalWeb"/>
         <w:pBdr>
           <w:top w:val="single" w:sz="6" w:space="2" w:color="888888"/>
           <w:left w:val="single" w:sz="6" w:space="2" w:color="888888"/>
@@ -8893,7 +8522,7 @@
     </w:p>
     <w:p>
       <w:pPr>
-        <w:pStyle w:val="Normlnweb"/>
+        <w:pStyle w:val="NormalWeb"/>
         <w:pBdr>
           <w:top w:val="single" w:sz="6" w:space="2" w:color="888888"/>
           <w:left w:val="single" w:sz="6" w:space="2" w:color="888888"/>
@@ -8941,9 +8570,17 @@
           <w:sz w:val="20"/>
           <w:szCs w:val="20"/>
         </w:rPr>
-        <w:t xml:space="preserve">            </w:t>
-      </w:r>
-      <w:proofErr w:type="spellStart"/>
+        <w:t xml:space="preserve">            led_controller_set_state</w:t>
+      </w:r>
+      <w:r>
+        <w:rPr>
+          <w:rFonts w:ascii="Consolas" w:hAnsi="Consolas" w:cs="Courier New"/>
+          <w:color w:val="666600"/>
+          <w:sz w:val="20"/>
+          <w:szCs w:val="20"/>
+        </w:rPr>
+        <w:t>(</w:t>
+      </w:r>
       <w:r>
         <w:rPr>
           <w:rFonts w:ascii="Consolas" w:hAnsi="Consolas" w:cs="Courier New"/>
@@ -8951,9 +8588,8 @@
           <w:sz w:val="20"/>
           <w:szCs w:val="20"/>
         </w:rPr>
-        <w:t>led_controller_set_state</w:t>
-      </w:r>
-      <w:proofErr w:type="spellEnd"/>
+        <w:t>LED_STATE_ACTIVE</w:t>
+      </w:r>
       <w:r>
         <w:rPr>
           <w:rFonts w:ascii="Consolas" w:hAnsi="Consolas" w:cs="Courier New"/>
@@ -8961,30 +8597,12 @@
           <w:sz w:val="20"/>
           <w:szCs w:val="20"/>
         </w:rPr>
-        <w:t>(</w:t>
-      </w:r>
-      <w:r>
-        <w:rPr>
-          <w:rFonts w:ascii="Consolas" w:hAnsi="Consolas" w:cs="Courier New"/>
-          <w:color w:val="000000"/>
-          <w:sz w:val="20"/>
-          <w:szCs w:val="20"/>
-        </w:rPr>
-        <w:t>LED_STATE_ACTIVE</w:t>
-      </w:r>
-      <w:r>
-        <w:rPr>
-          <w:rFonts w:ascii="Consolas" w:hAnsi="Consolas" w:cs="Courier New"/>
-          <w:color w:val="666600"/>
-          <w:sz w:val="20"/>
-          <w:szCs w:val="20"/>
-        </w:rPr>
         <w:t>);</w:t>
       </w:r>
     </w:p>
     <w:p>
       <w:pPr>
-        <w:pStyle w:val="Normlnweb"/>
+        <w:pStyle w:val="NormalWeb"/>
         <w:pBdr>
           <w:top w:val="single" w:sz="6" w:space="2" w:color="888888"/>
           <w:left w:val="single" w:sz="6" w:space="2" w:color="888888"/>
@@ -9034,7 +8652,6 @@
         </w:rPr>
         <w:t xml:space="preserve">            </w:t>
       </w:r>
-      <w:proofErr w:type="spellStart"/>
       <w:r>
         <w:rPr>
           <w:rFonts w:ascii="Consolas" w:hAnsi="Consolas" w:cs="Courier New"/>
@@ -9044,7 +8661,6 @@
         </w:rPr>
         <w:t>break</w:t>
       </w:r>
-      <w:proofErr w:type="spellEnd"/>
       <w:r>
         <w:rPr>
           <w:rFonts w:ascii="Consolas" w:hAnsi="Consolas" w:cs="Courier New"/>
@@ -9057,7 +8673,7 @@
     </w:p>
     <w:p>
       <w:pPr>
-        <w:pStyle w:val="Normlnweb"/>
+        <w:pStyle w:val="NormalWeb"/>
         <w:pBdr>
           <w:top w:val="single" w:sz="6" w:space="2" w:color="888888"/>
           <w:left w:val="single" w:sz="6" w:space="2" w:color="888888"/>
@@ -9137,7 +8753,7 @@
     </w:p>
     <w:p>
       <w:pPr>
-        <w:pStyle w:val="Normlnweb"/>
+        <w:pStyle w:val="NormalWeb"/>
         <w:pBdr>
           <w:top w:val="single" w:sz="6" w:space="2" w:color="888888"/>
           <w:left w:val="single" w:sz="6" w:space="2" w:color="888888"/>
@@ -9185,9 +8801,17 @@
           <w:sz w:val="20"/>
           <w:szCs w:val="20"/>
         </w:rPr>
-        <w:t xml:space="preserve">            </w:t>
-      </w:r>
-      <w:proofErr w:type="spellStart"/>
+        <w:t xml:space="preserve">            led_controller_set_state</w:t>
+      </w:r>
+      <w:r>
+        <w:rPr>
+          <w:rFonts w:ascii="Consolas" w:hAnsi="Consolas" w:cs="Courier New"/>
+          <w:color w:val="666600"/>
+          <w:sz w:val="20"/>
+          <w:szCs w:val="20"/>
+        </w:rPr>
+        <w:t>(</w:t>
+      </w:r>
       <w:r>
         <w:rPr>
           <w:rFonts w:ascii="Consolas" w:hAnsi="Consolas" w:cs="Courier New"/>
@@ -9195,9 +8819,8 @@
           <w:sz w:val="20"/>
           <w:szCs w:val="20"/>
         </w:rPr>
-        <w:t>led_controller_set_state</w:t>
-      </w:r>
-      <w:proofErr w:type="spellEnd"/>
+        <w:t>LED_STATE_ERROR</w:t>
+      </w:r>
       <w:r>
         <w:rPr>
           <w:rFonts w:ascii="Consolas" w:hAnsi="Consolas" w:cs="Courier New"/>
@@ -9205,30 +8828,12 @@
           <w:sz w:val="20"/>
           <w:szCs w:val="20"/>
         </w:rPr>
-        <w:t>(</w:t>
-      </w:r>
-      <w:r>
-        <w:rPr>
-          <w:rFonts w:ascii="Consolas" w:hAnsi="Consolas" w:cs="Courier New"/>
-          <w:color w:val="000000"/>
-          <w:sz w:val="20"/>
-          <w:szCs w:val="20"/>
-        </w:rPr>
-        <w:t>LED_STATE_ERROR</w:t>
-      </w:r>
-      <w:r>
-        <w:rPr>
-          <w:rFonts w:ascii="Consolas" w:hAnsi="Consolas" w:cs="Courier New"/>
-          <w:color w:val="666600"/>
-          <w:sz w:val="20"/>
-          <w:szCs w:val="20"/>
-        </w:rPr>
         <w:t>);</w:t>
       </w:r>
     </w:p>
     <w:p>
       <w:pPr>
-        <w:pStyle w:val="Normlnweb"/>
+        <w:pStyle w:val="NormalWeb"/>
         <w:pBdr>
           <w:top w:val="single" w:sz="6" w:space="2" w:color="888888"/>
           <w:left w:val="single" w:sz="6" w:space="2" w:color="888888"/>
@@ -9278,7 +8883,6 @@
         </w:rPr>
         <w:t xml:space="preserve">            </w:t>
       </w:r>
-      <w:proofErr w:type="spellStart"/>
       <w:r>
         <w:rPr>
           <w:rFonts w:ascii="Consolas" w:hAnsi="Consolas" w:cs="Courier New"/>
@@ -9288,7 +8892,6 @@
         </w:rPr>
         <w:t>break</w:t>
       </w:r>
-      <w:proofErr w:type="spellEnd"/>
       <w:r>
         <w:rPr>
           <w:rFonts w:ascii="Consolas" w:hAnsi="Consolas" w:cs="Courier New"/>
@@ -9301,7 +8904,7 @@
     </w:p>
     <w:p>
       <w:pPr>
-        <w:pStyle w:val="Normlnweb"/>
+        <w:pStyle w:val="NormalWeb"/>
         <w:pBdr>
           <w:top w:val="single" w:sz="6" w:space="2" w:color="888888"/>
           <w:left w:val="single" w:sz="6" w:space="2" w:color="888888"/>
@@ -9372,7 +8975,7 @@
     </w:p>
     <w:p>
       <w:pPr>
-        <w:pStyle w:val="Normlnweb"/>
+        <w:pStyle w:val="NormalWeb"/>
         <w:pBdr>
           <w:top w:val="single" w:sz="6" w:space="2" w:color="888888"/>
           <w:left w:val="single" w:sz="6" w:space="2" w:color="888888"/>
@@ -9420,19 +9023,8 @@
           <w:sz w:val="20"/>
           <w:szCs w:val="20"/>
         </w:rPr>
-        <w:t xml:space="preserve">            </w:t>
-      </w:r>
-      <w:proofErr w:type="spellStart"/>
-      <w:r>
-        <w:rPr>
-          <w:rFonts w:ascii="Consolas" w:hAnsi="Consolas" w:cs="Courier New"/>
-          <w:color w:val="000000"/>
-          <w:sz w:val="20"/>
-          <w:szCs w:val="20"/>
-        </w:rPr>
-        <w:t>led_controller_off</w:t>
-      </w:r>
-      <w:proofErr w:type="spellEnd"/>
+        <w:t xml:space="preserve">            led_controller_off</w:t>
+      </w:r>
       <w:r>
         <w:rPr>
           <w:rFonts w:ascii="Consolas" w:hAnsi="Consolas" w:cs="Courier New"/>
@@ -9445,7 +9037,7 @@
     </w:p>
     <w:p>
       <w:pPr>
-        <w:pStyle w:val="Normlnweb"/>
+        <w:pStyle w:val="NormalWeb"/>
         <w:pBdr>
           <w:top w:val="single" w:sz="6" w:space="2" w:color="888888"/>
           <w:left w:val="single" w:sz="6" w:space="2" w:color="888888"/>
@@ -9495,7 +9087,6 @@
         </w:rPr>
         <w:t xml:space="preserve">            </w:t>
       </w:r>
-      <w:proofErr w:type="spellStart"/>
       <w:r>
         <w:rPr>
           <w:rFonts w:ascii="Consolas" w:hAnsi="Consolas" w:cs="Courier New"/>
@@ -9505,7 +9096,6 @@
         </w:rPr>
         <w:t>break</w:t>
       </w:r>
-      <w:proofErr w:type="spellEnd"/>
       <w:r>
         <w:rPr>
           <w:rFonts w:ascii="Consolas" w:hAnsi="Consolas" w:cs="Courier New"/>
@@ -9518,7 +9108,7 @@
     </w:p>
     <w:p>
       <w:pPr>
-        <w:pStyle w:val="Normlnweb"/>
+        <w:pStyle w:val="NormalWeb"/>
         <w:pBdr>
           <w:top w:val="single" w:sz="6" w:space="2" w:color="888888"/>
           <w:left w:val="single" w:sz="6" w:space="2" w:color="888888"/>
@@ -9580,7 +9170,7 @@
     </w:p>
     <w:p>
       <w:pPr>
-        <w:pStyle w:val="Normlnweb"/>
+        <w:pStyle w:val="NormalWeb"/>
         <w:pBdr>
           <w:top w:val="single" w:sz="6" w:space="2" w:color="888888"/>
           <w:left w:val="single" w:sz="6" w:space="2" w:color="888888"/>
@@ -9633,32 +9223,19 @@
     </w:p>
     <w:p>
       <w:pPr>
-        <w:pStyle w:val="Titulek"/>
+        <w:pStyle w:val="Caption"/>
       </w:pPr>
       <w:r>
         <w:t xml:space="preserve">Kód </w:t>
       </w:r>
-      <w:r>
-        <w:fldChar w:fldCharType="begin"/>
-      </w:r>
-      <w:r>
-        <w:instrText xml:space="preserve"> SEQ Kód \* ARABIC </w:instrText>
-      </w:r>
-      <w:r>
-        <w:fldChar w:fldCharType="separate"/>
-      </w:r>
-      <w:r>
-        <w:rPr>
-          <w:noProof/>
-        </w:rPr>
-        <w:t>1</w:t>
-      </w:r>
-      <w:r>
-        <w:rPr>
-          <w:noProof/>
-        </w:rPr>
-        <w:fldChar w:fldCharType="end"/>
-      </w:r>
+      <w:fldSimple w:instr=" SEQ Kód \* ARABIC ">
+        <w:r>
+          <w:rPr>
+            <w:noProof/>
+          </w:rPr>
+          <w:t>1</w:t>
+        </w:r>
+      </w:fldSimple>
       <w:r>
         <w:t>: Ukázka funkce pro update led diody</w:t>
       </w:r>
@@ -9702,7 +9279,13 @@
         <w:pStyle w:val="Normlntext"/>
       </w:pPr>
       <w:r>
-        <w:t>V průběhu práce byla provedena rešerše podobných projektů a použitých technologií. Na jejím základě byly vybrány vhodné elektronické komponenty, vytvořen první funkční prototyp a ověřena základní komunikace mezi jednotlivými částmi zařízení. Součástí práce bylo také testování pohybových senzorů, návrh napájecí části a ověřování funkčnosti mikrokontroléru ESP32-C6.</w:t>
+        <w:t xml:space="preserve">V průběhu práce byla provedena rešerše podobných projektů a použitých technologií. Na jejím základě byly vybrány vhodné elektronické komponenty, </w:t>
+      </w:r>
+      <w:r>
+        <w:t xml:space="preserve">byl </w:t>
+      </w:r>
+      <w:r>
+        <w:t>vytvořen první funkční prototyp a ověřena základní komunikace mezi jednotlivými částmi zařízení. Součástí práce bylo také testování pohybových senzorů, návrh napájecí části a ověřování funkčnosti mikrokontroléru ESP32-C6.</w:t>
       </w:r>
     </w:p>
     <w:p>
@@ -9718,23 +9301,7 @@
         <w:pStyle w:val="Normlntext"/>
       </w:pPr>
       <w:r>
-        <w:t xml:space="preserve">Další významnou částí projektu bylo vytvoření </w:t>
-      </w:r>
-      <w:proofErr w:type="spellStart"/>
-      <w:r>
-        <w:t>gateway</w:t>
-      </w:r>
-      <w:proofErr w:type="spellEnd"/>
-      <w:r>
-        <w:t xml:space="preserve"> serveru a testovacího prostředí </w:t>
-      </w:r>
-      <w:proofErr w:type="spellStart"/>
-      <w:r>
-        <w:t>Playground</w:t>
-      </w:r>
-      <w:proofErr w:type="spellEnd"/>
-      <w:r>
-        <w:t>. Tyto nástroje umožnily pokračovat ve vývoji a ověřování herních mechanik i v době, kdy nebylo možné dokončit kompletní testování hardwarové části projektu.</w:t>
+        <w:t>Další významnou částí projektu bylo vytvoření gateway serveru a testovacího prostředí Playground. Tyto nástroje umožnily pokračovat ve vývoji a ověřování herních mechanik i v době, kdy nebylo možné dokončit kompletní testování hardwarové části projektu.</w:t>
       </w:r>
     </w:p>
     <w:p>
@@ -9742,7 +9309,13 @@
         <w:pStyle w:val="Normlntext"/>
       </w:pPr>
       <w:r>
-        <w:t>Během vývoje byly identifikovány také technické problémy, zejména závada na sběrnici I²C v prototypu hůlky. Z důvodu konstrukce původního prototypu bylo rozhodnuto pokračovat vývojem nové verze zařízení využívající vlastní desku plošných spojů. Tímto způsobem bylo možné pokračovat v rozvoji projektu efektivněji než rozsáhlou opravou původního zapojení.</w:t>
+        <w:t>Během vývoje byly identifikovány také technické problémy, zejména závada na sběrnici I²C v prototypu hůlky. Z důvodu konstrukce původního prototypu bylo rozhodnuto pokračovat v</w:t>
+      </w:r>
+      <w:r>
+        <w:t>e vývoji</w:t>
+      </w:r>
+      <w:r>
+        <w:t xml:space="preserve"> nové verze zařízení využívající vlastní desku plošných spojů. Tímto způsobem bylo možné pokračovat v rozvoji projektu efektivněji než rozsáhlou opravou původního zapojení.</w:t>
       </w:r>
     </w:p>
     <w:p>
@@ -9795,7 +9368,7 @@
           <w:sdtContent>
             <w:p>
               <w:pPr>
-                <w:pStyle w:val="Bibliografie"/>
+                <w:pStyle w:val="Bibliography"/>
                 <w:rPr>
                   <w:noProof/>
                   <w:sz w:val="24"/>
@@ -9848,7 +9421,7 @@
             </w:p>
             <w:p>
               <w:pPr>
-                <w:pStyle w:val="Bibliografie"/>
+                <w:pStyle w:val="Bibliography"/>
                 <w:rPr>
                   <w:b/>
                   <w:bCs/>
@@ -9890,7 +9463,7 @@
             </w:p>
             <w:p>
               <w:pPr>
-                <w:pStyle w:val="Bibliografie"/>
+                <w:pStyle w:val="Bibliography"/>
                 <w:rPr>
                   <w:b/>
                   <w:bCs/>
@@ -9926,7 +9499,7 @@
             </w:p>
             <w:p>
               <w:pPr>
-                <w:pStyle w:val="Bibliografie"/>
+                <w:pStyle w:val="Bibliography"/>
                 <w:rPr>
                   <w:b/>
                   <w:bCs/>
@@ -9962,7 +9535,7 @@
             </w:p>
             <w:p>
               <w:pPr>
-                <w:pStyle w:val="Bibliografie"/>
+                <w:pStyle w:val="Bibliography"/>
                 <w:rPr>
                   <w:b/>
                   <w:bCs/>
@@ -9998,7 +9571,7 @@
             </w:p>
             <w:p>
               <w:pPr>
-                <w:pStyle w:val="Bibliografie"/>
+                <w:pStyle w:val="Bibliography"/>
                 <w:rPr>
                   <w:b/>
                   <w:bCs/>
@@ -10034,7 +9607,7 @@
             </w:p>
             <w:p>
               <w:pPr>
-                <w:pStyle w:val="Bibliografie"/>
+                <w:pStyle w:val="Bibliography"/>
                 <w:rPr>
                   <w:b/>
                   <w:bCs/>
@@ -10070,7 +9643,7 @@
             </w:p>
             <w:p>
               <w:pPr>
-                <w:pStyle w:val="Bibliografie"/>
+                <w:pStyle w:val="Bibliography"/>
                 <w:rPr>
                   <w:b/>
                   <w:bCs/>
@@ -10106,7 +9679,7 @@
             </w:p>
             <w:p>
               <w:pPr>
-                <w:pStyle w:val="Bibliografie"/>
+                <w:pStyle w:val="Bibliography"/>
                 <w:rPr>
                   <w:b/>
                   <w:bCs/>
@@ -10176,7 +9749,7 @@
     </w:p>
     <w:p>
       <w:pPr>
-        <w:pStyle w:val="Seznamobrzk"/>
+        <w:pStyle w:val="TableofFigures"/>
         <w:tabs>
           <w:tab w:val="right" w:leader="dot" w:pos="9062"/>
         </w:tabs>
@@ -10259,7 +9832,7 @@
     </w:p>
     <w:p>
       <w:pPr>
-        <w:pStyle w:val="Seznamobrzk"/>
+        <w:pStyle w:val="TableofFigures"/>
         <w:tabs>
           <w:tab w:val="right" w:leader="dot" w:pos="9062"/>
         </w:tabs>
@@ -10324,7 +9897,7 @@
     </w:p>
     <w:p>
       <w:pPr>
-        <w:pStyle w:val="Seznamobrzk"/>
+        <w:pStyle w:val="TableofFigures"/>
         <w:tabs>
           <w:tab w:val="right" w:leader="dot" w:pos="9062"/>
         </w:tabs>
@@ -10389,7 +9962,7 @@
     </w:p>
     <w:p>
       <w:pPr>
-        <w:pStyle w:val="Seznamobrzk"/>
+        <w:pStyle w:val="TableofFigures"/>
         <w:tabs>
           <w:tab w:val="right" w:leader="dot" w:pos="9062"/>
         </w:tabs>
@@ -10454,7 +10027,7 @@
     </w:p>
     <w:p>
       <w:pPr>
-        <w:pStyle w:val="Seznamobrzk"/>
+        <w:pStyle w:val="TableofFigures"/>
         <w:tabs>
           <w:tab w:val="right" w:leader="dot" w:pos="9062"/>
         </w:tabs>
@@ -10519,7 +10092,7 @@
     </w:p>
     <w:p>
       <w:pPr>
-        <w:pStyle w:val="Seznamobrzk"/>
+        <w:pStyle w:val="TableofFigures"/>
         <w:tabs>
           <w:tab w:val="right" w:leader="dot" w:pos="9062"/>
         </w:tabs>
@@ -10584,7 +10157,7 @@
     </w:p>
     <w:p>
       <w:pPr>
-        <w:pStyle w:val="Seznamobrzk"/>
+        <w:pStyle w:val="TableofFigures"/>
         <w:tabs>
           <w:tab w:val="right" w:leader="dot" w:pos="9062"/>
         </w:tabs>
@@ -10649,7 +10222,7 @@
     </w:p>
     <w:p>
       <w:pPr>
-        <w:pStyle w:val="Seznamobrzk"/>
+        <w:pStyle w:val="TableofFigures"/>
         <w:tabs>
           <w:tab w:val="right" w:leader="dot" w:pos="9062"/>
         </w:tabs>
@@ -10714,7 +10287,7 @@
     </w:p>
     <w:p>
       <w:pPr>
-        <w:pStyle w:val="Seznamobrzk"/>
+        <w:pStyle w:val="TableofFigures"/>
         <w:tabs>
           <w:tab w:val="right" w:leader="dot" w:pos="9062"/>
         </w:tabs>
@@ -10779,7 +10352,7 @@
     </w:p>
     <w:p>
       <w:pPr>
-        <w:pStyle w:val="Seznamobrzk"/>
+        <w:pStyle w:val="TableofFigures"/>
         <w:tabs>
           <w:tab w:val="right" w:leader="dot" w:pos="9062"/>
         </w:tabs>
@@ -10844,7 +10417,7 @@
     </w:p>
     <w:p>
       <w:pPr>
-        <w:pStyle w:val="Seznamobrzk"/>
+        <w:pStyle w:val="TableofFigures"/>
         <w:tabs>
           <w:tab w:val="right" w:leader="dot" w:pos="9062"/>
         </w:tabs>
@@ -10934,7 +10507,7 @@
     </w:p>
     <w:p>
       <w:pPr>
-        <w:pStyle w:val="Seznamobrzk"/>
+        <w:pStyle w:val="TableofFigures"/>
         <w:tabs>
           <w:tab w:val="right" w:leader="dot" w:pos="9062"/>
         </w:tabs>
@@ -10961,7 +10534,7 @@
       <w:hyperlink w:anchor="_Toc231758245" w:history="1">
         <w:r>
           <w:rPr>
-            <w:rStyle w:val="Hypertextovodkaz"/>
+            <w:rStyle w:val="Hyperlink"/>
             <w:noProof/>
           </w:rPr>
           <w:t>Tabulka 1: Vývojové prostředí</w:t>
@@ -11018,7 +10591,7 @@
     </w:p>
     <w:p>
       <w:pPr>
-        <w:pStyle w:val="Seznamobrzk"/>
+        <w:pStyle w:val="TableofFigures"/>
         <w:tabs>
           <w:tab w:val="right" w:leader="dot" w:pos="9062"/>
         </w:tabs>
@@ -11036,7 +10609,7 @@
       <w:hyperlink w:anchor="_Toc231758246" w:history="1">
         <w:r>
           <w:rPr>
-            <w:rStyle w:val="Hypertextovodkaz"/>
+            <w:rStyle w:val="Hyperlink"/>
             <w:noProof/>
           </w:rPr>
           <w:t>Tabulka 2: Komponenty.</w:t>
@@ -11112,7 +10685,7 @@
     </w:p>
     <w:p>
       <w:pPr>
-        <w:pStyle w:val="Seznamobrzk"/>
+        <w:pStyle w:val="TableofFigures"/>
         <w:tabs>
           <w:tab w:val="right" w:leader="dot" w:pos="9062"/>
         </w:tabs>
@@ -11139,7 +10712,7 @@
       <w:hyperlink w:anchor="_Toc231758247" w:history="1">
         <w:r>
           <w:rPr>
-            <w:rStyle w:val="Hypertextovodkaz"/>
+            <w:rStyle w:val="Hyperlink"/>
             <w:noProof/>
           </w:rPr>
           <w:t>Kód 1: Ukázka funkce pro update led diody</w:t>
@@ -11277,28 +10850,12 @@
           <w:bCs/>
         </w:rPr>
       </w:pPr>
-      <w:proofErr w:type="spellStart"/>
       <w:r>
         <w:rPr>
           <w:b/>
           <w:bCs/>
         </w:rPr>
-        <w:t>zaznamovy</w:t>
-      </w:r>
-      <w:proofErr w:type="spellEnd"/>
-      <w:r>
-        <w:rPr>
-          <w:b/>
-          <w:bCs/>
-        </w:rPr>
-        <w:t>-list-Strachoň Josef-3ITB</w:t>
-      </w:r>
-      <w:r>
-        <w:rPr>
-          <w:b/>
-          <w:bCs/>
-        </w:rPr>
-        <w:t xml:space="preserve">.pdf – </w:t>
+        <w:t xml:space="preserve">zaznamovy-list-Strachoň Josef-3ITB.pdf – </w:t>
       </w:r>
       <w:r>
         <w:t>Záznamový list ročníkové práce.</w:t>
@@ -11441,7 +10998,7 @@
     <w:sdtContent>
       <w:p>
         <w:pPr>
-          <w:pStyle w:val="Zpat"/>
+          <w:pStyle w:val="Footer"/>
           <w:jc w:val="center"/>
         </w:pPr>
         <w:r>
@@ -11464,7 +11021,7 @@
   </w:sdt>
   <w:p>
     <w:pPr>
-      <w:pStyle w:val="Zpat"/>
+      <w:pStyle w:val="Footer"/>
     </w:pPr>
   </w:p>
 </w:ftr>
@@ -11483,7 +11040,7 @@
     <w:sdtContent>
       <w:p>
         <w:pPr>
-          <w:pStyle w:val="Zpat"/>
+          <w:pStyle w:val="Footer"/>
           <w:jc w:val="center"/>
         </w:pPr>
         <w:r>
@@ -11509,7 +11066,7 @@
   </w:sdt>
   <w:p>
     <w:pPr>
-      <w:pStyle w:val="Zpat"/>
+      <w:pStyle w:val="Footer"/>
     </w:pPr>
   </w:p>
 </w:ftr>
@@ -11528,7 +11085,7 @@
     <w:sdtContent>
       <w:p>
         <w:pPr>
-          <w:pStyle w:val="Zpat"/>
+          <w:pStyle w:val="Footer"/>
           <w:jc w:val="center"/>
         </w:pPr>
         <w:r>
@@ -11551,7 +11108,7 @@
   </w:sdt>
   <w:p>
     <w:pPr>
-      <w:pStyle w:val="Zpat"/>
+      <w:pStyle w:val="Footer"/>
     </w:pPr>
   </w:p>
 </w:ftr>
@@ -11591,7 +11148,7 @@
     <w:lvl w:ilvl="0">
       <w:start w:val="1"/>
       <w:numFmt w:val="decimal"/>
-      <w:pStyle w:val="Nadpis1"/>
+      <w:pStyle w:val="Heading1"/>
       <w:lvlText w:val="%1"/>
       <w:lvlJc w:val="left"/>
       <w:pPr>
@@ -11601,7 +11158,7 @@
     <w:lvl w:ilvl="1">
       <w:start w:val="1"/>
       <w:numFmt w:val="decimal"/>
-      <w:pStyle w:val="Nadpis2"/>
+      <w:pStyle w:val="Heading2"/>
       <w:lvlText w:val="%1.%2"/>
       <w:lvlJc w:val="left"/>
       <w:pPr>
@@ -11611,7 +11168,7 @@
     <w:lvl w:ilvl="2">
       <w:start w:val="1"/>
       <w:numFmt w:val="decimal"/>
-      <w:pStyle w:val="Nadpis3"/>
+      <w:pStyle w:val="Heading3"/>
       <w:lvlText w:val="%1.%2.%3"/>
       <w:lvlJc w:val="left"/>
       <w:pPr>
@@ -11621,7 +11178,7 @@
     <w:lvl w:ilvl="3">
       <w:start w:val="1"/>
       <w:numFmt w:val="decimal"/>
-      <w:pStyle w:val="Nadpis4"/>
+      <w:pStyle w:val="Heading4"/>
       <w:lvlText w:val="%1.%2.%3.%4"/>
       <w:lvlJc w:val="left"/>
       <w:pPr>
@@ -11631,7 +11188,7 @@
     <w:lvl w:ilvl="4">
       <w:start w:val="1"/>
       <w:numFmt w:val="decimal"/>
-      <w:pStyle w:val="Nadpis5"/>
+      <w:pStyle w:val="Heading5"/>
       <w:lvlText w:val="%1.%2.%3.%4.%5"/>
       <w:lvlJc w:val="left"/>
       <w:pPr>
@@ -11641,7 +11198,7 @@
     <w:lvl w:ilvl="5">
       <w:start w:val="1"/>
       <w:numFmt w:val="decimal"/>
-      <w:pStyle w:val="Nadpis6"/>
+      <w:pStyle w:val="Heading6"/>
       <w:lvlText w:val="%1.%2.%3.%4.%5.%6"/>
       <w:lvlJc w:val="left"/>
       <w:pPr>
@@ -11651,7 +11208,7 @@
     <w:lvl w:ilvl="6">
       <w:start w:val="1"/>
       <w:numFmt w:val="decimal"/>
-      <w:pStyle w:val="Nadpis7"/>
+      <w:pStyle w:val="Heading7"/>
       <w:lvlText w:val="%1.%2.%3.%4.%5.%6.%7"/>
       <w:lvlJc w:val="left"/>
       <w:pPr>
@@ -11661,7 +11218,7 @@
     <w:lvl w:ilvl="7">
       <w:start w:val="1"/>
       <w:numFmt w:val="decimal"/>
-      <w:pStyle w:val="Nadpis8"/>
+      <w:pStyle w:val="Heading8"/>
       <w:lvlText w:val="%1.%2.%3.%4.%5.%6.%7.%8"/>
       <w:lvlJc w:val="left"/>
       <w:pPr>
@@ -11671,7 +11228,7 @@
     <w:lvl w:ilvl="8">
       <w:start w:val="1"/>
       <w:numFmt w:val="decimal"/>
-      <w:pStyle w:val="Nadpis9"/>
+      <w:pStyle w:val="Heading9"/>
       <w:lvlText w:val="%1.%2.%3.%4.%5.%6.%7.%8.%9"/>
       <w:lvlJc w:val="left"/>
       <w:pPr>
@@ -12908,7 +12465,7 @@
     <w:lsdException w:name="Unresolved Mention" w:semiHidden="1" w:unhideWhenUsed="1"/>
     <w:lsdException w:name="Smart Link" w:semiHidden="1" w:unhideWhenUsed="1"/>
   </w:latentStyles>
-  <w:style w:type="paragraph" w:default="1" w:styleId="Normln">
+  <w:style w:type="paragraph" w:default="1" w:styleId="Normal">
     <w:name w:val="Normal"/>
     <w:qFormat/>
     <w:rsid w:val="003F75E5"/>
@@ -12916,11 +12473,11 @@
       <w:jc w:val="both"/>
     </w:pPr>
   </w:style>
-  <w:style w:type="paragraph" w:styleId="Nadpis1">
+  <w:style w:type="paragraph" w:styleId="Heading1">
     <w:name w:val="heading 1"/>
-    <w:basedOn w:val="Normln"/>
-    <w:next w:val="Normln"/>
-    <w:link w:val="Nadpis1Char"/>
+    <w:basedOn w:val="Normal"/>
+    <w:next w:val="Normal"/>
+    <w:link w:val="Heading1Char"/>
     <w:uiPriority w:val="9"/>
     <w:qFormat/>
     <w:rsid w:val="00825E18"/>
@@ -12943,11 +12500,11 @@
       <w:szCs w:val="32"/>
     </w:rPr>
   </w:style>
-  <w:style w:type="paragraph" w:styleId="Nadpis2">
+  <w:style w:type="paragraph" w:styleId="Heading2">
     <w:name w:val="heading 2"/>
-    <w:basedOn w:val="Normln"/>
-    <w:next w:val="Normln"/>
-    <w:link w:val="Nadpis2Char"/>
+    <w:basedOn w:val="Normal"/>
+    <w:next w:val="Normal"/>
+    <w:link w:val="Heading2Char"/>
     <w:uiPriority w:val="9"/>
     <w:unhideWhenUsed/>
     <w:qFormat/>
@@ -12972,11 +12529,11 @@
       <w:szCs w:val="26"/>
     </w:rPr>
   </w:style>
-  <w:style w:type="paragraph" w:styleId="Nadpis3">
+  <w:style w:type="paragraph" w:styleId="Heading3">
     <w:name w:val="heading 3"/>
-    <w:basedOn w:val="Normln"/>
-    <w:next w:val="Normln"/>
-    <w:link w:val="Nadpis3Char"/>
+    <w:basedOn w:val="Normal"/>
+    <w:next w:val="Normal"/>
+    <w:link w:val="Heading3Char"/>
     <w:uiPriority w:val="9"/>
     <w:unhideWhenUsed/>
     <w:qFormat/>
@@ -12998,11 +12555,11 @@
       <w:szCs w:val="24"/>
     </w:rPr>
   </w:style>
-  <w:style w:type="paragraph" w:styleId="Nadpis4">
+  <w:style w:type="paragraph" w:styleId="Heading4">
     <w:name w:val="heading 4"/>
-    <w:basedOn w:val="Normln"/>
-    <w:next w:val="Normln"/>
-    <w:link w:val="Nadpis4Char"/>
+    <w:basedOn w:val="Normal"/>
+    <w:next w:val="Normal"/>
+    <w:link w:val="Heading4Char"/>
     <w:uiPriority w:val="9"/>
     <w:semiHidden/>
     <w:unhideWhenUsed/>
@@ -13025,11 +12582,11 @@
       <w:color w:val="2F5496" w:themeColor="accent1" w:themeShade="BF"/>
     </w:rPr>
   </w:style>
-  <w:style w:type="paragraph" w:styleId="Nadpis5">
+  <w:style w:type="paragraph" w:styleId="Heading5">
     <w:name w:val="heading 5"/>
-    <w:basedOn w:val="Normln"/>
-    <w:next w:val="Normln"/>
-    <w:link w:val="Nadpis5Char"/>
+    <w:basedOn w:val="Normal"/>
+    <w:next w:val="Normal"/>
+    <w:link w:val="Heading5Char"/>
     <w:uiPriority w:val="9"/>
     <w:semiHidden/>
     <w:unhideWhenUsed/>
@@ -13050,11 +12607,11 @@
       <w:color w:val="2F5496" w:themeColor="accent1" w:themeShade="BF"/>
     </w:rPr>
   </w:style>
-  <w:style w:type="paragraph" w:styleId="Nadpis6">
+  <w:style w:type="paragraph" w:styleId="Heading6">
     <w:name w:val="heading 6"/>
-    <w:basedOn w:val="Normln"/>
-    <w:next w:val="Normln"/>
-    <w:link w:val="Nadpis6Char"/>
+    <w:basedOn w:val="Normal"/>
+    <w:next w:val="Normal"/>
+    <w:link w:val="Heading6Char"/>
     <w:uiPriority w:val="9"/>
     <w:semiHidden/>
     <w:unhideWhenUsed/>
@@ -13075,11 +12632,11 @@
       <w:color w:val="1F3763" w:themeColor="accent1" w:themeShade="7F"/>
     </w:rPr>
   </w:style>
-  <w:style w:type="paragraph" w:styleId="Nadpis7">
+  <w:style w:type="paragraph" w:styleId="Heading7">
     <w:name w:val="heading 7"/>
-    <w:basedOn w:val="Normln"/>
-    <w:next w:val="Normln"/>
-    <w:link w:val="Nadpis7Char"/>
+    <w:basedOn w:val="Normal"/>
+    <w:next w:val="Normal"/>
+    <w:link w:val="Heading7Char"/>
     <w:uiPriority w:val="9"/>
     <w:semiHidden/>
     <w:unhideWhenUsed/>
@@ -13102,11 +12659,11 @@
       <w:color w:val="1F3763" w:themeColor="accent1" w:themeShade="7F"/>
     </w:rPr>
   </w:style>
-  <w:style w:type="paragraph" w:styleId="Nadpis8">
+  <w:style w:type="paragraph" w:styleId="Heading8">
     <w:name w:val="heading 8"/>
-    <w:basedOn w:val="Normln"/>
-    <w:next w:val="Normln"/>
-    <w:link w:val="Nadpis8Char"/>
+    <w:basedOn w:val="Normal"/>
+    <w:next w:val="Normal"/>
+    <w:link w:val="Heading8Char"/>
     <w:uiPriority w:val="9"/>
     <w:semiHidden/>
     <w:unhideWhenUsed/>
@@ -13129,11 +12686,11 @@
       <w:szCs w:val="21"/>
     </w:rPr>
   </w:style>
-  <w:style w:type="paragraph" w:styleId="Nadpis9">
+  <w:style w:type="paragraph" w:styleId="Heading9">
     <w:name w:val="heading 9"/>
-    <w:basedOn w:val="Normln"/>
-    <w:next w:val="Normln"/>
-    <w:link w:val="Nadpis9Char"/>
+    <w:basedOn w:val="Normal"/>
+    <w:next w:val="Normal"/>
+    <w:link w:val="Heading9Char"/>
     <w:uiPriority w:val="9"/>
     <w:semiHidden/>
     <w:unhideWhenUsed/>
@@ -13158,13 +12715,13 @@
       <w:szCs w:val="21"/>
     </w:rPr>
   </w:style>
-  <w:style w:type="character" w:default="1" w:styleId="Standardnpsmoodstavce">
+  <w:style w:type="character" w:default="1" w:styleId="DefaultParagraphFont">
     <w:name w:val="Default Paragraph Font"/>
     <w:uiPriority w:val="1"/>
     <w:semiHidden/>
     <w:unhideWhenUsed/>
   </w:style>
-  <w:style w:type="table" w:default="1" w:styleId="Normlntabulka">
+  <w:style w:type="table" w:default="1" w:styleId="TableNormal">
     <w:name w:val="Normal Table"/>
     <w:uiPriority w:val="99"/>
     <w:semiHidden/>
@@ -13179,16 +12736,16 @@
       </w:tblCellMar>
     </w:tblPr>
   </w:style>
-  <w:style w:type="numbering" w:default="1" w:styleId="Bezseznamu">
+  <w:style w:type="numbering" w:default="1" w:styleId="NoList">
     <w:name w:val="No List"/>
     <w:uiPriority w:val="99"/>
     <w:semiHidden/>
     <w:unhideWhenUsed/>
   </w:style>
-  <w:style w:type="paragraph" w:styleId="Zhlav">
+  <w:style w:type="paragraph" w:styleId="Header">
     <w:name w:val="header"/>
-    <w:basedOn w:val="Normln"/>
-    <w:link w:val="ZhlavChar"/>
+    <w:basedOn w:val="Normal"/>
+    <w:link w:val="HeaderChar"/>
     <w:uiPriority w:val="99"/>
     <w:unhideWhenUsed/>
     <w:rsid w:val="00B02B33"/>
@@ -13200,17 +12757,17 @@
       <w:spacing w:after="0" w:line="240" w:lineRule="auto"/>
     </w:pPr>
   </w:style>
-  <w:style w:type="character" w:customStyle="1" w:styleId="ZhlavChar">
-    <w:name w:val="Záhlaví Char"/>
-    <w:basedOn w:val="Standardnpsmoodstavce"/>
-    <w:link w:val="Zhlav"/>
+  <w:style w:type="character" w:customStyle="1" w:styleId="HeaderChar">
+    <w:name w:val="Header Char"/>
+    <w:basedOn w:val="DefaultParagraphFont"/>
+    <w:link w:val="Header"/>
     <w:uiPriority w:val="99"/>
     <w:rsid w:val="00B02B33"/>
   </w:style>
-  <w:style w:type="paragraph" w:styleId="Zpat">
+  <w:style w:type="paragraph" w:styleId="Footer">
     <w:name w:val="footer"/>
-    <w:basedOn w:val="Normln"/>
-    <w:link w:val="ZpatChar"/>
+    <w:basedOn w:val="Normal"/>
+    <w:link w:val="FooterChar"/>
     <w:uiPriority w:val="99"/>
     <w:unhideWhenUsed/>
     <w:rsid w:val="00B02B33"/>
@@ -13222,17 +12779,17 @@
       <w:spacing w:after="0" w:line="240" w:lineRule="auto"/>
     </w:pPr>
   </w:style>
-  <w:style w:type="character" w:customStyle="1" w:styleId="ZpatChar">
-    <w:name w:val="Zápatí Char"/>
-    <w:basedOn w:val="Standardnpsmoodstavce"/>
-    <w:link w:val="Zpat"/>
+  <w:style w:type="character" w:customStyle="1" w:styleId="FooterChar">
+    <w:name w:val="Footer Char"/>
+    <w:basedOn w:val="DefaultParagraphFont"/>
+    <w:link w:val="Footer"/>
     <w:uiPriority w:val="99"/>
     <w:rsid w:val="00B02B33"/>
   </w:style>
-  <w:style w:type="character" w:customStyle="1" w:styleId="Nadpis1Char">
-    <w:name w:val="Nadpis 1 Char"/>
-    <w:basedOn w:val="Standardnpsmoodstavce"/>
-    <w:link w:val="Nadpis1"/>
+  <w:style w:type="character" w:customStyle="1" w:styleId="Heading1Char">
+    <w:name w:val="Heading 1 Char"/>
+    <w:basedOn w:val="DefaultParagraphFont"/>
+    <w:link w:val="Heading1"/>
     <w:uiPriority w:val="9"/>
     <w:rsid w:val="00825E18"/>
     <w:rPr>
@@ -13241,10 +12798,10 @@
       <w:szCs w:val="32"/>
     </w:rPr>
   </w:style>
-  <w:style w:type="paragraph" w:styleId="Nadpisobsahu">
+  <w:style w:type="paragraph" w:styleId="TOCHeading">
     <w:name w:val="TOC Heading"/>
-    <w:basedOn w:val="Nadpis1"/>
-    <w:next w:val="Normln"/>
+    <w:basedOn w:val="Heading1"/>
+    <w:next w:val="Normal"/>
     <w:uiPriority w:val="39"/>
     <w:unhideWhenUsed/>
     <w:qFormat/>
@@ -13264,10 +12821,10 @@
       <w:sz w:val="32"/>
     </w:rPr>
   </w:style>
-  <w:style w:type="paragraph" w:styleId="Obsah1">
+  <w:style w:type="paragraph" w:styleId="TOC1">
     <w:name w:val="toc 1"/>
-    <w:basedOn w:val="Normln"/>
-    <w:next w:val="Normln"/>
+    <w:basedOn w:val="Normal"/>
+    <w:next w:val="Normal"/>
     <w:autoRedefine/>
     <w:uiPriority w:val="39"/>
     <w:unhideWhenUsed/>
@@ -13276,9 +12833,9 @@
       <w:spacing w:after="100"/>
     </w:pPr>
   </w:style>
-  <w:style w:type="character" w:styleId="Hypertextovodkaz">
+  <w:style w:type="character" w:styleId="Hyperlink">
     <w:name w:val="Hyperlink"/>
-    <w:basedOn w:val="Standardnpsmoodstavce"/>
+    <w:basedOn w:val="DefaultParagraphFont"/>
     <w:uiPriority w:val="99"/>
     <w:unhideWhenUsed/>
     <w:rsid w:val="007619C0"/>
@@ -13289,8 +12846,8 @@
   </w:style>
   <w:style w:type="paragraph" w:customStyle="1" w:styleId="NadpisBezsla">
     <w:name w:val="Nadpis Bez čísla"/>
-    <w:basedOn w:val="Nadpis1"/>
-    <w:next w:val="Normln"/>
+    <w:basedOn w:val="Heading1"/>
+    <w:next w:val="Normal"/>
     <w:link w:val="NadpisBezslaChar"/>
     <w:qFormat/>
     <w:rsid w:val="006E32D7"/>
@@ -13307,10 +12864,10 @@
       <w:noProof/>
     </w:rPr>
   </w:style>
-  <w:style w:type="character" w:customStyle="1" w:styleId="Nadpis2Char">
-    <w:name w:val="Nadpis 2 Char"/>
-    <w:basedOn w:val="Standardnpsmoodstavce"/>
-    <w:link w:val="Nadpis2"/>
+  <w:style w:type="character" w:customStyle="1" w:styleId="Heading2Char">
+    <w:name w:val="Heading 2 Char"/>
+    <w:basedOn w:val="DefaultParagraphFont"/>
+    <w:link w:val="Heading2"/>
     <w:uiPriority w:val="9"/>
     <w:rsid w:val="00510A0D"/>
     <w:rPr>
@@ -13321,7 +12878,7 @@
   </w:style>
   <w:style w:type="character" w:customStyle="1" w:styleId="NadpisBezslaChar">
     <w:name w:val="Nadpis Bez čísla Char"/>
-    <w:basedOn w:val="Nadpis1Char"/>
+    <w:basedOn w:val="Heading1Char"/>
     <w:link w:val="NadpisBezsla"/>
     <w:rsid w:val="006E32D7"/>
     <w:rPr>
@@ -13331,10 +12888,10 @@
       <w:szCs w:val="32"/>
     </w:rPr>
   </w:style>
-  <w:style w:type="character" w:customStyle="1" w:styleId="Nadpis3Char">
-    <w:name w:val="Nadpis 3 Char"/>
-    <w:basedOn w:val="Standardnpsmoodstavce"/>
-    <w:link w:val="Nadpis3"/>
+  <w:style w:type="character" w:customStyle="1" w:styleId="Heading3Char">
+    <w:name w:val="Heading 3 Char"/>
+    <w:basedOn w:val="DefaultParagraphFont"/>
+    <w:link w:val="Heading3"/>
     <w:uiPriority w:val="9"/>
     <w:rsid w:val="00825E18"/>
     <w:rPr>
@@ -13344,10 +12901,10 @@
       <w:szCs w:val="24"/>
     </w:rPr>
   </w:style>
-  <w:style w:type="character" w:customStyle="1" w:styleId="Nadpis4Char">
-    <w:name w:val="Nadpis 4 Char"/>
-    <w:basedOn w:val="Standardnpsmoodstavce"/>
-    <w:link w:val="Nadpis4"/>
+  <w:style w:type="character" w:customStyle="1" w:styleId="Heading4Char">
+    <w:name w:val="Heading 4 Char"/>
+    <w:basedOn w:val="DefaultParagraphFont"/>
+    <w:link w:val="Heading4"/>
     <w:uiPriority w:val="9"/>
     <w:semiHidden/>
     <w:rsid w:val="00825E18"/>
@@ -13358,10 +12915,10 @@
       <w:color w:val="2F5496" w:themeColor="accent1" w:themeShade="BF"/>
     </w:rPr>
   </w:style>
-  <w:style w:type="character" w:customStyle="1" w:styleId="Nadpis5Char">
-    <w:name w:val="Nadpis 5 Char"/>
-    <w:basedOn w:val="Standardnpsmoodstavce"/>
-    <w:link w:val="Nadpis5"/>
+  <w:style w:type="character" w:customStyle="1" w:styleId="Heading5Char">
+    <w:name w:val="Heading 5 Char"/>
+    <w:basedOn w:val="DefaultParagraphFont"/>
+    <w:link w:val="Heading5"/>
     <w:uiPriority w:val="9"/>
     <w:semiHidden/>
     <w:rsid w:val="00825E18"/>
@@ -13370,10 +12927,10 @@
       <w:color w:val="2F5496" w:themeColor="accent1" w:themeShade="BF"/>
     </w:rPr>
   </w:style>
-  <w:style w:type="character" w:customStyle="1" w:styleId="Nadpis6Char">
-    <w:name w:val="Nadpis 6 Char"/>
-    <w:basedOn w:val="Standardnpsmoodstavce"/>
-    <w:link w:val="Nadpis6"/>
+  <w:style w:type="character" w:customStyle="1" w:styleId="Heading6Char">
+    <w:name w:val="Heading 6 Char"/>
+    <w:basedOn w:val="DefaultParagraphFont"/>
+    <w:link w:val="Heading6"/>
     <w:uiPriority w:val="9"/>
     <w:semiHidden/>
     <w:rsid w:val="00825E18"/>
@@ -13382,10 +12939,10 @@
       <w:color w:val="1F3763" w:themeColor="accent1" w:themeShade="7F"/>
     </w:rPr>
   </w:style>
-  <w:style w:type="character" w:customStyle="1" w:styleId="Nadpis7Char">
-    <w:name w:val="Nadpis 7 Char"/>
-    <w:basedOn w:val="Standardnpsmoodstavce"/>
-    <w:link w:val="Nadpis7"/>
+  <w:style w:type="character" w:customStyle="1" w:styleId="Heading7Char">
+    <w:name w:val="Heading 7 Char"/>
+    <w:basedOn w:val="DefaultParagraphFont"/>
+    <w:link w:val="Heading7"/>
     <w:uiPriority w:val="9"/>
     <w:semiHidden/>
     <w:rsid w:val="00825E18"/>
@@ -13396,10 +12953,10 @@
       <w:color w:val="1F3763" w:themeColor="accent1" w:themeShade="7F"/>
     </w:rPr>
   </w:style>
-  <w:style w:type="character" w:customStyle="1" w:styleId="Nadpis8Char">
-    <w:name w:val="Nadpis 8 Char"/>
-    <w:basedOn w:val="Standardnpsmoodstavce"/>
-    <w:link w:val="Nadpis8"/>
+  <w:style w:type="character" w:customStyle="1" w:styleId="Heading8Char">
+    <w:name w:val="Heading 8 Char"/>
+    <w:basedOn w:val="DefaultParagraphFont"/>
+    <w:link w:val="Heading8"/>
     <w:uiPriority w:val="9"/>
     <w:semiHidden/>
     <w:rsid w:val="00825E18"/>
@@ -13410,10 +12967,10 @@
       <w:szCs w:val="21"/>
     </w:rPr>
   </w:style>
-  <w:style w:type="character" w:customStyle="1" w:styleId="Nadpis9Char">
-    <w:name w:val="Nadpis 9 Char"/>
-    <w:basedOn w:val="Standardnpsmoodstavce"/>
-    <w:link w:val="Nadpis9"/>
+  <w:style w:type="character" w:customStyle="1" w:styleId="Heading9Char">
+    <w:name w:val="Heading 9 Char"/>
+    <w:basedOn w:val="DefaultParagraphFont"/>
+    <w:link w:val="Heading9"/>
     <w:uiPriority w:val="9"/>
     <w:semiHidden/>
     <w:rsid w:val="00825E18"/>
@@ -13428,8 +12985,8 @@
   </w:style>
   <w:style w:type="paragraph" w:customStyle="1" w:styleId="slovanObyennadpis1">
     <w:name w:val="Číslovaný Obyčený nadpis 1"/>
-    <w:basedOn w:val="Normln"/>
-    <w:next w:val="Normln"/>
+    <w:basedOn w:val="Normal"/>
+    <w:next w:val="Normal"/>
     <w:rsid w:val="007354CE"/>
     <w:pPr>
       <w:numPr>
@@ -13445,9 +13002,9 @@
       <w:lang w:eastAsia="cs-CZ"/>
     </w:rPr>
   </w:style>
-  <w:style w:type="paragraph" w:styleId="Odstavecseseznamem">
+  <w:style w:type="paragraph" w:styleId="ListParagraph">
     <w:name w:val="List Paragraph"/>
-    <w:basedOn w:val="Normln"/>
+    <w:basedOn w:val="Normal"/>
     <w:uiPriority w:val="34"/>
     <w:qFormat/>
     <w:rsid w:val="00E7696F"/>
@@ -13456,10 +13013,10 @@
       <w:contextualSpacing/>
     </w:pPr>
   </w:style>
-  <w:style w:type="paragraph" w:styleId="Obsah2">
+  <w:style w:type="paragraph" w:styleId="TOC2">
     <w:name w:val="toc 2"/>
-    <w:basedOn w:val="Normln"/>
-    <w:next w:val="Normln"/>
+    <w:basedOn w:val="Normal"/>
+    <w:next w:val="Normal"/>
     <w:autoRedefine/>
     <w:uiPriority w:val="39"/>
     <w:unhideWhenUsed/>
@@ -13471,7 +13028,7 @@
   </w:style>
   <w:style w:type="paragraph" w:customStyle="1" w:styleId="Normlntext">
     <w:name w:val="Normální text"/>
-    <w:basedOn w:val="Normln"/>
+    <w:basedOn w:val="Normal"/>
     <w:qFormat/>
     <w:rsid w:val="00884443"/>
     <w:pPr>
@@ -13479,10 +13036,10 @@
       <w:ind w:firstLine="284"/>
     </w:pPr>
   </w:style>
-  <w:style w:type="paragraph" w:styleId="Obsah3">
+  <w:style w:type="paragraph" w:styleId="TOC3">
     <w:name w:val="toc 3"/>
-    <w:basedOn w:val="Normln"/>
-    <w:next w:val="Normln"/>
+    <w:basedOn w:val="Normal"/>
+    <w:next w:val="Normal"/>
     <w:autoRedefine/>
     <w:uiPriority w:val="39"/>
     <w:unhideWhenUsed/>
@@ -13492,10 +13049,10 @@
       <w:ind w:left="440"/>
     </w:pPr>
   </w:style>
-  <w:style w:type="paragraph" w:styleId="Titulek">
+  <w:style w:type="paragraph" w:styleId="Caption">
     <w:name w:val="caption"/>
-    <w:basedOn w:val="Normln"/>
-    <w:next w:val="Normln"/>
+    <w:basedOn w:val="Normal"/>
+    <w:next w:val="Normal"/>
     <w:uiPriority w:val="35"/>
     <w:unhideWhenUsed/>
     <w:qFormat/>
@@ -13511,10 +13068,10 @@
       <w:szCs w:val="18"/>
     </w:rPr>
   </w:style>
-  <w:style w:type="paragraph" w:styleId="Seznamobrzk">
+  <w:style w:type="paragraph" w:styleId="TableofFigures">
     <w:name w:val="table of figures"/>
-    <w:basedOn w:val="Normln"/>
-    <w:next w:val="Normln"/>
+    <w:basedOn w:val="Normal"/>
+    <w:next w:val="Normal"/>
     <w:uiPriority w:val="99"/>
     <w:unhideWhenUsed/>
     <w:rsid w:val="00D3067B"/>
@@ -13530,9 +13087,9 @@
       <w:szCs w:val="20"/>
     </w:rPr>
   </w:style>
-  <w:style w:type="table" w:styleId="Mkatabulky">
+  <w:style w:type="table" w:styleId="TableGrid">
     <w:name w:val="Table Grid"/>
-    <w:basedOn w:val="Normlntabulka"/>
+    <w:basedOn w:val="TableNormal"/>
     <w:uiPriority w:val="39"/>
     <w:rsid w:val="00A03307"/>
     <w:pPr>
@@ -13549,9 +13106,9 @@
       </w:tblBorders>
     </w:tblPr>
   </w:style>
-  <w:style w:type="paragraph" w:styleId="Normlnweb">
+  <w:style w:type="paragraph" w:styleId="NormalWeb">
     <w:name w:val="Normal (Web)"/>
-    <w:basedOn w:val="Normln"/>
+    <w:basedOn w:val="Normal"/>
     <w:uiPriority w:val="99"/>
     <w:semiHidden/>
     <w:unhideWhenUsed/>
@@ -13567,9 +13124,9 @@
       <w:lang w:eastAsia="cs-CZ"/>
     </w:rPr>
   </w:style>
-  <w:style w:type="character" w:styleId="Sledovanodkaz">
+  <w:style w:type="character" w:styleId="FollowedHyperlink">
     <w:name w:val="FollowedHyperlink"/>
-    <w:basedOn w:val="Standardnpsmoodstavce"/>
+    <w:basedOn w:val="DefaultParagraphFont"/>
     <w:uiPriority w:val="99"/>
     <w:semiHidden/>
     <w:unhideWhenUsed/>
@@ -13579,17 +13136,17 @@
       <w:u w:val="single"/>
     </w:rPr>
   </w:style>
-  <w:style w:type="paragraph" w:styleId="Bibliografie">
+  <w:style w:type="paragraph" w:styleId="Bibliography">
     <w:name w:val="Bibliography"/>
-    <w:basedOn w:val="Normln"/>
-    <w:next w:val="Normln"/>
+    <w:basedOn w:val="Normal"/>
+    <w:next w:val="Normal"/>
     <w:uiPriority w:val="37"/>
     <w:unhideWhenUsed/>
     <w:rsid w:val="001F37D0"/>
   </w:style>
   <w:style w:type="paragraph" w:customStyle="1" w:styleId="Ukzkakdu">
     <w:name w:val="Ukázka_kódu"/>
-    <w:basedOn w:val="Normln"/>
+    <w:basedOn w:val="Normal"/>
     <w:link w:val="UkzkakduChar"/>
     <w:qFormat/>
     <w:rsid w:val="00D0160C"/>
@@ -13607,7 +13164,7 @@
   </w:style>
   <w:style w:type="character" w:customStyle="1" w:styleId="UkzkakduChar">
     <w:name w:val="Ukázka_kódu Char"/>
-    <w:basedOn w:val="Standardnpsmoodstavce"/>
+    <w:basedOn w:val="DefaultParagraphFont"/>
     <w:link w:val="Ukzkakdu"/>
     <w:rsid w:val="00D0160C"/>
     <w:rPr>
@@ -13933,6 +13490,156 @@
 </file>
 
 <file path=customXml/item1.xml><?xml version="1.0" encoding="utf-8"?>
+<b:Sources xmlns:b="http://schemas.openxmlformats.org/officeDocument/2006/bibliography" xmlns="http://schemas.openxmlformats.org/officeDocument/2006/bibliography" SelectedStyle="\ISO690Nmerical.XSL" StyleName="ISO 690 – číselná reference" Version="1987">
+  <b:Source>
+    <b:Tag>Esp26</b:Tag>
+    <b:SourceType>InternetSite</b:SourceType>
+    <b:Guid>{A93FBA84-EBF2-4D76-B073-C9FA111C2856}</b:Guid>
+    <b:Author>
+      <b:Author>
+        <b:Corporate>Espressif Systems</b:Corporate>
+      </b:Author>
+    </b:Author>
+    <b:Title>ESP32-C6 Series Datasheet</b:Title>
+    <b:InternetSiteTitle>Espressif Documentation</b:InternetSiteTitle>
+    <b:YearAccessed>2026</b:YearAccessed>
+    <b:MonthAccessed>1</b:MonthAccessed>
+    <b:DayAccessed>12</b:DayAccessed>
+    <b:URL>https://www.espressif.com/en/products/socs/esp32-c6</b:URL>
+    <b:RefOrder>5</b:RefOrder>
+  </b:Source>
+  <b:Source>
+    <b:Tag>Bos26</b:Tag>
+    <b:SourceType>InternetSite</b:SourceType>
+    <b:Guid>{0A8061CB-B94E-4992-A042-1A7BA55A4751}</b:Guid>
+    <b:Author>
+      <b:Author>
+        <b:Corporate>Bosch Sensortec</b:Corporate>
+      </b:Author>
+    </b:Author>
+    <b:Title>BMI160 – Low Power Inertial Measurement Unit</b:Title>
+    <b:InternetSiteTitle>Bosch Sensortec</b:InternetSiteTitle>
+    <b:YearAccessed>2026</b:YearAccessed>
+    <b:MonthAccessed>1</b:MonthAccessed>
+    <b:DayAccessed>12</b:DayAccessed>
+    <b:URL>https://www.bosch-sensortec.com/products/motion-sensors/imus/bmi160/</b:URL>
+    <b:RefOrder>3</b:RefOrder>
+  </b:Source>
+  <b:Source>
+    <b:Tag>Wiz25</b:Tag>
+    <b:SourceType>InternetSite</b:SourceType>
+    <b:Guid>{D0887F76-6747-4807-AB42-A791636F397A}</b:Guid>
+    <b:Author>
+      <b:Author>
+        <b:Corporate>Wizard Tag</b:Corporate>
+      </b:Author>
+    </b:Author>
+    <b:Title>https://www.wizardtag.com/about-us/#about-us</b:Title>
+    <b:InternetSiteTitle>Wizard Tag</b:InternetSiteTitle>
+    <b:Year>2025</b:Year>
+    <b:YearAccessed>2026</b:YearAccessed>
+    <b:MonthAccessed>1</b:MonthAccessed>
+    <b:DayAccessed>12</b:DayAccessed>
+    <b:URL>https://www.wizardtag.com/about-us/#about-us</b:URL>
+    <b:RefOrder>1</b:RefOrder>
+  </b:Source>
+  <b:Source>
+    <b:Tag>Las26</b:Tag>
+    <b:SourceType>InternetSite</b:SourceType>
+    <b:Guid>{6A0DA8CA-4A23-49C1-BC0C-762852CC6ABB}</b:Guid>
+    <b:Author>
+      <b:Author>
+        <b:Corporate>Laskakit</b:Corporate>
+      </b:Author>
+    </b:Author>
+    <b:Title>Digitální kompas QMC5883L</b:Title>
+    <b:InternetSiteTitle>Laskakit</b:InternetSiteTitle>
+    <b:YearAccessed>2026</b:YearAccessed>
+    <b:MonthAccessed>1</b:MonthAccessed>
+    <b:DayAccessed>12</b:DayAccessed>
+    <b:URL>https://www.laskakit.cz/arduino-kompas-qmc5883l/</b:URL>
+    <b:RefOrder>8</b:RefOrder>
+  </b:Source>
+  <b:Source>
+    <b:Tag>Las</b:Tag>
+    <b:SourceType>InternetSite</b:SourceType>
+    <b:Guid>{720A3B8B-2369-4086-866A-8C6FD645EC08}</b:Guid>
+    <b:Author>
+      <b:Author>
+        <b:Corporate>Laskakit</b:Corporate>
+      </b:Author>
+    </b:Author>
+    <b:Title>Nabíjecí modul TP4056 s ochranou</b:Title>
+    <b:InternetSiteTitle>Laskakit</b:InternetSiteTitle>
+    <b:YearAccessed>2026</b:YearAccessed>
+    <b:MonthAccessed>1</b:MonthAccessed>
+    <b:DayAccessed>12</b:DayAccessed>
+    <b:URL>https://www.laskakit.cz/nabijecka-tp4056-s-ochranou/</b:URL>
+    <b:RefOrder>9</b:RefOrder>
+  </b:Source>
+  <b:Source>
+    <b:Tag>Esp32</b:Tag>
+    <b:SourceType>InternetSite</b:SourceType>
+    <b:Guid>{66D88290-40BA-471F-A5CB-3D53A920B968}</b:Guid>
+    <b:Author>
+      <b:Author>
+        <b:Corporate>Espressif Systems</b:Corporate>
+      </b:Author>
+    </b:Author>
+    <b:Title>ESP-IDF Programming Guide</b:Title>
+    <b:InternetSiteTitle>Espressif Documentation</b:InternetSiteTitle>
+    <b:YearAccessed>2026</b:YearAccessed>
+    <b:MonthAccessed>1</b:MonthAccessed>
+    <b:DayAccessed>12</b:DayAccessed>
+    <b:URL>https://docs.espressif.com/projects/esp-idf/en/latest/esp32c6/</b:URL>
+    <b:RefOrder>6</b:RefOrder>
+  </b:Source>
+  <b:Source>
+    <b:Tag>LAS26</b:Tag>
+    <b:SourceType>InternetSite</b:SourceType>
+    <b:Guid>{51356040-1E6B-4792-9459-D0262F570A7C}</b:Guid>
+    <b:Title>LASERTAG NET</b:Title>
+    <b:InternetSiteTitle>https://lasertag.net/blog/Technology_Behind_Advanced_Laser_Tag_Systems</b:InternetSiteTitle>
+    <b:YearAccessed>2026</b:YearAccessed>
+    <b:MonthAccessed>Květen</b:MonthAccessed>
+    <b:DayAccessed>27</b:DayAccessed>
+    <b:URL>https://lasertag.net/blog/Technology_Behind_Advanced_Laser_Tag_Systems</b:URL>
+    <b:RefOrder>2</b:RefOrder>
+  </b:Source>
+  <b:Source>
+    <b:Tag>TDK26</b:Tag>
+    <b:SourceType>InternetSite</b:SourceType>
+    <b:Guid>{A74C91B5-E0A5-45AE-8C95-4E1C5AE4A27B}</b:Guid>
+    <b:Title>TDK</b:Title>
+    <b:InternetSiteTitle>https://www.tdk.com/en/featured_stories/entry_051-metaverse-motion-sensors.html</b:InternetSiteTitle>
+    <b:YearAccessed>2026</b:YearAccessed>
+    <b:MonthAccessed>Květen</b:MonthAccessed>
+    <b:DayAccessed>22</b:DayAccessed>
+    <b:URL>https://www.tdk.com/en/featured_stories/entry_051-metaverse-motion-sensors.html</b:URL>
+    <b:RefOrder>4</b:RefOrder>
+  </b:Source>
+  <b:Source>
+    <b:Tag>QOR26</b:Tag>
+    <b:SourceType>InternetSite</b:SourceType>
+    <b:Guid>{F65380FB-7C05-4A68-AD39-ACE1F36CF5E8}</b:Guid>
+    <b:YearAccessed>2026</b:YearAccessed>
+    <b:MonthAccessed>Únor</b:MonthAccessed>
+    <b:DayAccessed>14</b:DayAccessed>
+    <b:URL>https://www.qorvo.com/innovation/ultra-wideband</b:URL>
+    <b:Title>QORVO</b:Title>
+    <b:InternetSiteTitle>https://www.qorvo.com/innovation/ultra-wideband</b:InternetSiteTitle>
+    <b:RefOrder>7</b:RefOrder>
+  </b:Source>
+</b:Sources>
+</file>
+
+<file path=customXml/item2.xml><?xml version="1.0" encoding="utf-8"?>
+<p:properties xmlns:p="http://schemas.microsoft.com/office/2006/metadata/properties" xmlns:xsi="http://www.w3.org/2001/XMLSchema-instance" xmlns:pc="http://schemas.microsoft.com/office/infopath/2007/PartnerControls">
+  <documentManagement/>
+</p:properties>
+</file>
+
+<file path=customXml/item3.xml><?xml version="1.0" encoding="utf-8"?>
 <ct:contentTypeSchema xmlns:ct="http://schemas.microsoft.com/office/2006/metadata/contentType" xmlns:ma="http://schemas.microsoft.com/office/2006/metadata/properties/metaAttributes" ct:_="" ma:_="" ma:contentTypeName="Dokument" ma:contentTypeID="0x01010050B1E99129EB1C4B94650070FE2E0B3B" ma:contentTypeVersion="4" ma:contentTypeDescription="Vytvoří nový dokument" ma:contentTypeScope="" ma:versionID="4b1406bcfa7da0748f6a3409a4d9ec36">
   <xsd:schema xmlns:xsd="http://www.w3.org/2001/XMLSchema" xmlns:xs="http://www.w3.org/2001/XMLSchema" xmlns:p="http://schemas.microsoft.com/office/2006/metadata/properties" xmlns:ns2="c3e65571-a390-4c9e-b8e9-5d531d8bbe37" xmlns:ns3="754b39a0-e428-4fa2-823f-61c0c676bbed" targetNamespace="http://schemas.microsoft.com/office/2006/metadata/properties" ma:root="true" ma:fieldsID="85554ed8242ef730ce8ebbc69a9f6cc5" ns2:_="" ns3:_="">
     <xsd:import namespace="c3e65571-a390-4c9e-b8e9-5d531d8bbe37"/>
@@ -14097,156 +13804,6 @@
 </ct:contentTypeSchema>
 </file>
 
-<file path=customXml/item2.xml><?xml version="1.0" encoding="utf-8"?>
-<p:properties xmlns:p="http://schemas.microsoft.com/office/2006/metadata/properties" xmlns:xsi="http://www.w3.org/2001/XMLSchema-instance" xmlns:pc="http://schemas.microsoft.com/office/infopath/2007/PartnerControls">
-  <documentManagement/>
-</p:properties>
-</file>
-
-<file path=customXml/item3.xml><?xml version="1.0" encoding="utf-8"?>
-<b:Sources xmlns:b="http://schemas.openxmlformats.org/officeDocument/2006/bibliography" xmlns="http://schemas.openxmlformats.org/officeDocument/2006/bibliography" SelectedStyle="\ISO690Nmerical.XSL" StyleName="ISO 690 – číselná reference" Version="1987">
-  <b:Source>
-    <b:Tag>Esp26</b:Tag>
-    <b:SourceType>InternetSite</b:SourceType>
-    <b:Guid>{A93FBA84-EBF2-4D76-B073-C9FA111C2856}</b:Guid>
-    <b:Author>
-      <b:Author>
-        <b:Corporate>Espressif Systems</b:Corporate>
-      </b:Author>
-    </b:Author>
-    <b:Title>ESP32-C6 Series Datasheet</b:Title>
-    <b:InternetSiteTitle>Espressif Documentation</b:InternetSiteTitle>
-    <b:YearAccessed>2026</b:YearAccessed>
-    <b:MonthAccessed>1</b:MonthAccessed>
-    <b:DayAccessed>12</b:DayAccessed>
-    <b:URL>https://www.espressif.com/en/products/socs/esp32-c6</b:URL>
-    <b:RefOrder>5</b:RefOrder>
-  </b:Source>
-  <b:Source>
-    <b:Tag>Bos26</b:Tag>
-    <b:SourceType>InternetSite</b:SourceType>
-    <b:Guid>{0A8061CB-B94E-4992-A042-1A7BA55A4751}</b:Guid>
-    <b:Author>
-      <b:Author>
-        <b:Corporate>Bosch Sensortec</b:Corporate>
-      </b:Author>
-    </b:Author>
-    <b:Title>BMI160 – Low Power Inertial Measurement Unit</b:Title>
-    <b:InternetSiteTitle>Bosch Sensortec</b:InternetSiteTitle>
-    <b:YearAccessed>2026</b:YearAccessed>
-    <b:MonthAccessed>1</b:MonthAccessed>
-    <b:DayAccessed>12</b:DayAccessed>
-    <b:URL>https://www.bosch-sensortec.com/products/motion-sensors/imus/bmi160/</b:URL>
-    <b:RefOrder>3</b:RefOrder>
-  </b:Source>
-  <b:Source>
-    <b:Tag>Wiz25</b:Tag>
-    <b:SourceType>InternetSite</b:SourceType>
-    <b:Guid>{D0887F76-6747-4807-AB42-A791636F397A}</b:Guid>
-    <b:Author>
-      <b:Author>
-        <b:Corporate>Wizard Tag</b:Corporate>
-      </b:Author>
-    </b:Author>
-    <b:Title>https://www.wizardtag.com/about-us/#about-us</b:Title>
-    <b:InternetSiteTitle>Wizard Tag</b:InternetSiteTitle>
-    <b:Year>2025</b:Year>
-    <b:YearAccessed>2026</b:YearAccessed>
-    <b:MonthAccessed>1</b:MonthAccessed>
-    <b:DayAccessed>12</b:DayAccessed>
-    <b:URL>https://www.wizardtag.com/about-us/#about-us</b:URL>
-    <b:RefOrder>1</b:RefOrder>
-  </b:Source>
-  <b:Source>
-    <b:Tag>Las26</b:Tag>
-    <b:SourceType>InternetSite</b:SourceType>
-    <b:Guid>{6A0DA8CA-4A23-49C1-BC0C-762852CC6ABB}</b:Guid>
-    <b:Author>
-      <b:Author>
-        <b:Corporate>Laskakit</b:Corporate>
-      </b:Author>
-    </b:Author>
-    <b:Title>Digitální kompas QMC5883L</b:Title>
-    <b:InternetSiteTitle>Laskakit</b:InternetSiteTitle>
-    <b:YearAccessed>2026</b:YearAccessed>
-    <b:MonthAccessed>1</b:MonthAccessed>
-    <b:DayAccessed>12</b:DayAccessed>
-    <b:URL>https://www.laskakit.cz/arduino-kompas-qmc5883l/</b:URL>
-    <b:RefOrder>8</b:RefOrder>
-  </b:Source>
-  <b:Source>
-    <b:Tag>Las</b:Tag>
-    <b:SourceType>InternetSite</b:SourceType>
-    <b:Guid>{720A3B8B-2369-4086-866A-8C6FD645EC08}</b:Guid>
-    <b:Author>
-      <b:Author>
-        <b:Corporate>Laskakit</b:Corporate>
-      </b:Author>
-    </b:Author>
-    <b:Title>Nabíjecí modul TP4056 s ochranou</b:Title>
-    <b:InternetSiteTitle>Laskakit</b:InternetSiteTitle>
-    <b:YearAccessed>2026</b:YearAccessed>
-    <b:MonthAccessed>1</b:MonthAccessed>
-    <b:DayAccessed>12</b:DayAccessed>
-    <b:URL>https://www.laskakit.cz/nabijecka-tp4056-s-ochranou/</b:URL>
-    <b:RefOrder>9</b:RefOrder>
-  </b:Source>
-  <b:Source>
-    <b:Tag>Esp32</b:Tag>
-    <b:SourceType>InternetSite</b:SourceType>
-    <b:Guid>{66D88290-40BA-471F-A5CB-3D53A920B968}</b:Guid>
-    <b:Author>
-      <b:Author>
-        <b:Corporate>Espressif Systems</b:Corporate>
-      </b:Author>
-    </b:Author>
-    <b:Title>ESP-IDF Programming Guide</b:Title>
-    <b:InternetSiteTitle>Espressif Documentation</b:InternetSiteTitle>
-    <b:YearAccessed>2026</b:YearAccessed>
-    <b:MonthAccessed>1</b:MonthAccessed>
-    <b:DayAccessed>12</b:DayAccessed>
-    <b:URL>https://docs.espressif.com/projects/esp-idf/en/latest/esp32c6/</b:URL>
-    <b:RefOrder>6</b:RefOrder>
-  </b:Source>
-  <b:Source>
-    <b:Tag>LAS26</b:Tag>
-    <b:SourceType>InternetSite</b:SourceType>
-    <b:Guid>{51356040-1E6B-4792-9459-D0262F570A7C}</b:Guid>
-    <b:Title>LASERTAG NET</b:Title>
-    <b:InternetSiteTitle>https://lasertag.net/blog/Technology_Behind_Advanced_Laser_Tag_Systems</b:InternetSiteTitle>
-    <b:YearAccessed>2026</b:YearAccessed>
-    <b:MonthAccessed>Květen</b:MonthAccessed>
-    <b:DayAccessed>27</b:DayAccessed>
-    <b:URL>https://lasertag.net/blog/Technology_Behind_Advanced_Laser_Tag_Systems</b:URL>
-    <b:RefOrder>2</b:RefOrder>
-  </b:Source>
-  <b:Source>
-    <b:Tag>TDK26</b:Tag>
-    <b:SourceType>InternetSite</b:SourceType>
-    <b:Guid>{A74C91B5-E0A5-45AE-8C95-4E1C5AE4A27B}</b:Guid>
-    <b:Title>TDK</b:Title>
-    <b:InternetSiteTitle>https://www.tdk.com/en/featured_stories/entry_051-metaverse-motion-sensors.html</b:InternetSiteTitle>
-    <b:YearAccessed>2026</b:YearAccessed>
-    <b:MonthAccessed>Květen</b:MonthAccessed>
-    <b:DayAccessed>22</b:DayAccessed>
-    <b:URL>https://www.tdk.com/en/featured_stories/entry_051-metaverse-motion-sensors.html</b:URL>
-    <b:RefOrder>4</b:RefOrder>
-  </b:Source>
-  <b:Source>
-    <b:Tag>QOR26</b:Tag>
-    <b:SourceType>InternetSite</b:SourceType>
-    <b:Guid>{F65380FB-7C05-4A68-AD39-ACE1F36CF5E8}</b:Guid>
-    <b:YearAccessed>2026</b:YearAccessed>
-    <b:MonthAccessed>Únor</b:MonthAccessed>
-    <b:DayAccessed>14</b:DayAccessed>
-    <b:URL>https://www.qorvo.com/innovation/ultra-wideband</b:URL>
-    <b:Title>QORVO</b:Title>
-    <b:InternetSiteTitle>https://www.qorvo.com/innovation/ultra-wideband</b:InternetSiteTitle>
-    <b:RefOrder>7</b:RefOrder>
-  </b:Source>
-</b:Sources>
-</file>
-
 <file path=customXml/item4.xml><?xml version="1.0" encoding="utf-8"?>
 <?mso-contentType ?>
 <FormTemplates xmlns="http://schemas.microsoft.com/sharepoint/v3/contenttype/forms">
@@ -14257,6 +13814,23 @@
 </file>
 
 <file path=customXml/itemProps1.xml><?xml version="1.0" encoding="utf-8"?>
+<ds:datastoreItem xmlns:ds="http://schemas.openxmlformats.org/officeDocument/2006/customXml" ds:itemID="{640D3FEF-B7A8-49E1-8BF4-2498D483D9B8}">
+  <ds:schemaRefs>
+    <ds:schemaRef ds:uri="http://schemas.openxmlformats.org/officeDocument/2006/bibliography"/>
+  </ds:schemaRefs>
+</ds:datastoreItem>
+</file>
+
+<file path=customXml/itemProps2.xml><?xml version="1.0" encoding="utf-8"?>
+<ds:datastoreItem xmlns:ds="http://schemas.openxmlformats.org/officeDocument/2006/customXml" ds:itemID="{43079A01-61F3-44B1-90C1-B1FEC405C657}">
+  <ds:schemaRefs>
+    <ds:schemaRef ds:uri="http://schemas.microsoft.com/office/2006/metadata/properties"/>
+    <ds:schemaRef ds:uri="http://schemas.microsoft.com/office/infopath/2007/PartnerControls"/>
+  </ds:schemaRefs>
+</ds:datastoreItem>
+</file>
+
+<file path=customXml/itemProps3.xml><?xml version="1.0" encoding="utf-8"?>
 <ds:datastoreItem xmlns:ds="http://schemas.openxmlformats.org/officeDocument/2006/customXml" ds:itemID="{82A38B51-6072-4AA7-82FD-DFB83251AC2E}">
   <ds:schemaRefs>
     <ds:schemaRef ds:uri="http://schemas.microsoft.com/office/2006/metadata/contentType"/>
@@ -14275,23 +13849,6 @@
 </ds:datastoreItem>
 </file>
 
-<file path=customXml/itemProps2.xml><?xml version="1.0" encoding="utf-8"?>
-<ds:datastoreItem xmlns:ds="http://schemas.openxmlformats.org/officeDocument/2006/customXml" ds:itemID="{43079A01-61F3-44B1-90C1-B1FEC405C657}">
-  <ds:schemaRefs>
-    <ds:schemaRef ds:uri="http://schemas.microsoft.com/office/2006/metadata/properties"/>
-    <ds:schemaRef ds:uri="http://schemas.microsoft.com/office/infopath/2007/PartnerControls"/>
-  </ds:schemaRefs>
-</ds:datastoreItem>
-</file>
-
-<file path=customXml/itemProps3.xml><?xml version="1.0" encoding="utf-8"?>
-<ds:datastoreItem xmlns:ds="http://schemas.openxmlformats.org/officeDocument/2006/customXml" ds:itemID="{640D3FEF-B7A8-49E1-8BF4-2498D483D9B8}">
-  <ds:schemaRefs>
-    <ds:schemaRef ds:uri="http://schemas.openxmlformats.org/officeDocument/2006/bibliography"/>
-  </ds:schemaRefs>
-</ds:datastoreItem>
-</file>
-
 <file path=customXml/itemProps4.xml><?xml version="1.0" encoding="utf-8"?>
 <ds:datastoreItem xmlns:ds="http://schemas.openxmlformats.org/officeDocument/2006/customXml" ds:itemID="{4FF85B71-35EB-4667-B5A7-25BC67E7B3EE}">
   <ds:schemaRefs>

</xml_diff>